<commit_message>
tinggal tanda tangan ustadz iman
</commit_message>
<xml_diff>
--- a/MABAIZ wisuda penyewaan tempat LAN RI.docx
+++ b/MABAIZ wisuda penyewaan tempat LAN RI.docx
@@ -1,6 +1,6 @@
 
 <file path=word/document.xml><?xml version="1.0" encoding="utf-8"?>
-<w:document xmlns:wpc="http://schemas.microsoft.com/office/word/2010/wordprocessingCanvas" xmlns:cx="http://schemas.microsoft.com/office/drawing/2014/chartex" xmlns:cx1="http://schemas.microsoft.com/office/drawing/2015/9/8/chartex" xmlns:cx2="http://schemas.microsoft.com/office/drawing/2015/10/21/chartex" xmlns:cx3="http://schemas.microsoft.com/office/drawing/2016/5/9/chartex" xmlns:cx4="http://schemas.microsoft.com/office/drawing/2016/5/10/chartex" xmlns:cx5="http://schemas.microsoft.com/office/drawing/2016/5/11/chartex" xmlns:cx6="http://schemas.microsoft.com/office/drawing/2016/5/12/chartex" xmlns:cx7="http://schemas.microsoft.com/office/drawing/2016/5/13/chartex" xmlns:cx8="http://schemas.microsoft.com/office/drawing/2016/5/14/chartex" xmlns:mc="http://schemas.openxmlformats.org/markup-compatibility/2006" xmlns:aink="http://schemas.microsoft.com/office/drawing/2016/ink" xmlns:am3d="http://schemas.microsoft.com/office/drawing/2017/model3d" xmlns:o="urn:schemas-microsoft-com:office:office" xmlns:r="http://schemas.openxmlformats.org/officeDocument/2006/relationships" xmlns:m="http://schemas.openxmlformats.org/officeDocument/2006/math" xmlns:v="urn:schemas-microsoft-com:vml" xmlns:wp14="http://schemas.microsoft.com/office/word/2010/wordprocessingDrawing" xmlns:wp="http://schemas.openxmlformats.org/drawingml/2006/wordprocessingDrawing" xmlns:w10="urn:schemas-microsoft-com:office:word" xmlns:w="http://schemas.openxmlformats.org/wordprocessingml/2006/main" xmlns:w14="http://schemas.microsoft.com/office/word/2010/wordml" xmlns:w15="http://schemas.microsoft.com/office/word/2012/wordml" xmlns:w16cex="http://schemas.microsoft.com/office/word/2018/wordml/cex" xmlns:w16cid="http://schemas.microsoft.com/office/word/2016/wordml/cid" xmlns:w16="http://schemas.microsoft.com/office/word/2018/wordml" xmlns:w16sdtdh="http://schemas.microsoft.com/office/word/2020/wordml/sdtdatahash" xmlns:w16se="http://schemas.microsoft.com/office/word/2015/wordml/symex" xmlns:wpg="http://schemas.microsoft.com/office/word/2010/wordprocessingGroup" xmlns:wpi="http://schemas.microsoft.com/office/word/2010/wordprocessingInk" xmlns:wne="http://schemas.microsoft.com/office/word/2006/wordml" xmlns:wps="http://schemas.microsoft.com/office/word/2010/wordprocessingShape" mc:Ignorable="w14 w15 w16se w16cid w16 w16cex w16sdtdh wp14">
+<w:document xmlns:wpc="http://schemas.microsoft.com/office/word/2010/wordprocessingCanvas" xmlns:mc="http://schemas.openxmlformats.org/markup-compatibility/2006" xmlns:o="urn:schemas-microsoft-com:office:office" xmlns:r="http://schemas.openxmlformats.org/officeDocument/2006/relationships" xmlns:m="http://schemas.openxmlformats.org/officeDocument/2006/math" xmlns:v="urn:schemas-microsoft-com:vml" xmlns:wp14="http://schemas.microsoft.com/office/word/2010/wordprocessingDrawing" xmlns:wp="http://schemas.openxmlformats.org/drawingml/2006/wordprocessingDrawing" xmlns:w="http://schemas.openxmlformats.org/wordprocessingml/2006/main" xmlns:w14="http://schemas.microsoft.com/office/word/2010/wordml" xmlns:w10="urn:schemas-microsoft-com:office:word" xmlns:w15="http://schemas.microsoft.com/office/word/2012/wordml" xmlns:wpg="http://schemas.microsoft.com/office/word/2010/wordprocessingGroup" xmlns:wpi="http://schemas.microsoft.com/office/word/2010/wordprocessingInk" xmlns:wne="http://schemas.microsoft.com/office/word/2006/wordml" xmlns:wps="http://schemas.microsoft.com/office/word/2010/wordprocessingShape" xmlns:wpsCustomData="http://www.wps.cn/officeDocument/2013/wpsCustomData" mc:Ignorable="w14 w15 wp14">
   <w:body>
     <w:p>
       <w:pPr>
@@ -17,19 +17,16 @@
         </w:rPr>
       </w:pPr>
       <w:r>
-        <w:rPr>
-          <w:noProof/>
-        </w:rPr>
         <w:drawing>
-          <wp:anchor distT="0" distB="0" distL="114300" distR="114300" simplePos="0" relativeHeight="251664384" behindDoc="1" locked="0" layoutInCell="1" allowOverlap="1" wp14:anchorId="199B4714" wp14:editId="66B3D005">
+          <wp:anchor distT="0" distB="0" distL="114300" distR="114300" simplePos="0" relativeHeight="251660288" behindDoc="1" locked="0" layoutInCell="1" allowOverlap="1">
             <wp:simplePos x="0" y="0"/>
             <wp:positionH relativeFrom="margin">
               <wp:align>left</wp:align>
             </wp:positionH>
             <wp:positionV relativeFrom="paragraph">
-              <wp:posOffset>-49999</wp:posOffset>
+              <wp:posOffset>-49530</wp:posOffset>
             </wp:positionV>
-            <wp:extent cx="1432643" cy="1152525"/>
+            <wp:extent cx="1432560" cy="1152525"/>
             <wp:effectExtent l="0" t="0" r="0" b="0"/>
             <wp:wrapNone/>
             <wp:docPr id="600242869" name="Picture 8" descr="A blue and black logo&#10;&#10;Description automatically generated"/>
@@ -45,7 +42,7 @@
                       <a:picLocks noChangeAspect="1" noChangeArrowheads="1"/>
                     </pic:cNvPicPr>
                   </pic:nvPicPr>
-                  <pic:blipFill rotWithShape="1">
+                  <pic:blipFill>
                     <a:blip r:embed="rId7" cstate="print">
                       <a:extLst>
                         <a:ext uri="{28A0092B-C50C-407E-A947-70E740481C1C}">
@@ -54,9 +51,11 @@
                       </a:extLst>
                     </a:blip>
                     <a:srcRect l="8800" t="16801" r="9000" b="18800"/>
-                    <a:stretch/>
+                    <a:stretch>
+                      <a:fillRect/>
+                    </a:stretch>
                   </pic:blipFill>
-                  <pic:spPr bwMode="auto">
+                  <pic:spPr>
                     <a:xfrm>
                       <a:off x="0" y="0"/>
                       <a:ext cx="1436202" cy="1155388"/>
@@ -68,21 +67,10 @@
                     <a:ln>
                       <a:noFill/>
                     </a:ln>
-                    <a:extLst>
-                      <a:ext uri="{53640926-AAD7-44D8-BBD7-CCE9431645EC}">
-                        <a14:shadowObscured xmlns:a14="http://schemas.microsoft.com/office/drawing/2010/main"/>
-                      </a:ext>
-                    </a:extLst>
                   </pic:spPr>
                 </pic:pic>
               </a:graphicData>
             </a:graphic>
-            <wp14:sizeRelH relativeFrom="margin">
-              <wp14:pctWidth>0</wp14:pctWidth>
-            </wp14:sizeRelH>
-            <wp14:sizeRelV relativeFrom="margin">
-              <wp14:pctHeight>0</wp14:pctHeight>
-            </wp14:sizeRelV>
           </wp:anchor>
         </w:drawing>
       </w:r>
@@ -136,16 +124,7 @@
           <w:sz w:val="52"/>
           <w:szCs w:val="52"/>
         </w:rPr>
-        <w:t>WISUDA AKBAR 202</w:t>
-      </w:r>
-      <w:r>
-        <w:rPr>
-          <w:rFonts w:ascii="Clarendon Blk BT" w:hAnsi="Clarendon Blk BT" w:cstheme="majorBidi"/>
-          <w:color w:val="0070C0"/>
-          <w:sz w:val="52"/>
-          <w:szCs w:val="52"/>
-        </w:rPr>
-        <w:t>5</w:t>
+        <w:t>WISUDA AKBAR 2025</w:t>
       </w:r>
     </w:p>
     <w:p>
@@ -183,29 +162,7 @@
           <w:sz w:val="28"/>
           <w:szCs w:val="28"/>
         </w:rPr>
-        <w:t xml:space="preserve"> KUTTAB </w:t>
-      </w:r>
-      <w:r>
-        <w:rPr>
-          <w:rFonts w:asciiTheme="majorHAnsi" w:hAnsiTheme="majorHAnsi" w:cstheme="majorBidi"/>
-          <w:b/>
-          <w:bCs/>
-          <w:color w:val="00B0F0"/>
-          <w:sz w:val="28"/>
-          <w:szCs w:val="28"/>
-        </w:rPr>
-        <w:t xml:space="preserve">DAN MADRASAH </w:t>
-      </w:r>
-      <w:r>
-        <w:rPr>
-          <w:rFonts w:asciiTheme="majorHAnsi" w:hAnsiTheme="majorHAnsi" w:cstheme="majorBidi"/>
-          <w:b/>
-          <w:bCs/>
-          <w:color w:val="00B0F0"/>
-          <w:sz w:val="28"/>
-          <w:szCs w:val="28"/>
-        </w:rPr>
-        <w:t xml:space="preserve">BAITUL IZZAH </w:t>
+        <w:t xml:space="preserve"> KUTTAB DAN MADRASAH BAITUL IZZAH </w:t>
       </w:r>
     </w:p>
     <w:p>
@@ -262,39 +219,7 @@
           <w:sz w:val="24"/>
           <w:szCs w:val="24"/>
         </w:rPr>
-        <w:t>Sekretariat : Jalan Padat karya Gg. Kaganangan RT.</w:t>
-      </w:r>
-      <w:r>
-        <w:rPr>
-          <w:rFonts w:asciiTheme="majorHAnsi" w:hAnsiTheme="majorHAnsi" w:cstheme="majorBidi"/>
-          <w:sz w:val="24"/>
-          <w:szCs w:val="24"/>
-        </w:rPr>
-        <w:t xml:space="preserve"> </w:t>
-      </w:r>
-      <w:r>
-        <w:rPr>
-          <w:rFonts w:asciiTheme="majorHAnsi" w:hAnsiTheme="majorHAnsi" w:cstheme="majorBidi"/>
-          <w:sz w:val="24"/>
-          <w:szCs w:val="24"/>
-        </w:rPr>
-        <w:t>73, Kel.</w:t>
-      </w:r>
-      <w:r>
-        <w:rPr>
-          <w:rFonts w:asciiTheme="majorHAnsi" w:hAnsiTheme="majorHAnsi" w:cstheme="majorBidi"/>
-          <w:sz w:val="24"/>
-          <w:szCs w:val="24"/>
-        </w:rPr>
-        <w:t xml:space="preserve"> </w:t>
-      </w:r>
-      <w:r>
-        <w:rPr>
-          <w:rFonts w:asciiTheme="majorHAnsi" w:hAnsiTheme="majorHAnsi" w:cstheme="majorBidi"/>
-          <w:sz w:val="24"/>
-          <w:szCs w:val="24"/>
-        </w:rPr>
-        <w:t>Loa bakung Kota Samarinda – Kaltim 75126</w:t>
+        <w:t>Sekretariat : Jalan Padat karya Gg. Kaganangan RT. 73, Kel. Loa bakung Kota Samarinda – Kaltim 75126</w:t>
       </w:r>
     </w:p>
     <w:p>
@@ -315,7 +240,6 @@
       <w:r>
         <w:rPr>
           <w:rFonts w:asciiTheme="majorHAnsi" w:hAnsiTheme="majorHAnsi" w:cstheme="majorBidi"/>
-          <w:noProof/>
           <w:sz w:val="28"/>
           <w:szCs w:val="28"/>
           <w14:ligatures w14:val="standardContextual"/>
@@ -323,7 +247,7 @@
         <mc:AlternateContent>
           <mc:Choice Requires="wps">
             <w:drawing>
-              <wp:anchor distT="0" distB="0" distL="114300" distR="114300" simplePos="0" relativeHeight="251663360" behindDoc="0" locked="0" layoutInCell="1" allowOverlap="1" wp14:anchorId="76583940" wp14:editId="1C10722E">
+              <wp:anchor distT="0" distB="0" distL="114300" distR="114300" simplePos="0" relativeHeight="251659264" behindDoc="0" locked="0" layoutInCell="1" allowOverlap="1">
                 <wp:simplePos x="0" y="0"/>
                 <wp:positionH relativeFrom="column">
                   <wp:posOffset>7620</wp:posOffset>
@@ -372,19 +296,16 @@
                     </wps:wsp>
                   </a:graphicData>
                 </a:graphic>
-                <wp14:sizeRelH relativeFrom="margin">
-                  <wp14:pctWidth>0</wp14:pctWidth>
-                </wp14:sizeRelH>
-                <wp14:sizeRelV relativeFrom="margin">
-                  <wp14:pctHeight>0</wp14:pctHeight>
-                </wp14:sizeRelV>
               </wp:anchor>
             </w:drawing>
           </mc:Choice>
           <mc:Fallback>
             <w:pict>
-              <v:line w14:anchorId="4977F845" id="Straight Connector 3" o:spid="_x0000_s1026" style="position:absolute;left:0;text-align:left;z-index:251663360;visibility:visible;mso-wrap-style:square;mso-width-percent:0;mso-height-percent:0;mso-wrap-distance-left:9pt;mso-wrap-distance-top:0;mso-wrap-distance-right:9pt;mso-wrap-distance-bottom:0;mso-position-horizontal:absolute;mso-position-horizontal-relative:text;mso-position-vertical:absolute;mso-position-vertical-relative:text;mso-width-percent:0;mso-height-percent:0;mso-width-relative:margin;mso-height-relative:margin" from=".6pt,1.95pt" to="512.1pt,1.95pt" o:gfxdata="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" strokecolor="black [3200]" strokeweight="4pt">
-                <v:stroke linestyle="thinThick" joinstyle="miter"/>
+              <v:line id="Straight Connector 3" o:spid="_x0000_s1026" o:spt="20" style="position:absolute;left:0pt;margin-left:0.6pt;margin-top:1.95pt;height:0pt;width:511.5pt;z-index:251659264;mso-width-relative:page;mso-height-relative:page;" filled="f" stroked="t" coordsize="21600,21600" o:gfxdata="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">
+                <v:fill on="f" focussize="0,0"/>
+                <v:stroke weight="4pt" color="#000000 [3200]" linestyle="thinThick" miterlimit="8" joinstyle="miter"/>
+                <v:imagedata o:title=""/>
+                <o:lock v:ext="edit" aspectratio="f"/>
               </v:line>
             </w:pict>
           </mc:Fallback>
@@ -421,6 +342,13 @@
           <w:szCs w:val="24"/>
         </w:rPr>
         <w:tab/>
+      </w:r>
+      <w:r>
+        <w:rPr>
+          <w:rFonts w:asciiTheme="majorHAnsi" w:hAnsiTheme="majorHAnsi" w:cstheme="majorBidi"/>
+          <w:sz w:val="24"/>
+          <w:szCs w:val="24"/>
+        </w:rPr>
         <w:t>:</w:t>
       </w:r>
       <w:r>
@@ -454,43 +382,7 @@
           <w:szCs w:val="24"/>
           <w:u w:val="single"/>
         </w:rPr>
-        <w:t xml:space="preserve">Samarinda, </w:t>
-      </w:r>
-      <w:r>
-        <w:rPr>
-          <w:rFonts w:asciiTheme="majorHAnsi" w:hAnsiTheme="majorHAnsi" w:cstheme="majorBidi"/>
-          <w:sz w:val="24"/>
-          <w:szCs w:val="24"/>
-          <w:u w:val="single"/>
-        </w:rPr>
-        <w:t>1 Mei</w:t>
-      </w:r>
-      <w:r>
-        <w:rPr>
-          <w:rFonts w:asciiTheme="majorHAnsi" w:hAnsiTheme="majorHAnsi" w:cstheme="majorBidi"/>
-          <w:sz w:val="24"/>
-          <w:szCs w:val="24"/>
-          <w:u w:val="single"/>
-        </w:rPr>
-        <w:t xml:space="preserve"> 202</w:t>
-      </w:r>
-      <w:r>
-        <w:rPr>
-          <w:rFonts w:asciiTheme="majorHAnsi" w:hAnsiTheme="majorHAnsi" w:cstheme="majorBidi"/>
-          <w:sz w:val="24"/>
-          <w:szCs w:val="24"/>
-          <w:u w:val="single"/>
-        </w:rPr>
-        <w:t>5</w:t>
-      </w:r>
-      <w:r>
-        <w:rPr>
-          <w:rFonts w:asciiTheme="majorHAnsi" w:hAnsiTheme="majorHAnsi" w:cstheme="majorBidi"/>
-          <w:sz w:val="24"/>
-          <w:szCs w:val="24"/>
-          <w:u w:val="single"/>
-        </w:rPr>
-        <w:t xml:space="preserve"> M</w:t>
+        <w:t>Samarinda, 1 Mei 2025 M</w:t>
       </w:r>
     </w:p>
     <w:p>
@@ -524,6 +416,13 @@
           <w:szCs w:val="24"/>
         </w:rPr>
         <w:tab/>
+      </w:r>
+      <w:r>
+        <w:rPr>
+          <w:rFonts w:asciiTheme="majorHAnsi" w:hAnsiTheme="majorHAnsi" w:cstheme="majorBidi"/>
+          <w:sz w:val="24"/>
+          <w:szCs w:val="24"/>
+        </w:rPr>
         <w:t>:</w:t>
       </w:r>
       <w:r>
@@ -556,31 +455,7 @@
           <w:sz w:val="24"/>
           <w:szCs w:val="24"/>
         </w:rPr>
-        <w:t>3</w:t>
-      </w:r>
-      <w:r>
-        <w:rPr>
-          <w:rFonts w:asciiTheme="majorHAnsi" w:hAnsiTheme="majorHAnsi" w:cstheme="majorBidi"/>
-          <w:sz w:val="24"/>
-          <w:szCs w:val="24"/>
-        </w:rPr>
-        <w:t xml:space="preserve"> Zulqo’dah 144</w:t>
-      </w:r>
-      <w:r>
-        <w:rPr>
-          <w:rFonts w:asciiTheme="majorHAnsi" w:hAnsiTheme="majorHAnsi" w:cstheme="majorBidi"/>
-          <w:sz w:val="24"/>
-          <w:szCs w:val="24"/>
-        </w:rPr>
-        <w:t>6</w:t>
-      </w:r>
-      <w:r>
-        <w:rPr>
-          <w:rFonts w:asciiTheme="majorHAnsi" w:hAnsiTheme="majorHAnsi" w:cstheme="majorBidi"/>
-          <w:sz w:val="24"/>
-          <w:szCs w:val="24"/>
-        </w:rPr>
-        <w:t xml:space="preserve"> H</w:t>
+        <w:t>3 Zulqo’dah 1446 H</w:t>
       </w:r>
     </w:p>
     <w:p>
@@ -613,6 +488,13 @@
           <w:szCs w:val="24"/>
         </w:rPr>
         <w:tab/>
+      </w:r>
+      <w:r>
+        <w:rPr>
+          <w:rFonts w:asciiTheme="majorHAnsi" w:hAnsiTheme="majorHAnsi" w:cstheme="majorBidi"/>
+          <w:sz w:val="24"/>
+          <w:szCs w:val="24"/>
+        </w:rPr>
         <w:t>:</w:t>
       </w:r>
       <w:r>
@@ -714,17 +596,7 @@
           <w:sz w:val="24"/>
           <w:szCs w:val="24"/>
         </w:rPr>
-        <w:t xml:space="preserve">Kepala </w:t>
-      </w:r>
-      <w:r>
-        <w:rPr>
-          <w:rFonts w:asciiTheme="majorHAnsi" w:hAnsiTheme="majorHAnsi" w:cstheme="majorBidi"/>
-          <w:b/>
-          <w:bCs/>
-          <w:sz w:val="24"/>
-          <w:szCs w:val="24"/>
-        </w:rPr>
-        <w:t>Pusjar SKPP LAN</w:t>
+        <w:t>Kepala Pusjar SKPP LAN</w:t>
       </w:r>
     </w:p>
     <w:p>
@@ -825,7 +697,7 @@
         <w:spacing w:after="0"/>
         <w:jc w:val="center"/>
         <w:rPr>
-          <w:rFonts w:asciiTheme="majorHAnsi" w:hAnsiTheme="majorHAnsi" w:cs="Traditional Arabic"/>
+          <w:rFonts w:cs="Traditional Arabic" w:asciiTheme="majorHAnsi" w:hAnsiTheme="majorHAnsi"/>
           <w:sz w:val="24"/>
           <w:szCs w:val="24"/>
           <w:rtl/>
@@ -833,7 +705,7 @@
       </w:pPr>
       <w:r>
         <w:rPr>
-          <w:rFonts w:asciiTheme="majorHAnsi" w:hAnsiTheme="majorHAnsi" w:cs="Traditional Arabic"/>
+          <w:rFonts w:cs="Traditional Arabic" w:asciiTheme="majorHAnsi" w:hAnsiTheme="majorHAnsi"/>
           <w:sz w:val="24"/>
           <w:szCs w:val="24"/>
           <w:rtl/>
@@ -851,7 +723,7 @@
         <w:spacing w:after="0"/>
         <w:jc w:val="right"/>
         <w:rPr>
-          <w:rFonts w:asciiTheme="majorHAnsi" w:hAnsiTheme="majorHAnsi" w:cs="Traditional Arabic"/>
+          <w:rFonts w:cs="Traditional Arabic" w:asciiTheme="majorHAnsi" w:hAnsiTheme="majorHAnsi"/>
           <w:sz w:val="24"/>
           <w:szCs w:val="24"/>
           <w:rtl/>
@@ -859,7 +731,7 @@
       </w:pPr>
       <w:r>
         <w:rPr>
-          <w:rFonts w:asciiTheme="majorHAnsi" w:hAnsiTheme="majorHAnsi" w:cs="Traditional Arabic"/>
+          <w:rFonts w:cs="Traditional Arabic" w:asciiTheme="majorHAnsi" w:hAnsiTheme="majorHAnsi"/>
           <w:sz w:val="24"/>
           <w:szCs w:val="24"/>
           <w:rtl/>
@@ -958,136 +830,34 @@
           <w:sz w:val="24"/>
           <w:szCs w:val="24"/>
         </w:rPr>
-        <w:t xml:space="preserve">Sehubungan dengan diadakannya acara pelepasan dan perpisahan </w:t>
-      </w:r>
-      <w:r>
-        <w:rPr>
-          <w:rFonts w:asciiTheme="majorHAnsi" w:hAnsiTheme="majorHAnsi" w:cstheme="majorBidi"/>
-          <w:sz w:val="24"/>
-          <w:szCs w:val="24"/>
-        </w:rPr>
-        <w:t xml:space="preserve">santri </w:t>
-      </w:r>
-      <w:r>
-        <w:rPr>
-          <w:rFonts w:asciiTheme="majorHAnsi" w:hAnsiTheme="majorHAnsi" w:cstheme="majorBidi"/>
-          <w:sz w:val="24"/>
-          <w:szCs w:val="24"/>
-        </w:rPr>
-        <w:t xml:space="preserve">kelas </w:t>
-      </w:r>
-      <w:r>
-        <w:rPr>
-          <w:rFonts w:asciiTheme="majorHAnsi" w:hAnsiTheme="majorHAnsi" w:cstheme="majorBidi"/>
-          <w:sz w:val="24"/>
-          <w:szCs w:val="24"/>
-        </w:rPr>
-        <w:t xml:space="preserve">enam (sadisah) Kuttab Baitul Izzah dan santri </w:t>
-      </w:r>
-      <w:r>
-        <w:rPr>
-          <w:rFonts w:asciiTheme="majorHAnsi" w:hAnsiTheme="majorHAnsi" w:cstheme="majorBidi"/>
-          <w:sz w:val="24"/>
-          <w:szCs w:val="24"/>
-        </w:rPr>
-        <w:t xml:space="preserve">kelas </w:t>
-      </w:r>
-      <w:r>
-        <w:rPr>
-          <w:rFonts w:asciiTheme="majorHAnsi" w:hAnsiTheme="majorHAnsi" w:cstheme="majorBidi"/>
-          <w:sz w:val="24"/>
-          <w:szCs w:val="24"/>
-        </w:rPr>
-        <w:t>tiga</w:t>
-      </w:r>
-      <w:r>
-        <w:rPr>
-          <w:rFonts w:asciiTheme="majorHAnsi" w:hAnsiTheme="majorHAnsi" w:cstheme="majorBidi"/>
-          <w:sz w:val="24"/>
-          <w:szCs w:val="24"/>
-        </w:rPr>
-        <w:t xml:space="preserve"> (</w:t>
-      </w:r>
-      <w:r>
-        <w:rPr>
-          <w:rFonts w:asciiTheme="majorHAnsi" w:hAnsiTheme="majorHAnsi" w:cstheme="majorBidi"/>
-          <w:sz w:val="24"/>
-          <w:szCs w:val="24"/>
-        </w:rPr>
-        <w:t>tsalisah</w:t>
-      </w:r>
-      <w:r>
-        <w:rPr>
-          <w:rFonts w:asciiTheme="majorHAnsi" w:hAnsiTheme="majorHAnsi" w:cstheme="majorBidi"/>
-          <w:sz w:val="24"/>
-          <w:szCs w:val="24"/>
-        </w:rPr>
-        <w:t>) Madrasah Al Quran Baitul Izzah Samarinda tahun ajaran 202</w:t>
-      </w:r>
-      <w:r>
-        <w:rPr>
-          <w:rFonts w:asciiTheme="majorHAnsi" w:hAnsiTheme="majorHAnsi" w:cstheme="majorBidi"/>
-          <w:sz w:val="24"/>
-          <w:szCs w:val="24"/>
-        </w:rPr>
-        <w:t>4</w:t>
-      </w:r>
-      <w:r>
-        <w:rPr>
-          <w:rFonts w:asciiTheme="majorHAnsi" w:hAnsiTheme="majorHAnsi" w:cstheme="majorBidi"/>
-          <w:sz w:val="24"/>
-          <w:szCs w:val="24"/>
-        </w:rPr>
-        <w:t>/202</w:t>
-      </w:r>
-      <w:r>
-        <w:rPr>
-          <w:rFonts w:asciiTheme="majorHAnsi" w:hAnsiTheme="majorHAnsi" w:cstheme="majorBidi"/>
-          <w:sz w:val="24"/>
-          <w:szCs w:val="24"/>
-        </w:rPr>
-        <w:t>5</w:t>
-      </w:r>
-      <w:r>
-        <w:rPr>
-          <w:rFonts w:asciiTheme="majorHAnsi" w:hAnsiTheme="majorHAnsi" w:cstheme="majorBidi"/>
-          <w:sz w:val="24"/>
-          <w:szCs w:val="24"/>
-        </w:rPr>
-        <w:t xml:space="preserve">, maka bersama </w:t>
-      </w:r>
-      <w:r>
-        <w:rPr>
-          <w:rFonts w:asciiTheme="majorHAnsi" w:hAnsiTheme="majorHAnsi" w:cstheme="majorBidi"/>
-          <w:sz w:val="24"/>
-          <w:szCs w:val="24"/>
-        </w:rPr>
-        <w:t xml:space="preserve">bermaksud untuk menyewa </w:t>
-      </w:r>
-      <w:r>
-        <w:rPr>
-          <w:rFonts w:asciiTheme="majorHAnsi" w:hAnsiTheme="majorHAnsi" w:cstheme="majorBidi"/>
-          <w:sz w:val="24"/>
-          <w:szCs w:val="24"/>
-          <w:highlight w:val="yellow"/>
-        </w:rPr>
-        <w:t>Ruangan</w:t>
-      </w:r>
-      <w:r>
-        <w:rPr>
-          <w:rFonts w:asciiTheme="majorHAnsi" w:hAnsiTheme="majorHAnsi" w:cstheme="majorBidi"/>
-          <w:sz w:val="24"/>
-          <w:szCs w:val="24"/>
-        </w:rPr>
-        <w:t xml:space="preserve"> </w:t>
-      </w:r>
-      <w:r>
-        <w:rPr>
-          <w:rFonts w:asciiTheme="majorHAnsi" w:hAnsiTheme="majorHAnsi" w:cstheme="majorBidi"/>
-          <w:sz w:val="24"/>
-          <w:szCs w:val="24"/>
-        </w:rPr>
-        <w:t>sebagai tempat kegiatan tersebut berlangsung, yang inshaa Allah akan dilaksanakan pada:</w:t>
+        <w:t xml:space="preserve">Sehubungan dengan diadakannya acara pelepasan dan perpisahan santri kelas enam (sadisah) Kuttab Baitul Izzah dan santri kelas tiga (tsalisah) Madrasah Al Quran Baitul Izzah Samarinda tahun ajaran 2024/2025, maka bersama bermaksud untuk menyewa </w:t>
+      </w:r>
+      <w:r>
+        <w:rPr>
+          <w:rFonts w:asciiTheme="majorHAnsi" w:hAnsiTheme="majorHAnsi" w:cstheme="majorBidi"/>
+          <w:sz w:val="24"/>
+          <w:szCs w:val="24"/>
+          <w:highlight w:val="none"/>
+        </w:rPr>
+        <w:t>Ruang</w:t>
+      </w:r>
+      <w:r>
+        <w:rPr>
+          <w:rFonts w:hint="default" w:asciiTheme="majorHAnsi" w:hAnsiTheme="majorHAnsi" w:cstheme="majorBidi"/>
+          <w:sz w:val="24"/>
+          <w:szCs w:val="24"/>
+          <w:highlight w:val="none"/>
+          <w:lang w:val="en-US"/>
+        </w:rPr>
+        <w:t xml:space="preserve"> Auditorium</w:t>
+      </w:r>
+      <w:r>
+        <w:rPr>
+          <w:rFonts w:asciiTheme="majorHAnsi" w:hAnsiTheme="majorHAnsi" w:cstheme="majorBidi"/>
+          <w:sz w:val="24"/>
+          <w:szCs w:val="24"/>
+        </w:rPr>
+        <w:t xml:space="preserve"> sebagai tempat kegiatan tersebut berlangsung, yang inshaa Allah akan dilaksanakan pada:</w:t>
       </w:r>
     </w:p>
     <w:p>
@@ -1105,6 +875,8 @@
           <w:szCs w:val="24"/>
         </w:rPr>
       </w:pPr>
+      <w:bookmarkStart w:id="0" w:name="_GoBack"/>
+      <w:bookmarkEnd w:id="0"/>
     </w:p>
     <w:p>
       <w:pPr>
@@ -1136,6 +908,13 @@
           <w:szCs w:val="24"/>
         </w:rPr>
         <w:tab/>
+      </w:r>
+      <w:r>
+        <w:rPr>
+          <w:rFonts w:asciiTheme="majorHAnsi" w:hAnsiTheme="majorHAnsi" w:cstheme="majorBidi"/>
+          <w:sz w:val="24"/>
+          <w:szCs w:val="24"/>
+        </w:rPr>
         <w:t>:</w:t>
       </w:r>
       <w:r>
@@ -1152,19 +931,11 @@
           <w:sz w:val="24"/>
           <w:szCs w:val="24"/>
         </w:rPr>
-        <w:t>Sabtu</w:t>
-      </w:r>
-      <w:r>
-        <w:rPr>
-          <w:rFonts w:asciiTheme="majorHAnsi" w:hAnsiTheme="majorHAnsi" w:cstheme="majorBidi"/>
-          <w:sz w:val="24"/>
-          <w:szCs w:val="24"/>
-        </w:rPr>
-        <w:t>, 1</w:t>
-      </w:r>
-      <w:r>
-        <w:rPr>
-          <w:rFonts w:asciiTheme="majorHAnsi" w:hAnsiTheme="majorHAnsi" w:cstheme="majorBidi" w:hint="cs"/>
+        <w:t>Sabtu, 1</w:t>
+      </w:r>
+      <w:r>
+        <w:rPr>
+          <w:rFonts w:hint="cs" w:asciiTheme="majorHAnsi" w:hAnsiTheme="majorHAnsi" w:cstheme="majorBidi"/>
           <w:sz w:val="24"/>
           <w:szCs w:val="24"/>
           <w:rtl/>
@@ -1181,7 +952,7 @@
       </w:r>
       <w:r>
         <w:rPr>
-          <w:rFonts w:asciiTheme="majorHAnsi" w:hAnsiTheme="majorHAnsi" w:cstheme="majorBidi" w:hint="cs"/>
+          <w:rFonts w:hint="cs" w:asciiTheme="majorHAnsi" w:hAnsiTheme="majorHAnsi" w:cstheme="majorBidi"/>
           <w:sz w:val="24"/>
           <w:szCs w:val="24"/>
           <w:rtl/>
@@ -1227,6 +998,13 @@
           <w:szCs w:val="24"/>
         </w:rPr>
         <w:tab/>
+      </w:r>
+      <w:r>
+        <w:rPr>
+          <w:rFonts w:asciiTheme="majorHAnsi" w:hAnsiTheme="majorHAnsi" w:cstheme="majorBidi"/>
+          <w:sz w:val="24"/>
+          <w:szCs w:val="24"/>
+        </w:rPr>
         <w:t>:</w:t>
       </w:r>
       <w:r>
@@ -1243,23 +1021,7 @@
           <w:sz w:val="24"/>
           <w:szCs w:val="24"/>
         </w:rPr>
-        <w:t>07</w:t>
-      </w:r>
-      <w:r>
-        <w:rPr>
-          <w:rFonts w:asciiTheme="majorHAnsi" w:hAnsiTheme="majorHAnsi" w:cstheme="majorBidi"/>
-          <w:sz w:val="24"/>
-          <w:szCs w:val="24"/>
-        </w:rPr>
-        <w:t>.00 WITA</w:t>
-      </w:r>
-      <w:r>
-        <w:rPr>
-          <w:rFonts w:asciiTheme="majorHAnsi" w:hAnsiTheme="majorHAnsi" w:cstheme="majorBidi"/>
-          <w:sz w:val="24"/>
-          <w:szCs w:val="24"/>
-        </w:rPr>
-        <w:t xml:space="preserve"> s/d Selesai</w:t>
+        <w:t>07.00 WITA s/d Selesai</w:t>
       </w:r>
     </w:p>
     <w:p>
@@ -1293,6 +1055,13 @@
           <w:szCs w:val="24"/>
         </w:rPr>
         <w:tab/>
+      </w:r>
+      <w:r>
+        <w:rPr>
+          <w:rFonts w:asciiTheme="majorHAnsi" w:hAnsiTheme="majorHAnsi" w:cstheme="majorBidi"/>
+          <w:sz w:val="24"/>
+          <w:szCs w:val="24"/>
+        </w:rPr>
         <w:t>:</w:t>
       </w:r>
       <w:r>
@@ -1302,15 +1071,14 @@
           <w:szCs w:val="24"/>
         </w:rPr>
         <w:tab/>
-        <w:t xml:space="preserve">Perpisahan dan Pelepasan Santri </w:t>
-      </w:r>
-      <w:r>
-        <w:rPr>
-          <w:rFonts w:asciiTheme="majorHAnsi" w:hAnsiTheme="majorHAnsi" w:cstheme="majorBidi"/>
-          <w:sz w:val="24"/>
-          <w:szCs w:val="24"/>
-        </w:rPr>
-        <w:t>Kuttab dan Madrasah Al Quran Baitul Izzah Samarinda</w:t>
+      </w:r>
+      <w:r>
+        <w:rPr>
+          <w:rFonts w:asciiTheme="majorHAnsi" w:hAnsiTheme="majorHAnsi" w:cstheme="majorBidi"/>
+          <w:sz w:val="24"/>
+          <w:szCs w:val="24"/>
+        </w:rPr>
+        <w:t>Perpisahan dan Pelepasan Santri Kuttab dan Madrasah Al Quran Baitul Izzah Samarinda</w:t>
       </w:r>
     </w:p>
     <w:p>
@@ -1357,17 +1125,17 @@
           <w:rFonts w:asciiTheme="majorHAnsi" w:hAnsiTheme="majorHAnsi" w:cstheme="majorBidi"/>
           <w:sz w:val="24"/>
           <w:szCs w:val="24"/>
-          <w:highlight w:val="yellow"/>
-        </w:rPr>
-        <w:t>ruangan</w:t>
-      </w:r>
-      <w:r>
-        <w:rPr>
-          <w:rFonts w:asciiTheme="majorHAnsi" w:hAnsiTheme="majorHAnsi" w:cstheme="majorBidi"/>
-          <w:sz w:val="24"/>
-          <w:szCs w:val="24"/>
-        </w:rPr>
-        <w:t xml:space="preserve"> tersebut, dapat diinformasikan kepada kami untuk dapat kami dipenuhi.</w:t>
+          <w:highlight w:val="none"/>
+        </w:rPr>
+        <w:t xml:space="preserve">ruangan </w:t>
+      </w:r>
+      <w:r>
+        <w:rPr>
+          <w:rFonts w:asciiTheme="majorHAnsi" w:hAnsiTheme="majorHAnsi" w:cstheme="majorBidi"/>
+          <w:sz w:val="24"/>
+          <w:szCs w:val="24"/>
+        </w:rPr>
+        <w:t>tersebut, dapat diinformasikan kepada kami untuk dapat kami dipenuhi.</w:t>
       </w:r>
     </w:p>
     <w:p>
@@ -1409,55 +1177,7 @@
           <w:sz w:val="24"/>
           <w:szCs w:val="24"/>
         </w:rPr>
-        <w:t xml:space="preserve">Demikian </w:t>
-      </w:r>
-      <w:r>
-        <w:rPr>
-          <w:rFonts w:asciiTheme="majorHAnsi" w:hAnsiTheme="majorHAnsi" w:cstheme="majorBidi"/>
-          <w:sz w:val="24"/>
-          <w:szCs w:val="24"/>
-        </w:rPr>
-        <w:t xml:space="preserve">surat </w:t>
-      </w:r>
-      <w:r>
-        <w:rPr>
-          <w:rFonts w:asciiTheme="majorHAnsi" w:hAnsiTheme="majorHAnsi" w:cstheme="majorBidi"/>
-          <w:sz w:val="24"/>
-          <w:szCs w:val="24"/>
-        </w:rPr>
-        <w:t>permohonan izin ini kami sampaikan, besar harapan kami agar Bapak/Ibu berkenan menyetujui permohonan ini.</w:t>
-      </w:r>
-      <w:r>
-        <w:rPr>
-          <w:rFonts w:asciiTheme="majorHAnsi" w:hAnsiTheme="majorHAnsi" w:cstheme="majorBidi"/>
-          <w:sz w:val="24"/>
-          <w:szCs w:val="24"/>
-        </w:rPr>
-        <w:t xml:space="preserve"> </w:t>
-      </w:r>
-      <w:r>
-        <w:rPr>
-          <w:rFonts w:asciiTheme="majorHAnsi" w:hAnsiTheme="majorHAnsi" w:cstheme="majorBidi"/>
-          <w:sz w:val="24"/>
-          <w:szCs w:val="24"/>
-        </w:rPr>
-        <w:t>Atas perhatian</w:t>
-      </w:r>
-      <w:r>
-        <w:rPr>
-          <w:rFonts w:asciiTheme="majorHAnsi" w:hAnsiTheme="majorHAnsi" w:cstheme="majorBidi"/>
-          <w:sz w:val="24"/>
-          <w:szCs w:val="24"/>
-        </w:rPr>
-        <w:t xml:space="preserve">nya </w:t>
-      </w:r>
-      <w:r>
-        <w:rPr>
-          <w:rFonts w:asciiTheme="majorHAnsi" w:hAnsiTheme="majorHAnsi" w:cstheme="majorBidi"/>
-          <w:sz w:val="24"/>
-          <w:szCs w:val="24"/>
-        </w:rPr>
-        <w:t xml:space="preserve">kami ucapkan terima kasih. </w:t>
+        <w:t xml:space="preserve">Demikian surat permohonan izin ini kami sampaikan, besar harapan kami agar Bapak/Ibu berkenan menyetujui permohonan ini. Atas perhatiannya kami ucapkan terima kasih. </w:t>
       </w:r>
     </w:p>
     <w:p>
@@ -1470,7 +1190,7 @@
         <w:spacing w:after="0"/>
         <w:jc w:val="right"/>
         <w:rPr>
-          <w:rFonts w:asciiTheme="majorHAnsi" w:hAnsiTheme="majorHAnsi" w:cs="Traditional Arabic"/>
+          <w:rFonts w:cs="Traditional Arabic" w:asciiTheme="majorHAnsi" w:hAnsiTheme="majorHAnsi"/>
           <w:sz w:val="24"/>
           <w:szCs w:val="24"/>
           <w:rtl/>
@@ -1478,7 +1198,7 @@
       </w:pPr>
       <w:r>
         <w:rPr>
-          <w:rFonts w:asciiTheme="majorHAnsi" w:hAnsiTheme="majorHAnsi" w:cs="Traditional Arabic"/>
+          <w:rFonts w:cs="Traditional Arabic" w:asciiTheme="majorHAnsi" w:hAnsiTheme="majorHAnsi"/>
           <w:sz w:val="24"/>
           <w:szCs w:val="24"/>
           <w:rtl/>
@@ -1550,11 +1270,8 @@
         </w:rPr>
       </w:pPr>
       <w:r>
-        <w:rPr>
-          <w:noProof/>
-        </w:rPr>
         <w:drawing>
-          <wp:anchor distT="0" distB="0" distL="114300" distR="114300" simplePos="0" relativeHeight="251670528" behindDoc="0" locked="0" layoutInCell="1" allowOverlap="1" wp14:anchorId="3A8E52D9" wp14:editId="7522B8A1">
+          <wp:anchor distT="0" distB="0" distL="114300" distR="114300" simplePos="0" relativeHeight="251664384" behindDoc="0" locked="0" layoutInCell="1" allowOverlap="1">
             <wp:simplePos x="0" y="0"/>
             <wp:positionH relativeFrom="margin">
               <wp:posOffset>4608195</wp:posOffset>
@@ -1573,7 +1290,7 @@
               <a:graphicData uri="http://schemas.openxmlformats.org/drawingml/2006/picture">
                 <pic:pic xmlns:pic="http://schemas.openxmlformats.org/drawingml/2006/picture">
                   <pic:nvPicPr>
-                    <pic:cNvPr id="0" name="Picture 1"/>
+                    <pic:cNvPr id="2" name="Picture 2"/>
                     <pic:cNvPicPr>
                       <a:picLocks noChangeAspect="1" noChangeArrowheads="1"/>
                     </pic:cNvPicPr>
@@ -1591,7 +1308,7 @@
                       <a:fillRect/>
                     </a:stretch>
                   </pic:blipFill>
-                  <pic:spPr bwMode="auto">
+                  <pic:spPr>
                     <a:xfrm>
                       <a:off x="0" y="0"/>
                       <a:ext cx="1590675" cy="1590675"/>
@@ -1607,12 +1324,6 @@
                 </pic:pic>
               </a:graphicData>
             </a:graphic>
-            <wp14:sizeRelH relativeFrom="page">
-              <wp14:pctWidth>0</wp14:pctWidth>
-            </wp14:sizeRelH>
-            <wp14:sizeRelV relativeFrom="page">
-              <wp14:pctHeight>0</wp14:pctHeight>
-            </wp14:sizeRelV>
           </wp:anchor>
         </w:drawing>
       </w:r>
@@ -1632,11 +1343,8 @@
         </w:rPr>
       </w:pPr>
       <w:r>
-        <w:rPr>
-          <w:noProof/>
-        </w:rPr>
         <w:drawing>
-          <wp:anchor distT="0" distB="0" distL="114300" distR="114300" simplePos="0" relativeHeight="251666432" behindDoc="1" locked="0" layoutInCell="1" allowOverlap="1" wp14:anchorId="5E8E4EAE" wp14:editId="2F4C0ED0">
+          <wp:anchor distT="0" distB="0" distL="114300" distR="114300" simplePos="0" relativeHeight="251661312" behindDoc="1" locked="0" layoutInCell="1" allowOverlap="1">
             <wp:simplePos x="0" y="0"/>
             <wp:positionH relativeFrom="margin">
               <wp:posOffset>0</wp:posOffset>
@@ -1644,7 +1352,7 @@
             <wp:positionV relativeFrom="paragraph">
               <wp:posOffset>161290</wp:posOffset>
             </wp:positionV>
-            <wp:extent cx="1423830" cy="1145435"/>
+            <wp:extent cx="1423670" cy="1145540"/>
             <wp:effectExtent l="0" t="0" r="5080" b="0"/>
             <wp:wrapNone/>
             <wp:docPr id="959697625" name="Picture 8" descr="A blue and black logo&#10;&#10;Description automatically generated"/>
@@ -1655,12 +1363,12 @@
               <a:graphicData uri="http://schemas.openxmlformats.org/drawingml/2006/picture">
                 <pic:pic xmlns:pic="http://schemas.openxmlformats.org/drawingml/2006/picture">
                   <pic:nvPicPr>
-                    <pic:cNvPr id="600242869" name="Picture 8" descr="A blue and black logo&#10;&#10;Description automatically generated"/>
+                    <pic:cNvPr id="959697625" name="Picture 8" descr="A blue and black logo&#10;&#10;Description automatically generated"/>
                     <pic:cNvPicPr>
                       <a:picLocks noChangeAspect="1" noChangeArrowheads="1"/>
                     </pic:cNvPicPr>
                   </pic:nvPicPr>
-                  <pic:blipFill rotWithShape="1">
+                  <pic:blipFill>
                     <a:blip r:embed="rId9" cstate="print">
                       <a:duotone>
                         <a:schemeClr val="accent6">
@@ -1685,9 +1393,11 @@
                       </a:extLst>
                     </a:blip>
                     <a:srcRect l="8800" t="16801" r="9000" b="18800"/>
-                    <a:stretch/>
+                    <a:stretch>
+                      <a:fillRect/>
+                    </a:stretch>
                   </pic:blipFill>
-                  <pic:spPr bwMode="auto">
+                  <pic:spPr>
                     <a:xfrm>
                       <a:off x="0" y="0"/>
                       <a:ext cx="1423830" cy="1145435"/>
@@ -1699,21 +1409,10 @@
                     <a:ln>
                       <a:noFill/>
                     </a:ln>
-                    <a:extLst>
-                      <a:ext uri="{53640926-AAD7-44D8-BBD7-CCE9431645EC}">
-                        <a14:shadowObscured xmlns:a14="http://schemas.microsoft.com/office/drawing/2010/main"/>
-                      </a:ext>
-                    </a:extLst>
                   </pic:spPr>
                 </pic:pic>
               </a:graphicData>
             </a:graphic>
-            <wp14:sizeRelH relativeFrom="margin">
-              <wp14:pctWidth>0</wp14:pctWidth>
-            </wp14:sizeRelH>
-            <wp14:sizeRelV relativeFrom="margin">
-              <wp14:pctHeight>0</wp14:pctHeight>
-            </wp14:sizeRelV>
           </wp:anchor>
         </w:drawing>
       </w:r>
@@ -1724,6 +1423,13 @@
           <w:szCs w:val="24"/>
         </w:rPr>
         <w:tab/>
+      </w:r>
+      <w:r>
+        <w:rPr>
+          <w:rFonts w:asciiTheme="majorHAnsi" w:hAnsiTheme="majorHAnsi" w:cstheme="majorBidi"/>
+          <w:sz w:val="24"/>
+          <w:szCs w:val="24"/>
+        </w:rPr>
         <w:t>Ketua,</w:t>
       </w:r>
       <w:r>
@@ -1733,6 +1439,13 @@
           <w:szCs w:val="24"/>
         </w:rPr>
         <w:tab/>
+      </w:r>
+      <w:r>
+        <w:rPr>
+          <w:rFonts w:asciiTheme="majorHAnsi" w:hAnsiTheme="majorHAnsi" w:cstheme="majorBidi"/>
+          <w:sz w:val="24"/>
+          <w:szCs w:val="24"/>
+        </w:rPr>
         <w:t>Sekretaris,</w:t>
       </w:r>
     </w:p>
@@ -1935,12 +1648,11 @@
       <w:r>
         <w:rPr>
           <w:rFonts w:asciiTheme="majorBidi" w:hAnsiTheme="majorBidi" w:cstheme="majorBidi"/>
-          <w:noProof/>
           <w:sz w:val="24"/>
           <w:szCs w:val="24"/>
         </w:rPr>
         <w:drawing>
-          <wp:anchor distT="0" distB="0" distL="114300" distR="114300" simplePos="0" relativeHeight="251669504" behindDoc="1" locked="0" layoutInCell="1" allowOverlap="1" wp14:anchorId="421BD496" wp14:editId="05533C4E">
+          <wp:anchor distT="0" distB="0" distL="114300" distR="114300" simplePos="0" relativeHeight="251663360" behindDoc="1" locked="0" layoutInCell="1" allowOverlap="1">
             <wp:simplePos x="0" y="0"/>
             <wp:positionH relativeFrom="margin">
               <wp:posOffset>2699385</wp:posOffset>
@@ -1948,7 +1660,7 @@
             <wp:positionV relativeFrom="paragraph">
               <wp:posOffset>136525</wp:posOffset>
             </wp:positionV>
-            <wp:extent cx="1276350" cy="1031752"/>
+            <wp:extent cx="1276350" cy="1031875"/>
             <wp:effectExtent l="0" t="0" r="0" b="0"/>
             <wp:wrapNone/>
             <wp:docPr id="1" name="Picture 1" descr="A black background with a black square&#10;&#10;Description automatically generated with medium confidence"/>
@@ -1960,7 +1672,9 @@
                 <pic:pic xmlns:pic="http://schemas.openxmlformats.org/drawingml/2006/picture">
                   <pic:nvPicPr>
                     <pic:cNvPr id="1" name="Picture 1" descr="A black background with a black square&#10;&#10;Description automatically generated with medium confidence"/>
-                    <pic:cNvPicPr/>
+                    <pic:cNvPicPr>
+                      <a:picLocks noChangeAspect="1"/>
+                    </pic:cNvPicPr>
                   </pic:nvPicPr>
                   <pic:blipFill>
                     <a:blip r:embed="rId11" cstate="print">
@@ -1986,32 +1700,25 @@
                 </pic:pic>
               </a:graphicData>
             </a:graphic>
-            <wp14:sizeRelH relativeFrom="page">
-              <wp14:pctWidth>0</wp14:pctWidth>
-            </wp14:sizeRelH>
-            <wp14:sizeRelV relativeFrom="page">
-              <wp14:pctHeight>0</wp14:pctHeight>
-            </wp14:sizeRelV>
           </wp:anchor>
         </w:drawing>
       </w:r>
       <w:r>
         <w:rPr>
           <w:rFonts w:asciiTheme="majorBidi" w:hAnsiTheme="majorBidi" w:cstheme="majorBidi"/>
-          <w:noProof/>
           <w:sz w:val="24"/>
           <w:szCs w:val="24"/>
         </w:rPr>
         <w:drawing>
-          <wp:anchor distT="0" distB="0" distL="114300" distR="114300" simplePos="0" relativeHeight="251668480" behindDoc="1" locked="0" layoutInCell="1" allowOverlap="1" wp14:anchorId="5240A385" wp14:editId="37B65EC1">
+          <wp:anchor distT="0" distB="0" distL="114300" distR="114300" simplePos="0" relativeHeight="251662336" behindDoc="1" locked="0" layoutInCell="1" allowOverlap="1">
             <wp:simplePos x="0" y="0"/>
             <wp:positionH relativeFrom="margin">
               <wp:posOffset>2360295</wp:posOffset>
             </wp:positionH>
             <wp:positionV relativeFrom="paragraph">
-              <wp:posOffset>15596</wp:posOffset>
+              <wp:posOffset>15240</wp:posOffset>
             </wp:positionV>
-            <wp:extent cx="952500" cy="999739"/>
+            <wp:extent cx="952500" cy="999490"/>
             <wp:effectExtent l="0" t="0" r="0" b="0"/>
             <wp:wrapNone/>
             <wp:docPr id="5" name="Picture 5" descr="A logo with a black background&#10;&#10;Description automatically generated"/>
@@ -2023,7 +1730,9 @@
                 <pic:pic xmlns:pic="http://schemas.openxmlformats.org/drawingml/2006/picture">
                   <pic:nvPicPr>
                     <pic:cNvPr id="5" name="Picture 5" descr="A logo with a black background&#10;&#10;Description automatically generated"/>
-                    <pic:cNvPicPr/>
+                    <pic:cNvPicPr>
+                      <a:picLocks noChangeAspect="1"/>
+                    </pic:cNvPicPr>
                   </pic:nvPicPr>
                   <pic:blipFill>
                     <a:blip r:embed="rId12" cstate="print">
@@ -2039,7 +1748,7 @@
                           <a14:imgProps xmlns:a14="http://schemas.microsoft.com/office/drawing/2010/main">
                             <a14:imgLayer r:embed="rId13">
                               <a14:imgEffect>
-                                <a14:artisticLineDrawing/>
+                                <a14:artisticLineDrawing trans="25000"/>
                               </a14:imgEffect>
                               <a14:imgEffect>
                                 <a14:brightnessContrast bright="-20000" contrast="40000"/>
@@ -2068,12 +1777,6 @@
                 </pic:pic>
               </a:graphicData>
             </a:graphic>
-            <wp14:sizeRelH relativeFrom="margin">
-              <wp14:pctWidth>0</wp14:pctWidth>
-            </wp14:sizeRelH>
-            <wp14:sizeRelV relativeFrom="margin">
-              <wp14:pctHeight>0</wp14:pctHeight>
-            </wp14:sizeRelV>
           </wp:anchor>
         </w:drawing>
       </w:r>
@@ -2183,64 +1886,30 @@
           <w:szCs w:val="24"/>
           <w:u w:val="single"/>
         </w:rPr>
-        <w:t>Iskandar, S.</w:t>
-      </w:r>
-      <w:r>
-        <w:rPr>
-          <w:rFonts w:asciiTheme="majorBidi" w:hAnsiTheme="majorBidi" w:cstheme="majorBidi"/>
+        <w:t>Iskandar, S.Pd.</w:t>
+      </w:r>
+    </w:p>
+    <w:p>
+      <w:pPr>
+        <w:tabs>
+          <w:tab w:val="center" w:pos="1701"/>
+          <w:tab w:val="center" w:pos="8505"/>
+        </w:tabs>
+        <w:spacing w:after="0"/>
+        <w:jc w:val="center"/>
+        <w:rPr>
+          <w:rFonts w:asciiTheme="majorHAnsi" w:hAnsiTheme="majorHAnsi" w:cstheme="majorBidi"/>
           <w:b/>
           <w:bCs/>
           <w:sz w:val="24"/>
           <w:szCs w:val="24"/>
-          <w:u w:val="single"/>
-        </w:rPr>
-        <w:t>P</w:t>
-      </w:r>
-      <w:r>
-        <w:rPr>
-          <w:rFonts w:asciiTheme="majorBidi" w:hAnsiTheme="majorBidi" w:cstheme="majorBidi"/>
-          <w:b/>
-          <w:bCs/>
-          <w:sz w:val="24"/>
-          <w:szCs w:val="24"/>
-          <w:u w:val="single"/>
-        </w:rPr>
-        <w:t>d</w:t>
-      </w:r>
-      <w:r>
-        <w:rPr>
-          <w:rFonts w:asciiTheme="majorBidi" w:hAnsiTheme="majorBidi" w:cstheme="majorBidi"/>
-          <w:b/>
-          <w:bCs/>
-          <w:sz w:val="24"/>
-          <w:szCs w:val="24"/>
-          <w:u w:val="single"/>
-        </w:rPr>
-        <w:t>.</w:t>
-      </w:r>
-    </w:p>
-    <w:p>
-      <w:pPr>
-        <w:tabs>
-          <w:tab w:val="center" w:pos="1701"/>
-          <w:tab w:val="center" w:pos="8505"/>
-        </w:tabs>
-        <w:spacing w:after="0"/>
-        <w:jc w:val="center"/>
-        <w:rPr>
-          <w:rFonts w:asciiTheme="majorHAnsi" w:hAnsiTheme="majorHAnsi" w:cstheme="majorBidi"/>
-          <w:b/>
-          <w:bCs/>
-          <w:sz w:val="24"/>
-          <w:szCs w:val="24"/>
-        </w:rPr>
-      </w:pPr>
-    </w:p>
-    <w:p>
-      <w:pPr>
-        <w:rPr>
-          <w:rFonts w:asciiTheme="majorHAnsi" w:hAnsiTheme="majorHAnsi" w:cstheme="majorBidi"/>
-          <w:noProof/>
+        </w:rPr>
+      </w:pPr>
+    </w:p>
+    <w:p>
+      <w:pPr>
+        <w:rPr>
+          <w:rFonts w:asciiTheme="majorHAnsi" w:hAnsiTheme="majorHAnsi" w:cstheme="majorBidi"/>
           <w:sz w:val="28"/>
           <w:szCs w:val="28"/>
         </w:rPr>
@@ -2250,7 +1919,6 @@
       <w:pPr>
         <w:rPr>
           <w:rFonts w:asciiTheme="majorHAnsi" w:hAnsiTheme="majorHAnsi" w:cstheme="majorBidi"/>
-          <w:noProof/>
           <w:sz w:val="28"/>
           <w:szCs w:val="28"/>
         </w:rPr>
@@ -2260,7 +1928,6 @@
       <w:pPr>
         <w:rPr>
           <w:rFonts w:asciiTheme="majorHAnsi" w:hAnsiTheme="majorHAnsi" w:cstheme="majorBidi"/>
-          <w:noProof/>
           <w:sz w:val="28"/>
           <w:szCs w:val="28"/>
         </w:rPr>
@@ -2270,7 +1937,6 @@
       <w:pPr>
         <w:rPr>
           <w:rFonts w:asciiTheme="majorHAnsi" w:hAnsiTheme="majorHAnsi" w:cstheme="majorBidi"/>
-          <w:noProof/>
           <w:sz w:val="28"/>
           <w:szCs w:val="28"/>
         </w:rPr>
@@ -2280,7 +1946,6 @@
       <w:pPr>
         <w:rPr>
           <w:rFonts w:asciiTheme="majorHAnsi" w:hAnsiTheme="majorHAnsi" w:cstheme="majorBidi"/>
-          <w:noProof/>
           <w:sz w:val="28"/>
           <w:szCs w:val="28"/>
         </w:rPr>
@@ -2290,7 +1955,6 @@
       <w:pPr>
         <w:rPr>
           <w:rFonts w:asciiTheme="majorHAnsi" w:hAnsiTheme="majorHAnsi" w:cstheme="majorBidi"/>
-          <w:noProof/>
           <w:sz w:val="28"/>
           <w:szCs w:val="28"/>
         </w:rPr>
@@ -2298,66 +1962,52 @@
       <w:r>
         <w:rPr>
           <w:rFonts w:asciiTheme="majorHAnsi" w:hAnsiTheme="majorHAnsi" w:cstheme="majorBidi"/>
-          <w:noProof/>
           <w:sz w:val="28"/>
           <w:szCs w:val="28"/>
         </w:rPr>
-        <w:t>Ini saya buatkan format surat untuk dipakai panitia kedepannya, supaya tidak terhambat jika butuh surat langsung dibuat atas nama panitia</w:t>
-      </w:r>
-      <w:r>
-        <w:rPr>
-          <w:rFonts w:asciiTheme="majorHAnsi" w:hAnsiTheme="majorHAnsi" w:cstheme="majorBidi"/>
-          <w:noProof/>
+        <w:t xml:space="preserve">Ini saya buatkan format surat untuk dipakai panitia kedepannya, supaya tidak terhambat jika butuh surat langsung dibuat atas nama panitia. </w:t>
+      </w:r>
+    </w:p>
+    <w:p>
+      <w:pPr>
+        <w:rPr>
+          <w:rFonts w:asciiTheme="majorHAnsi" w:hAnsiTheme="majorHAnsi" w:cstheme="majorBidi"/>
           <w:sz w:val="28"/>
           <w:szCs w:val="28"/>
         </w:rPr>
-        <w:t xml:space="preserve">. </w:t>
-      </w:r>
-    </w:p>
-    <w:p>
-      <w:pPr>
-        <w:rPr>
-          <w:rFonts w:asciiTheme="majorHAnsi" w:hAnsiTheme="majorHAnsi" w:cstheme="majorBidi"/>
-          <w:noProof/>
+      </w:pPr>
+      <w:r>
+        <w:rPr>
+          <w:rFonts w:asciiTheme="majorHAnsi" w:hAnsiTheme="majorHAnsi" w:cstheme="majorBidi"/>
           <w:sz w:val="28"/>
           <w:szCs w:val="28"/>
         </w:rPr>
-      </w:pPr>
-      <w:r>
-        <w:rPr>
-          <w:rFonts w:asciiTheme="majorHAnsi" w:hAnsiTheme="majorHAnsi" w:cstheme="majorBidi"/>
-          <w:noProof/>
+        <w:t>Jika memungkinkan dibuatkan juga stempel panitianya, bisa diambil dari logo panitia untuk dibuatkan stempel, sekitar 50 ribu di pinggir jalan</w:t>
+      </w:r>
+    </w:p>
+    <w:p>
+      <w:pPr>
+        <w:rPr>
+          <w:rFonts w:asciiTheme="majorHAnsi" w:hAnsiTheme="majorHAnsi" w:cstheme="majorBidi"/>
           <w:sz w:val="28"/>
           <w:szCs w:val="28"/>
         </w:rPr>
-        <w:t>Jika memungkinkan dibuatkan juga stempel panitianya, bisa diambil dari logo panitia untuk dibuatkan stempel, sekitar 50 ribu di pinggir jalan</w:t>
-      </w:r>
-    </w:p>
-    <w:p>
-      <w:pPr>
-        <w:rPr>
-          <w:rFonts w:asciiTheme="majorHAnsi" w:hAnsiTheme="majorHAnsi" w:cstheme="majorBidi"/>
-          <w:noProof/>
+      </w:pPr>
+      <w:r>
+        <w:rPr>
+          <w:rFonts w:asciiTheme="majorHAnsi" w:hAnsiTheme="majorHAnsi" w:cstheme="majorBidi"/>
           <w:sz w:val="28"/>
           <w:szCs w:val="28"/>
         </w:rPr>
-      </w:pPr>
-      <w:r>
-        <w:rPr>
-          <w:rFonts w:asciiTheme="majorHAnsi" w:hAnsiTheme="majorHAnsi" w:cstheme="majorBidi"/>
-          <w:noProof/>
-          <w:sz w:val="28"/>
-          <w:szCs w:val="28"/>
-        </w:rPr>
         <w:t>Kode untuk nomor surat :</w:t>
       </w:r>
     </w:p>
     <w:p>
       <w:pPr>
-        <w:pStyle w:val="ListParagraph"/>
+        <w:pStyle w:val="31"/>
         <w:numPr>
           <w:ilvl w:val="0"/>
-          <w:numId w:val="3"/>
+          <w:numId w:val="1"/>
         </w:numPr>
         <w:rPr>
           <w:rFonts w:asciiTheme="majorHAnsi" w:hAnsiTheme="majorHAnsi"/>
@@ -2367,7 +2017,7 @@
       </w:pPr>
       <w:r>
         <w:rPr>
-          <w:rFonts w:asciiTheme="majorHAnsi" w:hAnsiTheme="majorHAnsi" w:cs="Arial"/>
+          <w:rFonts w:cs="Arial" w:asciiTheme="majorHAnsi" w:hAnsiTheme="majorHAnsi"/>
           <w:color w:val="000000"/>
           <w:sz w:val="24"/>
           <w:szCs w:val="24"/>
@@ -2378,10 +2028,10 @@
     </w:p>
     <w:p>
       <w:pPr>
-        <w:pStyle w:val="ListParagraph"/>
+        <w:pStyle w:val="31"/>
         <w:numPr>
           <w:ilvl w:val="0"/>
-          <w:numId w:val="3"/>
+          <w:numId w:val="1"/>
         </w:numPr>
         <w:rPr>
           <w:rFonts w:asciiTheme="majorHAnsi" w:hAnsiTheme="majorHAnsi"/>
@@ -2391,7 +2041,7 @@
       </w:pPr>
       <w:r>
         <w:rPr>
-          <w:rFonts w:asciiTheme="majorHAnsi" w:hAnsiTheme="majorHAnsi" w:cs="Arial"/>
+          <w:rFonts w:cs="Arial" w:asciiTheme="majorHAnsi" w:hAnsiTheme="majorHAnsi"/>
           <w:color w:val="000000"/>
           <w:sz w:val="24"/>
           <w:szCs w:val="24"/>
@@ -2402,10 +2052,10 @@
     </w:p>
     <w:p>
       <w:pPr>
-        <w:pStyle w:val="ListParagraph"/>
+        <w:pStyle w:val="31"/>
         <w:numPr>
           <w:ilvl w:val="0"/>
-          <w:numId w:val="3"/>
+          <w:numId w:val="1"/>
         </w:numPr>
         <w:rPr>
           <w:rFonts w:asciiTheme="majorHAnsi" w:hAnsiTheme="majorHAnsi"/>
@@ -2415,7 +2065,7 @@
       </w:pPr>
       <w:r>
         <w:rPr>
-          <w:rFonts w:asciiTheme="majorHAnsi" w:hAnsiTheme="majorHAnsi" w:cs="Arial"/>
+          <w:rFonts w:cs="Arial" w:asciiTheme="majorHAnsi" w:hAnsiTheme="majorHAnsi"/>
           <w:color w:val="000000"/>
           <w:sz w:val="24"/>
           <w:szCs w:val="24"/>
@@ -2426,10 +2076,10 @@
     </w:p>
     <w:p>
       <w:pPr>
-        <w:pStyle w:val="ListParagraph"/>
+        <w:pStyle w:val="31"/>
         <w:numPr>
           <w:ilvl w:val="0"/>
-          <w:numId w:val="3"/>
+          <w:numId w:val="1"/>
         </w:numPr>
         <w:rPr>
           <w:rFonts w:asciiTheme="majorHAnsi" w:hAnsiTheme="majorHAnsi"/>
@@ -2439,7 +2089,7 @@
       </w:pPr>
       <w:r>
         <w:rPr>
-          <w:rFonts w:asciiTheme="majorHAnsi" w:hAnsiTheme="majorHAnsi" w:cs="Arial"/>
+          <w:rFonts w:cs="Arial" w:asciiTheme="majorHAnsi" w:hAnsiTheme="majorHAnsi"/>
           <w:color w:val="000000"/>
           <w:sz w:val="24"/>
           <w:szCs w:val="24"/>
@@ -2462,70 +2112,62 @@
           <w:sz w:val="28"/>
           <w:szCs w:val="28"/>
         </w:rPr>
-        <w:t xml:space="preserve">Contoh : </w:t>
-      </w:r>
-      <w:r>
+        <w:t>Contoh : 02.001/SU/Pan.WA/V/2024</w:t>
+      </w:r>
+    </w:p>
+    <w:p>
+      <w:pPr>
         <w:rPr>
           <w:rFonts w:asciiTheme="majorHAnsi" w:hAnsiTheme="majorHAnsi"/>
           <w:sz w:val="28"/>
           <w:szCs w:val="28"/>
         </w:rPr>
-        <w:t>02.001/SU/Pan.WA/V/2024</w:t>
-      </w:r>
-    </w:p>
-    <w:p>
-      <w:pPr>
+      </w:pPr>
+      <w:r>
         <w:rPr>
           <w:rFonts w:asciiTheme="majorHAnsi" w:hAnsiTheme="majorHAnsi"/>
           <w:sz w:val="28"/>
           <w:szCs w:val="28"/>
         </w:rPr>
-      </w:pPr>
-      <w:r>
+        <w:t>02 (Kode surat), 001 (nomor surat), SU (jenis surat), Pan.WA (Organisasi yang mengeluarkan surat), V (bulan), 2024 (tahun)</w:t>
+      </w:r>
+    </w:p>
+    <w:p>
+      <w:pPr>
         <w:rPr>
           <w:rFonts w:asciiTheme="majorHAnsi" w:hAnsiTheme="majorHAnsi"/>
           <w:sz w:val="28"/>
           <w:szCs w:val="28"/>
         </w:rPr>
-        <w:t>02 (Kode surat), 001 (nomor surat), SU (jenis surat), Pan.WA (Organisasi yang mengeluarkan surat), V (bulan), 2024 (tahun)</w:t>
-      </w:r>
-    </w:p>
-    <w:p>
-      <w:pPr>
-        <w:rPr>
-          <w:rFonts w:asciiTheme="majorHAnsi" w:hAnsiTheme="majorHAnsi"/>
-          <w:sz w:val="28"/>
-          <w:szCs w:val="28"/>
-        </w:rPr>
       </w:pPr>
     </w:p>
     <w:sectPr>
-      <w:headerReference w:type="default" r:id="rId14"/>
-      <w:pgSz w:w="12240" w:h="18720" w:code="5"/>
+      <w:headerReference r:id="rId5" w:type="default"/>
+      <w:pgSz w:w="12240" w:h="18720"/>
       <w:pgMar w:top="360" w:right="1008" w:bottom="288" w:left="1008" w:header="187" w:footer="706" w:gutter="0"/>
-      <w:cols w:space="708"/>
-      <w:docGrid w:linePitch="360"/>
+      <w:cols w:space="708" w:num="1"/>
+      <w:docGrid w:linePitch="360" w:charSpace="0"/>
     </w:sectPr>
   </w:body>
 </w:document>
 </file>
 
 <file path=word/endnotes.xml><?xml version="1.0" encoding="utf-8"?>
-<w:endnotes xmlns:wpc="http://schemas.microsoft.com/office/word/2010/wordprocessingCanvas" xmlns:cx="http://schemas.microsoft.com/office/drawing/2014/chartex" xmlns:cx1="http://schemas.microsoft.com/office/drawing/2015/9/8/chartex" xmlns:cx2="http://schemas.microsoft.com/office/drawing/2015/10/21/chartex" xmlns:cx3="http://schemas.microsoft.com/office/drawing/2016/5/9/chartex" xmlns:cx4="http://schemas.microsoft.com/office/drawing/2016/5/10/chartex" xmlns:cx5="http://schemas.microsoft.com/office/drawing/2016/5/11/chartex" xmlns:cx6="http://schemas.microsoft.com/office/drawing/2016/5/12/chartex" xmlns:cx7="http://schemas.microsoft.com/office/drawing/2016/5/13/chartex" xmlns:cx8="http://schemas.microsoft.com/office/drawing/2016/5/14/chartex" xmlns:mc="http://schemas.openxmlformats.org/markup-compatibility/2006" xmlns:aink="http://schemas.microsoft.com/office/drawing/2016/ink" xmlns:am3d="http://schemas.microsoft.com/office/drawing/2017/model3d" xmlns:o="urn:schemas-microsoft-com:office:office" xmlns:r="http://schemas.openxmlformats.org/officeDocument/2006/relationships" xmlns:m="http://schemas.openxmlformats.org/officeDocument/2006/math" xmlns:v="urn:schemas-microsoft-com:vml" xmlns:wp14="http://schemas.microsoft.com/office/word/2010/wordprocessingDrawing" xmlns:wp="http://schemas.openxmlformats.org/drawingml/2006/wordprocessingDrawing" xmlns:w10="urn:schemas-microsoft-com:office:word" xmlns:w="http://schemas.openxmlformats.org/wordprocessingml/2006/main" xmlns:w14="http://schemas.microsoft.com/office/word/2010/wordml" xmlns:w15="http://schemas.microsoft.com/office/word/2012/wordml" xmlns:w16cex="http://schemas.microsoft.com/office/word/2018/wordml/cex" xmlns:w16cid="http://schemas.microsoft.com/office/word/2016/wordml/cid" xmlns:w16="http://schemas.microsoft.com/office/word/2018/wordml" xmlns:w16sdtdh="http://schemas.microsoft.com/office/word/2020/wordml/sdtdatahash" xmlns:w16se="http://schemas.microsoft.com/office/word/2015/wordml/symex" xmlns:wpg="http://schemas.microsoft.com/office/word/2010/wordprocessingGroup" xmlns:wpi="http://schemas.microsoft.com/office/word/2010/wordprocessingInk" xmlns:wne="http://schemas.microsoft.com/office/word/2006/wordml" xmlns:wps="http://schemas.microsoft.com/office/word/2010/wordprocessingShape" mc:Ignorable="w14 w15 w16se w16cid w16 w16cex w16sdtdh wp14">
-  <w:endnote w:type="separator" w:id="-1">
-    <w:p>
-      <w:pPr>
-        <w:spacing w:after="0" w:line="240" w:lineRule="auto"/>
+<w:endnotes xmlns:wpc="http://schemas.microsoft.com/office/word/2010/wordprocessingCanvas" xmlns:mc="http://schemas.openxmlformats.org/markup-compatibility/2006" xmlns:o="urn:schemas-microsoft-com:office:office" xmlns:r="http://schemas.openxmlformats.org/officeDocument/2006/relationships" xmlns:m="http://schemas.openxmlformats.org/officeDocument/2006/math" xmlns:v="urn:schemas-microsoft-com:vml" xmlns:wp14="http://schemas.microsoft.com/office/word/2010/wordprocessingDrawing" xmlns:wp="http://schemas.openxmlformats.org/drawingml/2006/wordprocessingDrawing" xmlns:w="http://schemas.openxmlformats.org/wordprocessingml/2006/main" xmlns:w14="http://schemas.microsoft.com/office/word/2010/wordml" xmlns:w15="http://schemas.microsoft.com/office/word/2012/wordml" xmlns:w10="urn:schemas-microsoft-com:office:word" xmlns:wpg="http://schemas.microsoft.com/office/word/2010/wordprocessingGroup" xmlns:wpi="http://schemas.microsoft.com/office/word/2010/wordprocessingInk" xmlns:wne="http://schemas.microsoft.com/office/word/2006/wordml" xmlns:wps="http://schemas.microsoft.com/office/word/2010/wordprocessingShape" xmlns:wpsCustomData="http://www.wps.cn/officeDocument/2013/wpsCustomData" mc:Ignorable="w14 w15 wp14">
+  <w:endnote w:type="separator" w:id="0">
+    <w:p>
+      <w:pPr>
+        <w:spacing w:line="240" w:lineRule="auto"/>
       </w:pPr>
       <w:r>
         <w:separator/>
       </w:r>
     </w:p>
   </w:endnote>
-  <w:endnote w:type="continuationSeparator" w:id="0">
-    <w:p>
-      <w:pPr>
-        <w:spacing w:after="0" w:line="240" w:lineRule="auto"/>
+  <w:endnote w:type="continuationSeparator" w:id="1">
+    <w:p>
+      <w:pPr>
+        <w:spacing w:line="240" w:lineRule="auto"/>
       </w:pPr>
       <w:r>
         <w:continuationSeparator/>
@@ -2536,21 +2178,21 @@
 </file>
 
 <file path=word/footnotes.xml><?xml version="1.0" encoding="utf-8"?>
-<w:footnotes xmlns:wpc="http://schemas.microsoft.com/office/word/2010/wordprocessingCanvas" xmlns:cx="http://schemas.microsoft.com/office/drawing/2014/chartex" xmlns:cx1="http://schemas.microsoft.com/office/drawing/2015/9/8/chartex" xmlns:cx2="http://schemas.microsoft.com/office/drawing/2015/10/21/chartex" xmlns:cx3="http://schemas.microsoft.com/office/drawing/2016/5/9/chartex" xmlns:cx4="http://schemas.microsoft.com/office/drawing/2016/5/10/chartex" xmlns:cx5="http://schemas.microsoft.com/office/drawing/2016/5/11/chartex" xmlns:cx6="http://schemas.microsoft.com/office/drawing/2016/5/12/chartex" xmlns:cx7="http://schemas.microsoft.com/office/drawing/2016/5/13/chartex" xmlns:cx8="http://schemas.microsoft.com/office/drawing/2016/5/14/chartex" xmlns:mc="http://schemas.openxmlformats.org/markup-compatibility/2006" xmlns:aink="http://schemas.microsoft.com/office/drawing/2016/ink" xmlns:am3d="http://schemas.microsoft.com/office/drawing/2017/model3d" xmlns:o="urn:schemas-microsoft-com:office:office" xmlns:r="http://schemas.openxmlformats.org/officeDocument/2006/relationships" xmlns:m="http://schemas.openxmlformats.org/officeDocument/2006/math" xmlns:v="urn:schemas-microsoft-com:vml" xmlns:wp14="http://schemas.microsoft.com/office/word/2010/wordprocessingDrawing" xmlns:wp="http://schemas.openxmlformats.org/drawingml/2006/wordprocessingDrawing" xmlns:w10="urn:schemas-microsoft-com:office:word" xmlns:w="http://schemas.openxmlformats.org/wordprocessingml/2006/main" xmlns:w14="http://schemas.microsoft.com/office/word/2010/wordml" xmlns:w15="http://schemas.microsoft.com/office/word/2012/wordml" xmlns:w16cex="http://schemas.microsoft.com/office/word/2018/wordml/cex" xmlns:w16cid="http://schemas.microsoft.com/office/word/2016/wordml/cid" xmlns:w16="http://schemas.microsoft.com/office/word/2018/wordml" xmlns:w16sdtdh="http://schemas.microsoft.com/office/word/2020/wordml/sdtdatahash" xmlns:w16se="http://schemas.microsoft.com/office/word/2015/wordml/symex" xmlns:wpg="http://schemas.microsoft.com/office/word/2010/wordprocessingGroup" xmlns:wpi="http://schemas.microsoft.com/office/word/2010/wordprocessingInk" xmlns:wne="http://schemas.microsoft.com/office/word/2006/wordml" xmlns:wps="http://schemas.microsoft.com/office/word/2010/wordprocessingShape" mc:Ignorable="w14 w15 w16se w16cid w16 w16cex w16sdtdh wp14">
-  <w:footnote w:type="separator" w:id="-1">
-    <w:p>
-      <w:pPr>
-        <w:spacing w:after="0" w:line="240" w:lineRule="auto"/>
+<w:footnotes xmlns:wpc="http://schemas.microsoft.com/office/word/2010/wordprocessingCanvas" xmlns:mc="http://schemas.openxmlformats.org/markup-compatibility/2006" xmlns:o="urn:schemas-microsoft-com:office:office" xmlns:r="http://schemas.openxmlformats.org/officeDocument/2006/relationships" xmlns:m="http://schemas.openxmlformats.org/officeDocument/2006/math" xmlns:v="urn:schemas-microsoft-com:vml" xmlns:wp14="http://schemas.microsoft.com/office/word/2010/wordprocessingDrawing" xmlns:wp="http://schemas.openxmlformats.org/drawingml/2006/wordprocessingDrawing" xmlns:w="http://schemas.openxmlformats.org/wordprocessingml/2006/main" xmlns:w14="http://schemas.microsoft.com/office/word/2010/wordml" xmlns:w15="http://schemas.microsoft.com/office/word/2012/wordml" xmlns:w10="urn:schemas-microsoft-com:office:word" xmlns:wpg="http://schemas.microsoft.com/office/word/2010/wordprocessingGroup" xmlns:wpi="http://schemas.microsoft.com/office/word/2010/wordprocessingInk" xmlns:wne="http://schemas.microsoft.com/office/word/2006/wordml" xmlns:wps="http://schemas.microsoft.com/office/word/2010/wordprocessingShape" xmlns:wpsCustomData="http://www.wps.cn/officeDocument/2013/wpsCustomData" mc:Ignorable="w14 w15 wp14">
+  <w:footnote w:type="separator" w:id="0">
+    <w:p>
+      <w:pPr>
+        <w:spacing w:before="0" w:after="0" w:line="259" w:lineRule="auto"/>
       </w:pPr>
       <w:r>
         <w:separator/>
       </w:r>
     </w:p>
   </w:footnote>
-  <w:footnote w:type="continuationSeparator" w:id="0">
-    <w:p>
-      <w:pPr>
-        <w:spacing w:after="0" w:line="240" w:lineRule="auto"/>
+  <w:footnote w:type="continuationSeparator" w:id="1">
+    <w:p>
+      <w:pPr>
+        <w:spacing w:before="0" w:after="0" w:line="259" w:lineRule="auto"/>
       </w:pPr>
       <w:r>
         <w:continuationSeparator/>
@@ -2561,10 +2203,10 @@
 </file>
 
 <file path=word/header1.xml><?xml version="1.0" encoding="utf-8"?>
-<w:hdr xmlns:wpc="http://schemas.microsoft.com/office/word/2010/wordprocessingCanvas" xmlns:cx="http://schemas.microsoft.com/office/drawing/2014/chartex" xmlns:cx1="http://schemas.microsoft.com/office/drawing/2015/9/8/chartex" xmlns:cx2="http://schemas.microsoft.com/office/drawing/2015/10/21/chartex" xmlns:cx3="http://schemas.microsoft.com/office/drawing/2016/5/9/chartex" xmlns:cx4="http://schemas.microsoft.com/office/drawing/2016/5/10/chartex" xmlns:cx5="http://schemas.microsoft.com/office/drawing/2016/5/11/chartex" xmlns:cx6="http://schemas.microsoft.com/office/drawing/2016/5/12/chartex" xmlns:cx7="http://schemas.microsoft.com/office/drawing/2016/5/13/chartex" xmlns:cx8="http://schemas.microsoft.com/office/drawing/2016/5/14/chartex" xmlns:mc="http://schemas.openxmlformats.org/markup-compatibility/2006" xmlns:aink="http://schemas.microsoft.com/office/drawing/2016/ink" xmlns:am3d="http://schemas.microsoft.com/office/drawing/2017/model3d" xmlns:o="urn:schemas-microsoft-com:office:office" xmlns:r="http://schemas.openxmlformats.org/officeDocument/2006/relationships" xmlns:m="http://schemas.openxmlformats.org/officeDocument/2006/math" xmlns:v="urn:schemas-microsoft-com:vml" xmlns:wp14="http://schemas.microsoft.com/office/word/2010/wordprocessingDrawing" xmlns:wp="http://schemas.openxmlformats.org/drawingml/2006/wordprocessingDrawing" xmlns:w10="urn:schemas-microsoft-com:office:word" xmlns:w="http://schemas.openxmlformats.org/wordprocessingml/2006/main" xmlns:w14="http://schemas.microsoft.com/office/word/2010/wordml" xmlns:w15="http://schemas.microsoft.com/office/word/2012/wordml" xmlns:w16cex="http://schemas.microsoft.com/office/word/2018/wordml/cex" xmlns:w16cid="http://schemas.microsoft.com/office/word/2016/wordml/cid" xmlns:w16="http://schemas.microsoft.com/office/word/2018/wordml" xmlns:w16sdtdh="http://schemas.microsoft.com/office/word/2020/wordml/sdtdatahash" xmlns:w16se="http://schemas.microsoft.com/office/word/2015/wordml/symex" xmlns:wpg="http://schemas.microsoft.com/office/word/2010/wordprocessingGroup" xmlns:wpi="http://schemas.microsoft.com/office/word/2010/wordprocessingInk" xmlns:wne="http://schemas.microsoft.com/office/word/2006/wordml" xmlns:wps="http://schemas.microsoft.com/office/word/2010/wordprocessingShape" mc:Ignorable="w14 w15 w16se w16cid w16 w16cex w16sdtdh wp14">
+<w:hdr xmlns:wpc="http://schemas.microsoft.com/office/word/2010/wordprocessingCanvas" xmlns:mc="http://schemas.openxmlformats.org/markup-compatibility/2006" xmlns:o="urn:schemas-microsoft-com:office:office" xmlns:r="http://schemas.openxmlformats.org/officeDocument/2006/relationships" xmlns:m="http://schemas.openxmlformats.org/officeDocument/2006/math" xmlns:v="urn:schemas-microsoft-com:vml" xmlns:wp14="http://schemas.microsoft.com/office/word/2010/wordprocessingDrawing" xmlns:wp="http://schemas.openxmlformats.org/drawingml/2006/wordprocessingDrawing" xmlns:w10="urn:schemas-microsoft-com:office:word" xmlns:w="http://schemas.openxmlformats.org/wordprocessingml/2006/main" xmlns:w14="http://schemas.microsoft.com/office/word/2010/wordml" xmlns:w15="http://schemas.microsoft.com/office/word/2012/wordml" xmlns:wpg="http://schemas.microsoft.com/office/word/2010/wordprocessingGroup" xmlns:wpi="http://schemas.microsoft.com/office/word/2010/wordprocessingInk" xmlns:wne="http://schemas.microsoft.com/office/word/2006/wordml" xmlns:wps="http://schemas.microsoft.com/office/word/2010/wordprocessingShape" xmlns:wpsCustomData="http://www.wps.cn/officeDocument/2013/wpsCustomData" mc:Ignorable="w14 w15 wp14">
   <w:p>
     <w:pPr>
-      <w:pStyle w:val="Header"/>
+      <w:pStyle w:val="14"/>
       <w:jc w:val="center"/>
     </w:pPr>
   </w:p>
@@ -2572,12 +2214,12 @@
 </file>
 
 <file path=word/numbering.xml><?xml version="1.0" encoding="utf-8"?>
-<w:numbering xmlns:wpc="http://schemas.microsoft.com/office/word/2010/wordprocessingCanvas" xmlns:cx="http://schemas.microsoft.com/office/drawing/2014/chartex" xmlns:cx1="http://schemas.microsoft.com/office/drawing/2015/9/8/chartex" xmlns:cx2="http://schemas.microsoft.com/office/drawing/2015/10/21/chartex" xmlns:cx3="http://schemas.microsoft.com/office/drawing/2016/5/9/chartex" xmlns:cx4="http://schemas.microsoft.com/office/drawing/2016/5/10/chartex" xmlns:cx5="http://schemas.microsoft.com/office/drawing/2016/5/11/chartex" xmlns:cx6="http://schemas.microsoft.com/office/drawing/2016/5/12/chartex" xmlns:cx7="http://schemas.microsoft.com/office/drawing/2016/5/13/chartex" xmlns:cx8="http://schemas.microsoft.com/office/drawing/2016/5/14/chartex" xmlns:mc="http://schemas.openxmlformats.org/markup-compatibility/2006" xmlns:aink="http://schemas.microsoft.com/office/drawing/2016/ink" xmlns:am3d="http://schemas.microsoft.com/office/drawing/2017/model3d" xmlns:o="urn:schemas-microsoft-com:office:office" xmlns:r="http://schemas.openxmlformats.org/officeDocument/2006/relationships" xmlns:m="http://schemas.openxmlformats.org/officeDocument/2006/math" xmlns:v="urn:schemas-microsoft-com:vml" xmlns:wp14="http://schemas.microsoft.com/office/word/2010/wordprocessingDrawing" xmlns:wp="http://schemas.openxmlformats.org/drawingml/2006/wordprocessingDrawing" xmlns:w10="urn:schemas-microsoft-com:office:word" xmlns:w="http://schemas.openxmlformats.org/wordprocessingml/2006/main" xmlns:w14="http://schemas.microsoft.com/office/word/2010/wordml" xmlns:w15="http://schemas.microsoft.com/office/word/2012/wordml" xmlns:w16cex="http://schemas.microsoft.com/office/word/2018/wordml/cex" xmlns:w16cid="http://schemas.microsoft.com/office/word/2016/wordml/cid" xmlns:w16="http://schemas.microsoft.com/office/word/2018/wordml" xmlns:w16sdtdh="http://schemas.microsoft.com/office/word/2020/wordml/sdtdatahash" xmlns:w16se="http://schemas.microsoft.com/office/word/2015/wordml/symex" xmlns:wpg="http://schemas.microsoft.com/office/word/2010/wordprocessingGroup" xmlns:wpi="http://schemas.microsoft.com/office/word/2010/wordprocessingInk" xmlns:wne="http://schemas.microsoft.com/office/word/2006/wordml" xmlns:wps="http://schemas.microsoft.com/office/word/2010/wordprocessingShape" mc:Ignorable="w14 w15 w16se w16cid w16 w16cex w16sdtdh wp14">
-  <w:abstractNum w:abstractNumId="0" w15:restartNumberingAfterBreak="0">
+<w:numbering xmlns:wpc="http://schemas.microsoft.com/office/word/2010/wordprocessingCanvas" xmlns:mc="http://schemas.openxmlformats.org/markup-compatibility/2006" xmlns:o="urn:schemas-microsoft-com:office:office" xmlns:r="http://schemas.openxmlformats.org/officeDocument/2006/relationships" xmlns:m="http://schemas.openxmlformats.org/officeDocument/2006/math" xmlns:v="urn:schemas-microsoft-com:vml" xmlns:wp14="http://schemas.microsoft.com/office/word/2010/wordprocessingDrawing" xmlns:wp="http://schemas.openxmlformats.org/drawingml/2006/wordprocessingDrawing" xmlns:w10="urn:schemas-microsoft-com:office:word" xmlns:w="http://schemas.openxmlformats.org/wordprocessingml/2006/main" xmlns:w14="http://schemas.microsoft.com/office/word/2010/wordml" xmlns:wpg="http://schemas.microsoft.com/office/word/2010/wordprocessingGroup" xmlns:wpi="http://schemas.microsoft.com/office/word/2010/wordprocessingInk" xmlns:wne="http://schemas.microsoft.com/office/word/2006/wordml" xmlns:wps="http://schemas.microsoft.com/office/word/2010/wordprocessingShape" xmlns:wpsCustomData="http://www.wps.cn/officeDocument/2013/wpsCustomData" mc:Ignorable="w14 wp14">
+  <w:abstractNum w:abstractNumId="0">
     <w:nsid w:val="00B839D8"/>
-    <w:multiLevelType w:val="hybridMultilevel"/>
-    <w:tmpl w:val="BA025DD8"/>
-    <w:lvl w:ilvl="0" w:tplc="0409000F">
+    <w:multiLevelType w:val="multilevel"/>
+    <w:tmpl w:val="00B839D8"/>
+    <w:lvl w:ilvl="0" w:tentative="0">
       <w:start w:val="1"/>
       <w:numFmt w:val="decimal"/>
       <w:lvlText w:val="%1."/>
@@ -2586,7 +2228,7 @@
         <w:ind w:left="720" w:hanging="360"/>
       </w:pPr>
     </w:lvl>
-    <w:lvl w:ilvl="1" w:tplc="04090019" w:tentative="1">
+    <w:lvl w:ilvl="1" w:tentative="0">
       <w:start w:val="1"/>
       <w:numFmt w:val="lowerLetter"/>
       <w:lvlText w:val="%2."/>
@@ -2595,7 +2237,7 @@
         <w:ind w:left="1440" w:hanging="360"/>
       </w:pPr>
     </w:lvl>
-    <w:lvl w:ilvl="2" w:tplc="0409001B" w:tentative="1">
+    <w:lvl w:ilvl="2" w:tentative="0">
       <w:start w:val="1"/>
       <w:numFmt w:val="lowerRoman"/>
       <w:lvlText w:val="%3."/>
@@ -2604,7 +2246,7 @@
         <w:ind w:left="2160" w:hanging="180"/>
       </w:pPr>
     </w:lvl>
-    <w:lvl w:ilvl="3" w:tplc="0409000F" w:tentative="1">
+    <w:lvl w:ilvl="3" w:tentative="0">
       <w:start w:val="1"/>
       <w:numFmt w:val="decimal"/>
       <w:lvlText w:val="%4."/>
@@ -2613,7 +2255,7 @@
         <w:ind w:left="2880" w:hanging="360"/>
       </w:pPr>
     </w:lvl>
-    <w:lvl w:ilvl="4" w:tplc="04090019" w:tentative="1">
+    <w:lvl w:ilvl="4" w:tentative="0">
       <w:start w:val="1"/>
       <w:numFmt w:val="lowerLetter"/>
       <w:lvlText w:val="%5."/>
@@ -2622,7 +2264,7 @@
         <w:ind w:left="3600" w:hanging="360"/>
       </w:pPr>
     </w:lvl>
-    <w:lvl w:ilvl="5" w:tplc="0409001B" w:tentative="1">
+    <w:lvl w:ilvl="5" w:tentative="0">
       <w:start w:val="1"/>
       <w:numFmt w:val="lowerRoman"/>
       <w:lvlText w:val="%6."/>
@@ -2631,7 +2273,7 @@
         <w:ind w:left="4320" w:hanging="180"/>
       </w:pPr>
     </w:lvl>
-    <w:lvl w:ilvl="6" w:tplc="0409000F" w:tentative="1">
+    <w:lvl w:ilvl="6" w:tentative="0">
       <w:start w:val="1"/>
       <w:numFmt w:val="decimal"/>
       <w:lvlText w:val="%7."/>
@@ -2640,7 +2282,7 @@
         <w:ind w:left="5040" w:hanging="360"/>
       </w:pPr>
     </w:lvl>
-    <w:lvl w:ilvl="7" w:tplc="04090019" w:tentative="1">
+    <w:lvl w:ilvl="7" w:tentative="0">
       <w:start w:val="1"/>
       <w:numFmt w:val="lowerLetter"/>
       <w:lvlText w:val="%8."/>
@@ -2649,7 +2291,7 @@
         <w:ind w:left="5760" w:hanging="360"/>
       </w:pPr>
     </w:lvl>
-    <w:lvl w:ilvl="8" w:tplc="0409001B" w:tentative="1">
+    <w:lvl w:ilvl="8" w:tentative="0">
       <w:start w:val="1"/>
       <w:numFmt w:val="lowerRoman"/>
       <w:lvlText w:val="%9."/>
@@ -2659,619 +2301,298 @@
       </w:pPr>
     </w:lvl>
   </w:abstractNum>
-  <w:abstractNum w:abstractNumId="1" w15:restartNumberingAfterBreak="0">
-    <w:nsid w:val="60987DEF"/>
-    <w:multiLevelType w:val="hybridMultilevel"/>
-    <w:tmpl w:val="632E61D6"/>
-    <w:lvl w:ilvl="0" w:tplc="0409000F">
-      <w:start w:val="1"/>
-      <w:numFmt w:val="decimal"/>
-      <w:lvlText w:val="%1."/>
-      <w:lvlJc w:val="left"/>
-      <w:pPr>
-        <w:ind w:left="720" w:hanging="360"/>
-      </w:pPr>
-      <w:rPr>
-        <w:rFonts w:hint="default"/>
-      </w:rPr>
-    </w:lvl>
-    <w:lvl w:ilvl="1" w:tplc="04090019" w:tentative="1">
-      <w:start w:val="1"/>
-      <w:numFmt w:val="lowerLetter"/>
-      <w:lvlText w:val="%2."/>
-      <w:lvlJc w:val="left"/>
-      <w:pPr>
-        <w:ind w:left="1440" w:hanging="360"/>
-      </w:pPr>
-    </w:lvl>
-    <w:lvl w:ilvl="2" w:tplc="0409001B" w:tentative="1">
-      <w:start w:val="1"/>
-      <w:numFmt w:val="lowerRoman"/>
-      <w:lvlText w:val="%3."/>
-      <w:lvlJc w:val="right"/>
-      <w:pPr>
-        <w:ind w:left="2160" w:hanging="180"/>
-      </w:pPr>
-    </w:lvl>
-    <w:lvl w:ilvl="3" w:tplc="0409000F" w:tentative="1">
-      <w:start w:val="1"/>
-      <w:numFmt w:val="decimal"/>
-      <w:lvlText w:val="%4."/>
-      <w:lvlJc w:val="left"/>
-      <w:pPr>
-        <w:ind w:left="2880" w:hanging="360"/>
-      </w:pPr>
-    </w:lvl>
-    <w:lvl w:ilvl="4" w:tplc="04090019" w:tentative="1">
-      <w:start w:val="1"/>
-      <w:numFmt w:val="lowerLetter"/>
-      <w:lvlText w:val="%5."/>
-      <w:lvlJc w:val="left"/>
-      <w:pPr>
-        <w:ind w:left="3600" w:hanging="360"/>
-      </w:pPr>
-    </w:lvl>
-    <w:lvl w:ilvl="5" w:tplc="0409001B" w:tentative="1">
-      <w:start w:val="1"/>
-      <w:numFmt w:val="lowerRoman"/>
-      <w:lvlText w:val="%6."/>
-      <w:lvlJc w:val="right"/>
-      <w:pPr>
-        <w:ind w:left="4320" w:hanging="180"/>
-      </w:pPr>
-    </w:lvl>
-    <w:lvl w:ilvl="6" w:tplc="0409000F" w:tentative="1">
-      <w:start w:val="1"/>
-      <w:numFmt w:val="decimal"/>
-      <w:lvlText w:val="%7."/>
-      <w:lvlJc w:val="left"/>
-      <w:pPr>
-        <w:ind w:left="5040" w:hanging="360"/>
-      </w:pPr>
-    </w:lvl>
-    <w:lvl w:ilvl="7" w:tplc="04090019" w:tentative="1">
-      <w:start w:val="1"/>
-      <w:numFmt w:val="lowerLetter"/>
-      <w:lvlText w:val="%8."/>
-      <w:lvlJc w:val="left"/>
-      <w:pPr>
-        <w:ind w:left="5760" w:hanging="360"/>
-      </w:pPr>
-    </w:lvl>
-    <w:lvl w:ilvl="8" w:tplc="0409001B" w:tentative="1">
-      <w:start w:val="1"/>
-      <w:numFmt w:val="lowerRoman"/>
-      <w:lvlText w:val="%9."/>
-      <w:lvlJc w:val="right"/>
-      <w:pPr>
-        <w:ind w:left="6480" w:hanging="180"/>
-      </w:pPr>
-    </w:lvl>
-  </w:abstractNum>
-  <w:abstractNum w:abstractNumId="2" w15:restartNumberingAfterBreak="0">
-    <w:nsid w:val="72B27226"/>
-    <w:multiLevelType w:val="hybridMultilevel"/>
-    <w:tmpl w:val="29FC37CC"/>
-    <w:lvl w:ilvl="0" w:tplc="F4563DDA">
-      <w:start w:val="1"/>
-      <w:numFmt w:val="decimal"/>
-      <w:lvlText w:val="%1."/>
-      <w:lvlJc w:val="left"/>
-      <w:pPr>
-        <w:ind w:left="720" w:hanging="360"/>
-      </w:pPr>
-      <w:rPr>
-        <w:b w:val="0"/>
-        <w:bCs w:val="0"/>
-      </w:rPr>
-    </w:lvl>
-    <w:lvl w:ilvl="1" w:tplc="0409000B">
-      <w:start w:val="1"/>
-      <w:numFmt w:val="bullet"/>
-      <w:lvlText w:val=""/>
-      <w:lvlJc w:val="left"/>
-      <w:pPr>
-        <w:ind w:left="1440" w:hanging="360"/>
-      </w:pPr>
-      <w:rPr>
-        <w:rFonts w:ascii="Wingdings" w:hAnsi="Wingdings" w:hint="default"/>
-      </w:rPr>
-    </w:lvl>
-    <w:lvl w:ilvl="2" w:tplc="0409001B">
-      <w:start w:val="1"/>
-      <w:numFmt w:val="lowerRoman"/>
-      <w:lvlText w:val="%3."/>
-      <w:lvlJc w:val="right"/>
-      <w:pPr>
-        <w:ind w:left="2160" w:hanging="180"/>
-      </w:pPr>
-    </w:lvl>
-    <w:lvl w:ilvl="3" w:tplc="0409000F">
-      <w:start w:val="1"/>
-      <w:numFmt w:val="decimal"/>
-      <w:lvlText w:val="%4."/>
-      <w:lvlJc w:val="left"/>
-      <w:pPr>
-        <w:ind w:left="2880" w:hanging="360"/>
-      </w:pPr>
-    </w:lvl>
-    <w:lvl w:ilvl="4" w:tplc="04090019">
-      <w:start w:val="1"/>
-      <w:numFmt w:val="lowerLetter"/>
-      <w:lvlText w:val="%5."/>
-      <w:lvlJc w:val="left"/>
-      <w:pPr>
-        <w:ind w:left="3600" w:hanging="360"/>
-      </w:pPr>
-    </w:lvl>
-    <w:lvl w:ilvl="5" w:tplc="0409001B" w:tentative="1">
-      <w:start w:val="1"/>
-      <w:numFmt w:val="lowerRoman"/>
-      <w:lvlText w:val="%6."/>
-      <w:lvlJc w:val="right"/>
-      <w:pPr>
-        <w:ind w:left="4320" w:hanging="180"/>
-      </w:pPr>
-    </w:lvl>
-    <w:lvl w:ilvl="6" w:tplc="0409000F" w:tentative="1">
-      <w:start w:val="1"/>
-      <w:numFmt w:val="decimal"/>
-      <w:lvlText w:val="%7."/>
-      <w:lvlJc w:val="left"/>
-      <w:pPr>
-        <w:ind w:left="5040" w:hanging="360"/>
-      </w:pPr>
-    </w:lvl>
-    <w:lvl w:ilvl="7" w:tplc="04090019" w:tentative="1">
-      <w:start w:val="1"/>
-      <w:numFmt w:val="lowerLetter"/>
-      <w:lvlText w:val="%8."/>
-      <w:lvlJc w:val="left"/>
-      <w:pPr>
-        <w:ind w:left="5760" w:hanging="360"/>
-      </w:pPr>
-    </w:lvl>
-    <w:lvl w:ilvl="8" w:tplc="0409001B" w:tentative="1">
-      <w:start w:val="1"/>
-      <w:numFmt w:val="lowerRoman"/>
-      <w:lvlText w:val="%9."/>
-      <w:lvlJc w:val="right"/>
-      <w:pPr>
-        <w:ind w:left="6480" w:hanging="180"/>
-      </w:pPr>
-    </w:lvl>
-  </w:abstractNum>
   <w:num w:numId="1">
-    <w:abstractNumId w:val="2"/>
-  </w:num>
-  <w:num w:numId="2">
-    <w:abstractNumId w:val="1"/>
-  </w:num>
-  <w:num w:numId="3">
     <w:abstractNumId w:val="0"/>
   </w:num>
 </w:numbering>
 </file>
 
 <file path=word/styles.xml><?xml version="1.0" encoding="utf-8"?>
-<w:styles xmlns:mc="http://schemas.openxmlformats.org/markup-compatibility/2006" xmlns:r="http://schemas.openxmlformats.org/officeDocument/2006/relationships" xmlns:w="http://schemas.openxmlformats.org/wordprocessingml/2006/main" xmlns:w14="http://schemas.microsoft.com/office/word/2010/wordml" xmlns:w15="http://schemas.microsoft.com/office/word/2012/wordml" xmlns:w16cex="http://schemas.microsoft.com/office/word/2018/wordml/cex" xmlns:w16cid="http://schemas.microsoft.com/office/word/2016/wordml/cid" xmlns:w16="http://schemas.microsoft.com/office/word/2018/wordml" xmlns:w16sdtdh="http://schemas.microsoft.com/office/word/2020/wordml/sdtdatahash" xmlns:w16se="http://schemas.microsoft.com/office/word/2015/wordml/symex" mc:Ignorable="w14 w15 w16se w16cid w16 w16cex w16sdtdh">
+<w:styles xmlns:mc="http://schemas.openxmlformats.org/markup-compatibility/2006" xmlns:o="urn:schemas-microsoft-com:office:office" xmlns:r="http://schemas.openxmlformats.org/officeDocument/2006/relationships" xmlns:m="http://schemas.openxmlformats.org/officeDocument/2006/math" xmlns:v="urn:schemas-microsoft-com:vml" xmlns:w="http://schemas.openxmlformats.org/wordprocessingml/2006/main" xmlns:w14="http://schemas.microsoft.com/office/word/2010/wordml" xmlns:w10="urn:schemas-microsoft-com:office:word" xmlns:sl="http://schemas.openxmlformats.org/schemaLibrary/2006/main" xmlns:wpsCustomData="http://www.wps.cn/officeDocument/2013/wpsCustomData" mc:Ignorable="w14">
   <w:docDefaults>
     <w:rPrDefault>
       <w:rPr>
-        <w:rFonts w:asciiTheme="minorHAnsi" w:eastAsiaTheme="minorHAnsi" w:hAnsiTheme="minorHAnsi" w:cstheme="minorBidi"/>
-        <w:kern w:val="2"/>
-        <w:sz w:val="24"/>
-        <w:szCs w:val="24"/>
-        <w:lang w:val="en-US" w:eastAsia="en-US" w:bidi="ar-SA"/>
-        <w14:ligatures w14:val="standardContextual"/>
+        <w:rFonts w:asciiTheme="minorHAnsi" w:hAnsiTheme="minorHAnsi" w:eastAsiaTheme="minorHAnsi" w:cstheme="minorBidi"/>
       </w:rPr>
     </w:rPrDefault>
-    <w:pPrDefault>
-      <w:pPr>
-        <w:spacing w:after="160" w:line="278" w:lineRule="auto"/>
-      </w:pPr>
-    </w:pPrDefault>
+    <w:pPrDefault/>
   </w:docDefaults>
-  <w:latentStyles w:defLockedState="0" w:defUIPriority="99" w:defSemiHidden="0" w:defUnhideWhenUsed="0" w:defQFormat="0" w:count="376">
-    <w:lsdException w:name="Normal" w:uiPriority="0" w:qFormat="1"/>
-    <w:lsdException w:name="heading 1" w:uiPriority="9" w:qFormat="1"/>
-    <w:lsdException w:name="heading 2" w:semiHidden="1" w:uiPriority="9" w:unhideWhenUsed="1" w:qFormat="1"/>
-    <w:lsdException w:name="heading 3" w:semiHidden="1" w:uiPriority="9" w:unhideWhenUsed="1" w:qFormat="1"/>
-    <w:lsdException w:name="heading 4" w:semiHidden="1" w:uiPriority="9" w:unhideWhenUsed="1" w:qFormat="1"/>
-    <w:lsdException w:name="heading 5" w:semiHidden="1" w:uiPriority="9" w:unhideWhenUsed="1" w:qFormat="1"/>
-    <w:lsdException w:name="heading 6" w:semiHidden="1" w:uiPriority="9" w:unhideWhenUsed="1" w:qFormat="1"/>
-    <w:lsdException w:name="heading 7" w:semiHidden="1" w:uiPriority="9" w:unhideWhenUsed="1" w:qFormat="1"/>
-    <w:lsdException w:name="heading 8" w:semiHidden="1" w:uiPriority="9" w:unhideWhenUsed="1" w:qFormat="1"/>
-    <w:lsdException w:name="heading 9" w:semiHidden="1" w:uiPriority="9" w:unhideWhenUsed="1" w:qFormat="1"/>
-    <w:lsdException w:name="index 1" w:semiHidden="1" w:unhideWhenUsed="1"/>
-    <w:lsdException w:name="index 2" w:semiHidden="1" w:unhideWhenUsed="1"/>
-    <w:lsdException w:name="index 3" w:semiHidden="1" w:unhideWhenUsed="1"/>
-    <w:lsdException w:name="index 4" w:semiHidden="1" w:unhideWhenUsed="1"/>
-    <w:lsdException w:name="index 5" w:semiHidden="1" w:unhideWhenUsed="1"/>
-    <w:lsdException w:name="index 6" w:semiHidden="1" w:unhideWhenUsed="1"/>
-    <w:lsdException w:name="index 7" w:semiHidden="1" w:unhideWhenUsed="1"/>
-    <w:lsdException w:name="index 8" w:semiHidden="1" w:unhideWhenUsed="1"/>
-    <w:lsdException w:name="index 9" w:semiHidden="1" w:unhideWhenUsed="1"/>
-    <w:lsdException w:name="toc 1" w:semiHidden="1" w:uiPriority="39" w:unhideWhenUsed="1"/>
-    <w:lsdException w:name="toc 2" w:semiHidden="1" w:uiPriority="39" w:unhideWhenUsed="1"/>
-    <w:lsdException w:name="toc 3" w:semiHidden="1" w:uiPriority="39" w:unhideWhenUsed="1"/>
-    <w:lsdException w:name="toc 4" w:semiHidden="1" w:uiPriority="39" w:unhideWhenUsed="1"/>
-    <w:lsdException w:name="toc 5" w:semiHidden="1" w:uiPriority="39" w:unhideWhenUsed="1"/>
-    <w:lsdException w:name="toc 6" w:semiHidden="1" w:uiPriority="39" w:unhideWhenUsed="1"/>
-    <w:lsdException w:name="toc 7" w:semiHidden="1" w:uiPriority="39" w:unhideWhenUsed="1"/>
-    <w:lsdException w:name="toc 8" w:semiHidden="1" w:uiPriority="39" w:unhideWhenUsed="1"/>
-    <w:lsdException w:name="toc 9" w:semiHidden="1" w:uiPriority="39" w:unhideWhenUsed="1"/>
-    <w:lsdException w:name="Normal Indent" w:semiHidden="1" w:unhideWhenUsed="1"/>
-    <w:lsdException w:name="footnote text" w:semiHidden="1" w:unhideWhenUsed="1"/>
-    <w:lsdException w:name="annotation text" w:semiHidden="1" w:unhideWhenUsed="1"/>
-    <w:lsdException w:name="header" w:semiHidden="1" w:unhideWhenUsed="1"/>
-    <w:lsdException w:name="footer" w:semiHidden="1" w:unhideWhenUsed="1"/>
-    <w:lsdException w:name="index heading" w:semiHidden="1" w:unhideWhenUsed="1"/>
-    <w:lsdException w:name="caption" w:semiHidden="1" w:uiPriority="35" w:unhideWhenUsed="1" w:qFormat="1"/>
-    <w:lsdException w:name="table of figures" w:semiHidden="1" w:unhideWhenUsed="1"/>
-    <w:lsdException w:name="envelope address" w:semiHidden="1" w:unhideWhenUsed="1"/>
-    <w:lsdException w:name="envelope return" w:semiHidden="1" w:unhideWhenUsed="1"/>
-    <w:lsdException w:name="footnote reference" w:semiHidden="1" w:unhideWhenUsed="1"/>
-    <w:lsdException w:name="annotation reference" w:semiHidden="1" w:unhideWhenUsed="1"/>
-    <w:lsdException w:name="line number" w:semiHidden="1" w:unhideWhenUsed="1"/>
-    <w:lsdException w:name="page number" w:semiHidden="1" w:unhideWhenUsed="1"/>
-    <w:lsdException w:name="endnote reference" w:semiHidden="1" w:unhideWhenUsed="1"/>
-    <w:lsdException w:name="endnote text" w:semiHidden="1" w:unhideWhenUsed="1"/>
-    <w:lsdException w:name="table of authorities" w:semiHidden="1" w:unhideWhenUsed="1"/>
-    <w:lsdException w:name="macro" w:semiHidden="1" w:unhideWhenUsed="1"/>
-    <w:lsdException w:name="toa heading" w:semiHidden="1" w:unhideWhenUsed="1"/>
-    <w:lsdException w:name="List" w:semiHidden="1" w:unhideWhenUsed="1"/>
-    <w:lsdException w:name="List Bullet" w:semiHidden="1" w:unhideWhenUsed="1"/>
-    <w:lsdException w:name="List Number" w:semiHidden="1" w:unhideWhenUsed="1"/>
-    <w:lsdException w:name="List 2" w:semiHidden="1" w:unhideWhenUsed="1"/>
-    <w:lsdException w:name="List 3" w:semiHidden="1" w:unhideWhenUsed="1"/>
-    <w:lsdException w:name="List 4" w:semiHidden="1" w:unhideWhenUsed="1"/>
-    <w:lsdException w:name="List 5" w:semiHidden="1" w:unhideWhenUsed="1"/>
-    <w:lsdException w:name="List Bullet 2" w:semiHidden="1" w:unhideWhenUsed="1"/>
-    <w:lsdException w:name="List Bullet 3" w:semiHidden="1" w:unhideWhenUsed="1"/>
-    <w:lsdException w:name="List Bullet 4" w:semiHidden="1" w:unhideWhenUsed="1"/>
-    <w:lsdException w:name="List Bullet 5" w:semiHidden="1" w:unhideWhenUsed="1"/>
-    <w:lsdException w:name="List Number 2" w:semiHidden="1" w:unhideWhenUsed="1"/>
-    <w:lsdException w:name="List Number 3" w:semiHidden="1" w:unhideWhenUsed="1"/>
-    <w:lsdException w:name="List Number 4" w:semiHidden="1" w:unhideWhenUsed="1"/>
-    <w:lsdException w:name="List Number 5" w:semiHidden="1" w:unhideWhenUsed="1"/>
-    <w:lsdException w:name="Title" w:uiPriority="10" w:qFormat="1"/>
-    <w:lsdException w:name="Closing" w:semiHidden="1" w:unhideWhenUsed="1"/>
-    <w:lsdException w:name="Signature" w:semiHidden="1" w:unhideWhenUsed="1"/>
-    <w:lsdException w:name="Default Paragraph Font" w:semiHidden="1" w:uiPriority="1" w:unhideWhenUsed="1"/>
-    <w:lsdException w:name="Body Text" w:semiHidden="1" w:unhideWhenUsed="1"/>
-    <w:lsdException w:name="Body Text Indent" w:semiHidden="1" w:unhideWhenUsed="1"/>
-    <w:lsdException w:name="List Continue" w:semiHidden="1" w:unhideWhenUsed="1"/>
-    <w:lsdException w:name="List Continue 2" w:semiHidden="1" w:unhideWhenUsed="1"/>
-    <w:lsdException w:name="List Continue 3" w:semiHidden="1" w:unhideWhenUsed="1"/>
-    <w:lsdException w:name="List Continue 4" w:semiHidden="1" w:unhideWhenUsed="1"/>
-    <w:lsdException w:name="List Continue 5" w:semiHidden="1" w:unhideWhenUsed="1"/>
-    <w:lsdException w:name="Message Header" w:semiHidden="1" w:unhideWhenUsed="1"/>
-    <w:lsdException w:name="Subtitle" w:uiPriority="11" w:qFormat="1"/>
-    <w:lsdException w:name="Salutation" w:semiHidden="1" w:unhideWhenUsed="1"/>
-    <w:lsdException w:name="Date" w:semiHidden="1" w:unhideWhenUsed="1"/>
-    <w:lsdException w:name="Body Text First Indent" w:semiHidden="1" w:unhideWhenUsed="1"/>
-    <w:lsdException w:name="Body Text First Indent 2" w:semiHidden="1" w:unhideWhenUsed="1"/>
-    <w:lsdException w:name="Note Heading" w:semiHidden="1" w:unhideWhenUsed="1"/>
-    <w:lsdException w:name="Body Text 2" w:semiHidden="1" w:unhideWhenUsed="1"/>
-    <w:lsdException w:name="Body Text 3" w:semiHidden="1" w:unhideWhenUsed="1"/>
-    <w:lsdException w:name="Body Text Indent 2" w:semiHidden="1" w:unhideWhenUsed="1"/>
-    <w:lsdException w:name="Body Text Indent 3" w:semiHidden="1" w:unhideWhenUsed="1"/>
-    <w:lsdException w:name="Block Text" w:semiHidden="1" w:unhideWhenUsed="1"/>
-    <w:lsdException w:name="Hyperlink" w:semiHidden="1" w:unhideWhenUsed="1"/>
-    <w:lsdException w:name="FollowedHyperlink" w:semiHidden="1" w:unhideWhenUsed="1"/>
-    <w:lsdException w:name="Strong" w:uiPriority="22" w:qFormat="1"/>
-    <w:lsdException w:name="Emphasis" w:uiPriority="20" w:qFormat="1"/>
-    <w:lsdException w:name="Document Map" w:semiHidden="1" w:unhideWhenUsed="1"/>
-    <w:lsdException w:name="Plain Text" w:semiHidden="1" w:unhideWhenUsed="1"/>
-    <w:lsdException w:name="E-mail Signature" w:semiHidden="1" w:unhideWhenUsed="1"/>
-    <w:lsdException w:name="HTML Top of Form" w:semiHidden="1" w:unhideWhenUsed="1"/>
-    <w:lsdException w:name="HTML Bottom of Form" w:semiHidden="1" w:unhideWhenUsed="1"/>
-    <w:lsdException w:name="Normal (Web)" w:semiHidden="1" w:unhideWhenUsed="1"/>
-    <w:lsdException w:name="HTML Acronym" w:semiHidden="1" w:unhideWhenUsed="1"/>
-    <w:lsdException w:name="HTML Address" w:semiHidden="1" w:unhideWhenUsed="1"/>
-    <w:lsdException w:name="HTML Cite" w:semiHidden="1" w:unhideWhenUsed="1"/>
-    <w:lsdException w:name="HTML Code" w:semiHidden="1" w:unhideWhenUsed="1"/>
-    <w:lsdException w:name="HTML Definition" w:semiHidden="1" w:unhideWhenUsed="1"/>
-    <w:lsdException w:name="HTML Keyboard" w:semiHidden="1" w:unhideWhenUsed="1"/>
-    <w:lsdException w:name="HTML Preformatted" w:semiHidden="1" w:unhideWhenUsed="1"/>
-    <w:lsdException w:name="HTML Sample" w:semiHidden="1" w:unhideWhenUsed="1"/>
-    <w:lsdException w:name="HTML Typewriter" w:semiHidden="1" w:unhideWhenUsed="1"/>
-    <w:lsdException w:name="HTML Variable" w:semiHidden="1" w:unhideWhenUsed="1"/>
-    <w:lsdException w:name="Normal Table" w:semiHidden="1" w:unhideWhenUsed="1"/>
-    <w:lsdException w:name="annotation subject" w:semiHidden="1" w:unhideWhenUsed="1"/>
-    <w:lsdException w:name="No List" w:semiHidden="1" w:unhideWhenUsed="1"/>
-    <w:lsdException w:name="Outline List 1" w:semiHidden="1" w:unhideWhenUsed="1"/>
-    <w:lsdException w:name="Outline List 2" w:semiHidden="1" w:unhideWhenUsed="1"/>
-    <w:lsdException w:name="Outline List 3" w:semiHidden="1" w:unhideWhenUsed="1"/>
-    <w:lsdException w:name="Table Simple 1" w:semiHidden="1" w:unhideWhenUsed="1"/>
-    <w:lsdException w:name="Table Simple 2" w:semiHidden="1" w:unhideWhenUsed="1"/>
-    <w:lsdException w:name="Table Simple 3" w:semiHidden="1" w:unhideWhenUsed="1"/>
-    <w:lsdException w:name="Table Classic 1" w:semiHidden="1" w:unhideWhenUsed="1"/>
-    <w:lsdException w:name="Table Classic 2" w:semiHidden="1" w:unhideWhenUsed="1"/>
-    <w:lsdException w:name="Table Classic 3" w:semiHidden="1" w:unhideWhenUsed="1"/>
-    <w:lsdException w:name="Table Classic 4" w:semiHidden="1" w:unhideWhenUsed="1"/>
-    <w:lsdException w:name="Table Colorful 1" w:semiHidden="1" w:unhideWhenUsed="1"/>
-    <w:lsdException w:name="Table Colorful 2" w:semiHidden="1" w:unhideWhenUsed="1"/>
-    <w:lsdException w:name="Table Colorful 3" w:semiHidden="1" w:unhideWhenUsed="1"/>
-    <w:lsdException w:name="Table Columns 1" w:semiHidden="1" w:unhideWhenUsed="1"/>
-    <w:lsdException w:name="Table Columns 2" w:semiHidden="1" w:unhideWhenUsed="1"/>
-    <w:lsdException w:name="Table Columns 3" w:semiHidden="1" w:unhideWhenUsed="1"/>
-    <w:lsdException w:name="Table Columns 4" w:semiHidden="1" w:unhideWhenUsed="1"/>
-    <w:lsdException w:name="Table Columns 5" w:semiHidden="1" w:unhideWhenUsed="1"/>
-    <w:lsdException w:name="Table Grid 1" w:semiHidden="1" w:unhideWhenUsed="1"/>
-    <w:lsdException w:name="Table Grid 2" w:semiHidden="1" w:unhideWhenUsed="1"/>
-    <w:lsdException w:name="Table Grid 3" w:semiHidden="1" w:unhideWhenUsed="1"/>
-    <w:lsdException w:name="Table Grid 4" w:semiHidden="1" w:unhideWhenUsed="1"/>
-    <w:lsdException w:name="Table Grid 5" w:semiHidden="1" w:unhideWhenUsed="1"/>
-    <w:lsdException w:name="Table Grid 6" w:semiHidden="1" w:unhideWhenUsed="1"/>
-    <w:lsdException w:name="Table Grid 7" w:semiHidden="1" w:unhideWhenUsed="1"/>
-    <w:lsdException w:name="Table Grid 8" w:semiHidden="1" w:unhideWhenUsed="1"/>
-    <w:lsdException w:name="Table List 1" w:semiHidden="1" w:unhideWhenUsed="1"/>
-    <w:lsdException w:name="Table List 2" w:semiHidden="1" w:unhideWhenUsed="1"/>
-    <w:lsdException w:name="Table List 3" w:semiHidden="1" w:unhideWhenUsed="1"/>
-    <w:lsdException w:name="Table List 4" w:semiHidden="1" w:unhideWhenUsed="1"/>
-    <w:lsdException w:name="Table List 5" w:semiHidden="1" w:unhideWhenUsed="1"/>
-    <w:lsdException w:name="Table List 6" w:semiHidden="1" w:unhideWhenUsed="1"/>
-    <w:lsdException w:name="Table List 7" w:semiHidden="1" w:unhideWhenUsed="1"/>
-    <w:lsdException w:name="Table List 8" w:semiHidden="1" w:unhideWhenUsed="1"/>
-    <w:lsdException w:name="Table 3D effects 1" w:semiHidden="1" w:unhideWhenUsed="1"/>
-    <w:lsdException w:name="Table 3D effects 2" w:semiHidden="1" w:unhideWhenUsed="1"/>
-    <w:lsdException w:name="Table 3D effects 3" w:semiHidden="1" w:unhideWhenUsed="1"/>
-    <w:lsdException w:name="Table Contemporary" w:semiHidden="1" w:unhideWhenUsed="1"/>
-    <w:lsdException w:name="Table Elegant" w:semiHidden="1" w:unhideWhenUsed="1"/>
-    <w:lsdException w:name="Table Professional" w:semiHidden="1" w:unhideWhenUsed="1"/>
-    <w:lsdException w:name="Table Subtle 1" w:semiHidden="1" w:unhideWhenUsed="1"/>
-    <w:lsdException w:name="Table Subtle 2" w:semiHidden="1" w:unhideWhenUsed="1"/>
-    <w:lsdException w:name="Table Web 1" w:semiHidden="1" w:unhideWhenUsed="1"/>
-    <w:lsdException w:name="Table Web 2" w:semiHidden="1" w:unhideWhenUsed="1"/>
-    <w:lsdException w:name="Table Web 3" w:semiHidden="1" w:unhideWhenUsed="1"/>
-    <w:lsdException w:name="Balloon Text" w:semiHidden="1" w:unhideWhenUsed="1"/>
-    <w:lsdException w:name="Table Grid" w:uiPriority="39"/>
-    <w:lsdException w:name="Table Theme" w:semiHidden="1" w:unhideWhenUsed="1"/>
-    <w:lsdException w:name="Placeholder Text" w:semiHidden="1"/>
-    <w:lsdException w:name="No Spacing" w:uiPriority="1" w:qFormat="1"/>
-    <w:lsdException w:name="Light Shading" w:uiPriority="60"/>
-    <w:lsdException w:name="Light List" w:uiPriority="61"/>
-    <w:lsdException w:name="Light Grid" w:uiPriority="62"/>
-    <w:lsdException w:name="Medium Shading 1" w:uiPriority="63"/>
-    <w:lsdException w:name="Medium Shading 2" w:uiPriority="64"/>
-    <w:lsdException w:name="Medium List 1" w:uiPriority="65"/>
-    <w:lsdException w:name="Medium List 2" w:uiPriority="66"/>
-    <w:lsdException w:name="Medium Grid 1" w:uiPriority="67"/>
-    <w:lsdException w:name="Medium Grid 2" w:uiPriority="68"/>
-    <w:lsdException w:name="Medium Grid 3" w:uiPriority="69"/>
-    <w:lsdException w:name="Dark List" w:uiPriority="70"/>
-    <w:lsdException w:name="Colorful Shading" w:uiPriority="71"/>
-    <w:lsdException w:name="Colorful List" w:uiPriority="72"/>
-    <w:lsdException w:name="Colorful Grid" w:uiPriority="73"/>
-    <w:lsdException w:name="Light Shading Accent 1" w:uiPriority="60"/>
-    <w:lsdException w:name="Light List Accent 1" w:uiPriority="61"/>
-    <w:lsdException w:name="Light Grid Accent 1" w:uiPriority="62"/>
-    <w:lsdException w:name="Medium Shading 1 Accent 1" w:uiPriority="63"/>
-    <w:lsdException w:name="Medium Shading 2 Accent 1" w:uiPriority="64"/>
-    <w:lsdException w:name="Medium List 1 Accent 1" w:uiPriority="65"/>
-    <w:lsdException w:name="Revision" w:semiHidden="1"/>
-    <w:lsdException w:name="List Paragraph" w:uiPriority="34" w:qFormat="1"/>
-    <w:lsdException w:name="Quote" w:uiPriority="29" w:qFormat="1"/>
-    <w:lsdException w:name="Intense Quote" w:uiPriority="30" w:qFormat="1"/>
-    <w:lsdException w:name="Medium List 2 Accent 1" w:uiPriority="66"/>
-    <w:lsdException w:name="Medium Grid 1 Accent 1" w:uiPriority="67"/>
-    <w:lsdException w:name="Medium Grid 2 Accent 1" w:uiPriority="68"/>
-    <w:lsdException w:name="Medium Grid 3 Accent 1" w:uiPriority="69"/>
-    <w:lsdException w:name="Dark List Accent 1" w:uiPriority="70"/>
-    <w:lsdException w:name="Colorful Shading Accent 1" w:uiPriority="71"/>
-    <w:lsdException w:name="Colorful List Accent 1" w:uiPriority="72"/>
-    <w:lsdException w:name="Colorful Grid Accent 1" w:uiPriority="73"/>
-    <w:lsdException w:name="Light Shading Accent 2" w:uiPriority="60"/>
-    <w:lsdException w:name="Light List Accent 2" w:uiPriority="61"/>
-    <w:lsdException w:name="Light Grid Accent 2" w:uiPriority="62"/>
-    <w:lsdException w:name="Medium Shading 1 Accent 2" w:uiPriority="63"/>
-    <w:lsdException w:name="Medium Shading 2 Accent 2" w:uiPriority="64"/>
-    <w:lsdException w:name="Medium List 1 Accent 2" w:uiPriority="65"/>
-    <w:lsdException w:name="Medium List 2 Accent 2" w:uiPriority="66"/>
-    <w:lsdException w:name="Medium Grid 1 Accent 2" w:uiPriority="67"/>
-    <w:lsdException w:name="Medium Grid 2 Accent 2" w:uiPriority="68"/>
-    <w:lsdException w:name="Medium Grid 3 Accent 2" w:uiPriority="69"/>
-    <w:lsdException w:name="Dark List Accent 2" w:uiPriority="70"/>
-    <w:lsdException w:name="Colorful Shading Accent 2" w:uiPriority="71"/>
-    <w:lsdException w:name="Colorful List Accent 2" w:uiPriority="72"/>
-    <w:lsdException w:name="Colorful Grid Accent 2" w:uiPriority="73"/>
-    <w:lsdException w:name="Light Shading Accent 3" w:uiPriority="60"/>
-    <w:lsdException w:name="Light List Accent 3" w:uiPriority="61"/>
-    <w:lsdException w:name="Light Grid Accent 3" w:uiPriority="62"/>
-    <w:lsdException w:name="Medium Shading 1 Accent 3" w:uiPriority="63"/>
-    <w:lsdException w:name="Medium Shading 2 Accent 3" w:uiPriority="64"/>
-    <w:lsdException w:name="Medium List 1 Accent 3" w:uiPriority="65"/>
-    <w:lsdException w:name="Medium List 2 Accent 3" w:uiPriority="66"/>
-    <w:lsdException w:name="Medium Grid 1 Accent 3" w:uiPriority="67"/>
-    <w:lsdException w:name="Medium Grid 2 Accent 3" w:uiPriority="68"/>
-    <w:lsdException w:name="Medium Grid 3 Accent 3" w:uiPriority="69"/>
-    <w:lsdException w:name="Dark List Accent 3" w:uiPriority="70"/>
-    <w:lsdException w:name="Colorful Shading Accent 3" w:uiPriority="71"/>
-    <w:lsdException w:name="Colorful List Accent 3" w:uiPriority="72"/>
-    <w:lsdException w:name="Colorful Grid Accent 3" w:uiPriority="73"/>
-    <w:lsdException w:name="Light Shading Accent 4" w:uiPriority="60"/>
-    <w:lsdException w:name="Light List Accent 4" w:uiPriority="61"/>
-    <w:lsdException w:name="Light Grid Accent 4" w:uiPriority="62"/>
-    <w:lsdException w:name="Medium Shading 1 Accent 4" w:uiPriority="63"/>
-    <w:lsdException w:name="Medium Shading 2 Accent 4" w:uiPriority="64"/>
-    <w:lsdException w:name="Medium List 1 Accent 4" w:uiPriority="65"/>
-    <w:lsdException w:name="Medium List 2 Accent 4" w:uiPriority="66"/>
-    <w:lsdException w:name="Medium Grid 1 Accent 4" w:uiPriority="67"/>
-    <w:lsdException w:name="Medium Grid 2 Accent 4" w:uiPriority="68"/>
-    <w:lsdException w:name="Medium Grid 3 Accent 4" w:uiPriority="69"/>
-    <w:lsdException w:name="Dark List Accent 4" w:uiPriority="70"/>
-    <w:lsdException w:name="Colorful Shading Accent 4" w:uiPriority="71"/>
-    <w:lsdException w:name="Colorful List Accent 4" w:uiPriority="72"/>
-    <w:lsdException w:name="Colorful Grid Accent 4" w:uiPriority="73"/>
-    <w:lsdException w:name="Light Shading Accent 5" w:uiPriority="60"/>
-    <w:lsdException w:name="Light List Accent 5" w:uiPriority="61"/>
-    <w:lsdException w:name="Light Grid Accent 5" w:uiPriority="62"/>
-    <w:lsdException w:name="Medium Shading 1 Accent 5" w:uiPriority="63"/>
-    <w:lsdException w:name="Medium Shading 2 Accent 5" w:uiPriority="64"/>
-    <w:lsdException w:name="Medium List 1 Accent 5" w:uiPriority="65"/>
-    <w:lsdException w:name="Medium List 2 Accent 5" w:uiPriority="66"/>
-    <w:lsdException w:name="Medium Grid 1 Accent 5" w:uiPriority="67"/>
-    <w:lsdException w:name="Medium Grid 2 Accent 5" w:uiPriority="68"/>
-    <w:lsdException w:name="Medium Grid 3 Accent 5" w:uiPriority="69"/>
-    <w:lsdException w:name="Dark List Accent 5" w:uiPriority="70"/>
-    <w:lsdException w:name="Colorful Shading Accent 5" w:uiPriority="71"/>
-    <w:lsdException w:name="Colorful List Accent 5" w:uiPriority="72"/>
-    <w:lsdException w:name="Colorful Grid Accent 5" w:uiPriority="73"/>
-    <w:lsdException w:name="Light Shading Accent 6" w:uiPriority="60"/>
-    <w:lsdException w:name="Light List Accent 6" w:uiPriority="61"/>
-    <w:lsdException w:name="Light Grid Accent 6" w:uiPriority="62"/>
-    <w:lsdException w:name="Medium Shading 1 Accent 6" w:uiPriority="63"/>
-    <w:lsdException w:name="Medium Shading 2 Accent 6" w:uiPriority="64"/>
-    <w:lsdException w:name="Medium List 1 Accent 6" w:uiPriority="65"/>
-    <w:lsdException w:name="Medium List 2 Accent 6" w:uiPriority="66"/>
-    <w:lsdException w:name="Medium Grid 1 Accent 6" w:uiPriority="67"/>
-    <w:lsdException w:name="Medium Grid 2 Accent 6" w:uiPriority="68"/>
-    <w:lsdException w:name="Medium Grid 3 Accent 6" w:uiPriority="69"/>
-    <w:lsdException w:name="Dark List Accent 6" w:uiPriority="70"/>
-    <w:lsdException w:name="Colorful Shading Accent 6" w:uiPriority="71"/>
-    <w:lsdException w:name="Colorful List Accent 6" w:uiPriority="72"/>
-    <w:lsdException w:name="Colorful Grid Accent 6" w:uiPriority="73"/>
-    <w:lsdException w:name="Subtle Emphasis" w:uiPriority="19" w:qFormat="1"/>
-    <w:lsdException w:name="Intense Emphasis" w:uiPriority="21" w:qFormat="1"/>
-    <w:lsdException w:name="Subtle Reference" w:uiPriority="31" w:qFormat="1"/>
-    <w:lsdException w:name="Intense Reference" w:uiPriority="32" w:qFormat="1"/>
-    <w:lsdException w:name="Book Title" w:uiPriority="33" w:qFormat="1"/>
-    <w:lsdException w:name="Bibliography" w:semiHidden="1" w:uiPriority="37" w:unhideWhenUsed="1"/>
-    <w:lsdException w:name="TOC Heading" w:semiHidden="1" w:uiPriority="39" w:unhideWhenUsed="1" w:qFormat="1"/>
-    <w:lsdException w:name="Plain Table 1" w:uiPriority="41"/>
-    <w:lsdException w:name="Plain Table 2" w:uiPriority="42"/>
-    <w:lsdException w:name="Plain Table 3" w:uiPriority="43"/>
-    <w:lsdException w:name="Plain Table 4" w:uiPriority="44"/>
-    <w:lsdException w:name="Plain Table 5" w:uiPriority="45"/>
-    <w:lsdException w:name="Grid Table Light" w:uiPriority="40"/>
-    <w:lsdException w:name="Grid Table 1 Light" w:uiPriority="46"/>
-    <w:lsdException w:name="Grid Table 2" w:uiPriority="47"/>
-    <w:lsdException w:name="Grid Table 3" w:uiPriority="48"/>
-    <w:lsdException w:name="Grid Table 4" w:uiPriority="49"/>
-    <w:lsdException w:name="Grid Table 5 Dark" w:uiPriority="50"/>
-    <w:lsdException w:name="Grid Table 6 Colorful" w:uiPriority="51"/>
-    <w:lsdException w:name="Grid Table 7 Colorful" w:uiPriority="52"/>
-    <w:lsdException w:name="Grid Table 1 Light Accent 1" w:uiPriority="46"/>
-    <w:lsdException w:name="Grid Table 2 Accent 1" w:uiPriority="47"/>
-    <w:lsdException w:name="Grid Table 3 Accent 1" w:uiPriority="48"/>
-    <w:lsdException w:name="Grid Table 4 Accent 1" w:uiPriority="49"/>
-    <w:lsdException w:name="Grid Table 5 Dark Accent 1" w:uiPriority="50"/>
-    <w:lsdException w:name="Grid Table 6 Colorful Accent 1" w:uiPriority="51"/>
-    <w:lsdException w:name="Grid Table 7 Colorful Accent 1" w:uiPriority="52"/>
-    <w:lsdException w:name="Grid Table 1 Light Accent 2" w:uiPriority="46"/>
-    <w:lsdException w:name="Grid Table 2 Accent 2" w:uiPriority="47"/>
-    <w:lsdException w:name="Grid Table 3 Accent 2" w:uiPriority="48"/>
-    <w:lsdException w:name="Grid Table 4 Accent 2" w:uiPriority="49"/>
-    <w:lsdException w:name="Grid Table 5 Dark Accent 2" w:uiPriority="50"/>
-    <w:lsdException w:name="Grid Table 6 Colorful Accent 2" w:uiPriority="51"/>
-    <w:lsdException w:name="Grid Table 7 Colorful Accent 2" w:uiPriority="52"/>
-    <w:lsdException w:name="Grid Table 1 Light Accent 3" w:uiPriority="46"/>
-    <w:lsdException w:name="Grid Table 2 Accent 3" w:uiPriority="47"/>
-    <w:lsdException w:name="Grid Table 3 Accent 3" w:uiPriority="48"/>
-    <w:lsdException w:name="Grid Table 4 Accent 3" w:uiPriority="49"/>
-    <w:lsdException w:name="Grid Table 5 Dark Accent 3" w:uiPriority="50"/>
-    <w:lsdException w:name="Grid Table 6 Colorful Accent 3" w:uiPriority="51"/>
-    <w:lsdException w:name="Grid Table 7 Colorful Accent 3" w:uiPriority="52"/>
-    <w:lsdException w:name="Grid Table 1 Light Accent 4" w:uiPriority="46"/>
-    <w:lsdException w:name="Grid Table 2 Accent 4" w:uiPriority="47"/>
-    <w:lsdException w:name="Grid Table 3 Accent 4" w:uiPriority="48"/>
-    <w:lsdException w:name="Grid Table 4 Accent 4" w:uiPriority="49"/>
-    <w:lsdException w:name="Grid Table 5 Dark Accent 4" w:uiPriority="50"/>
-    <w:lsdException w:name="Grid Table 6 Colorful Accent 4" w:uiPriority="51"/>
-    <w:lsdException w:name="Grid Table 7 Colorful Accent 4" w:uiPriority="52"/>
-    <w:lsdException w:name="Grid Table 1 Light Accent 5" w:uiPriority="46"/>
-    <w:lsdException w:name="Grid Table 2 Accent 5" w:uiPriority="47"/>
-    <w:lsdException w:name="Grid Table 3 Accent 5" w:uiPriority="48"/>
-    <w:lsdException w:name="Grid Table 4 Accent 5" w:uiPriority="49"/>
-    <w:lsdException w:name="Grid Table 5 Dark Accent 5" w:uiPriority="50"/>
-    <w:lsdException w:name="Grid Table 6 Colorful Accent 5" w:uiPriority="51"/>
-    <w:lsdException w:name="Grid Table 7 Colorful Accent 5" w:uiPriority="52"/>
-    <w:lsdException w:name="Grid Table 1 Light Accent 6" w:uiPriority="46"/>
-    <w:lsdException w:name="Grid Table 2 Accent 6" w:uiPriority="47"/>
-    <w:lsdException w:name="Grid Table 3 Accent 6" w:uiPriority="48"/>
-    <w:lsdException w:name="Grid Table 4 Accent 6" w:uiPriority="49"/>
-    <w:lsdException w:name="Grid Table 5 Dark Accent 6" w:uiPriority="50"/>
-    <w:lsdException w:name="Grid Table 6 Colorful Accent 6" w:uiPriority="51"/>
-    <w:lsdException w:name="Grid Table 7 Colorful Accent 6" w:uiPriority="52"/>
-    <w:lsdException w:name="List Table 1 Light" w:uiPriority="46"/>
-    <w:lsdException w:name="List Table 2" w:uiPriority="47"/>
-    <w:lsdException w:name="List Table 3" w:uiPriority="48"/>
-    <w:lsdException w:name="List Table 4" w:uiPriority="49"/>
-    <w:lsdException w:name="List Table 5 Dark" w:uiPriority="50"/>
-    <w:lsdException w:name="List Table 6 Colorful" w:uiPriority="51"/>
-    <w:lsdException w:name="List Table 7 Colorful" w:uiPriority="52"/>
-    <w:lsdException w:name="List Table 1 Light Accent 1" w:uiPriority="46"/>
-    <w:lsdException w:name="List Table 2 Accent 1" w:uiPriority="47"/>
-    <w:lsdException w:name="List Table 3 Accent 1" w:uiPriority="48"/>
-    <w:lsdException w:name="List Table 4 Accent 1" w:uiPriority="49"/>
-    <w:lsdException w:name="List Table 5 Dark Accent 1" w:uiPriority="50"/>
-    <w:lsdException w:name="List Table 6 Colorful Accent 1" w:uiPriority="51"/>
-    <w:lsdException w:name="List Table 7 Colorful Accent 1" w:uiPriority="52"/>
-    <w:lsdException w:name="List Table 1 Light Accent 2" w:uiPriority="46"/>
-    <w:lsdException w:name="List Table 2 Accent 2" w:uiPriority="47"/>
-    <w:lsdException w:name="List Table 3 Accent 2" w:uiPriority="48"/>
-    <w:lsdException w:name="List Table 4 Accent 2" w:uiPriority="49"/>
-    <w:lsdException w:name="List Table 5 Dark Accent 2" w:uiPriority="50"/>
-    <w:lsdException w:name="List Table 6 Colorful Accent 2" w:uiPriority="51"/>
-    <w:lsdException w:name="List Table 7 Colorful Accent 2" w:uiPriority="52"/>
-    <w:lsdException w:name="List Table 1 Light Accent 3" w:uiPriority="46"/>
-    <w:lsdException w:name="List Table 2 Accent 3" w:uiPriority="47"/>
-    <w:lsdException w:name="List Table 3 Accent 3" w:uiPriority="48"/>
-    <w:lsdException w:name="List Table 4 Accent 3" w:uiPriority="49"/>
-    <w:lsdException w:name="List Table 5 Dark Accent 3" w:uiPriority="50"/>
-    <w:lsdException w:name="List Table 6 Colorful Accent 3" w:uiPriority="51"/>
-    <w:lsdException w:name="List Table 7 Colorful Accent 3" w:uiPriority="52"/>
-    <w:lsdException w:name="List Table 1 Light Accent 4" w:uiPriority="46"/>
-    <w:lsdException w:name="List Table 2 Accent 4" w:uiPriority="47"/>
-    <w:lsdException w:name="List Table 3 Accent 4" w:uiPriority="48"/>
-    <w:lsdException w:name="List Table 4 Accent 4" w:uiPriority="49"/>
-    <w:lsdException w:name="List Table 5 Dark Accent 4" w:uiPriority="50"/>
-    <w:lsdException w:name="List Table 6 Colorful Accent 4" w:uiPriority="51"/>
-    <w:lsdException w:name="List Table 7 Colorful Accent 4" w:uiPriority="52"/>
-    <w:lsdException w:name="List Table 1 Light Accent 5" w:uiPriority="46"/>
-    <w:lsdException w:name="List Table 2 Accent 5" w:uiPriority="47"/>
-    <w:lsdException w:name="List Table 3 Accent 5" w:uiPriority="48"/>
-    <w:lsdException w:name="List Table 4 Accent 5" w:uiPriority="49"/>
-    <w:lsdException w:name="List Table 5 Dark Accent 5" w:uiPriority="50"/>
-    <w:lsdException w:name="List Table 6 Colorful Accent 5" w:uiPriority="51"/>
-    <w:lsdException w:name="List Table 7 Colorful Accent 5" w:uiPriority="52"/>
-    <w:lsdException w:name="List Table 1 Light Accent 6" w:uiPriority="46"/>
-    <w:lsdException w:name="List Table 2 Accent 6" w:uiPriority="47"/>
-    <w:lsdException w:name="List Table 3 Accent 6" w:uiPriority="48"/>
-    <w:lsdException w:name="List Table 4 Accent 6" w:uiPriority="49"/>
-    <w:lsdException w:name="List Table 5 Dark Accent 6" w:uiPriority="50"/>
-    <w:lsdException w:name="List Table 6 Colorful Accent 6" w:uiPriority="51"/>
-    <w:lsdException w:name="List Table 7 Colorful Accent 6" w:uiPriority="52"/>
-    <w:lsdException w:name="Mention" w:semiHidden="1" w:unhideWhenUsed="1"/>
-    <w:lsdException w:name="Smart Hyperlink" w:semiHidden="1" w:unhideWhenUsed="1"/>
-    <w:lsdException w:name="Hashtag" w:semiHidden="1" w:unhideWhenUsed="1"/>
-    <w:lsdException w:name="Unresolved Mention" w:semiHidden="1" w:unhideWhenUsed="1"/>
-    <w:lsdException w:name="Smart Link" w:semiHidden="1" w:unhideWhenUsed="1"/>
+  <w:latentStyles w:count="260" w:defQFormat="0" w:defUnhideWhenUsed="1" w:defSemiHidden="1" w:defUIPriority="99" w:defLockedState="0">
+    <w:lsdException w:qFormat="1" w:unhideWhenUsed="0" w:uiPriority="0" w:semiHidden="0" w:name="Normal"/>
+    <w:lsdException w:qFormat="1" w:unhideWhenUsed="0" w:uiPriority="9" w:semiHidden="0" w:name="heading 1"/>
+    <w:lsdException w:qFormat="1" w:uiPriority="9" w:name="heading 2"/>
+    <w:lsdException w:qFormat="1" w:uiPriority="9" w:name="heading 3"/>
+    <w:lsdException w:qFormat="1" w:uiPriority="9" w:name="heading 4"/>
+    <w:lsdException w:qFormat="1" w:uiPriority="9" w:name="heading 5"/>
+    <w:lsdException w:qFormat="1" w:uiPriority="9" w:name="heading 6"/>
+    <w:lsdException w:qFormat="1" w:uiPriority="9" w:name="heading 7"/>
+    <w:lsdException w:qFormat="1" w:uiPriority="9" w:name="heading 8"/>
+    <w:lsdException w:qFormat="1" w:uiPriority="9" w:name="heading 9"/>
+    <w:lsdException w:uiPriority="99" w:name="index 1"/>
+    <w:lsdException w:uiPriority="99" w:name="index 2"/>
+    <w:lsdException w:uiPriority="99" w:name="index 3"/>
+    <w:lsdException w:uiPriority="99" w:name="index 4"/>
+    <w:lsdException w:uiPriority="99" w:name="index 5"/>
+    <w:lsdException w:uiPriority="99" w:name="index 6"/>
+    <w:lsdException w:uiPriority="99" w:name="index 7"/>
+    <w:lsdException w:uiPriority="99" w:name="index 8"/>
+    <w:lsdException w:uiPriority="99" w:name="index 9"/>
+    <w:lsdException w:uiPriority="39" w:name="toc 1"/>
+    <w:lsdException w:uiPriority="39" w:name="toc 2"/>
+    <w:lsdException w:uiPriority="39" w:name="toc 3"/>
+    <w:lsdException w:uiPriority="39" w:name="toc 4"/>
+    <w:lsdException w:uiPriority="39" w:name="toc 5"/>
+    <w:lsdException w:uiPriority="39" w:name="toc 6"/>
+    <w:lsdException w:uiPriority="39" w:name="toc 7"/>
+    <w:lsdException w:uiPriority="39" w:name="toc 8"/>
+    <w:lsdException w:uiPriority="39" w:name="toc 9"/>
+    <w:lsdException w:uiPriority="99" w:name="Normal Indent"/>
+    <w:lsdException w:uiPriority="99" w:name="footnote text"/>
+    <w:lsdException w:uiPriority="99" w:name="annotation text"/>
+    <w:lsdException w:qFormat="1" w:uiPriority="99" w:semiHidden="0" w:name="header"/>
+    <w:lsdException w:uiPriority="99" w:semiHidden="0" w:name="footer"/>
+    <w:lsdException w:uiPriority="99" w:name="index heading"/>
+    <w:lsdException w:qFormat="1" w:uiPriority="35" w:name="caption"/>
+    <w:lsdException w:uiPriority="99" w:name="table of figures"/>
+    <w:lsdException w:uiPriority="99" w:name="envelope address"/>
+    <w:lsdException w:uiPriority="99" w:name="envelope return"/>
+    <w:lsdException w:uiPriority="99" w:name="footnote reference"/>
+    <w:lsdException w:uiPriority="99" w:name="annotation reference"/>
+    <w:lsdException w:uiPriority="99" w:name="line number"/>
+    <w:lsdException w:uiPriority="99" w:name="page number"/>
+    <w:lsdException w:uiPriority="99" w:name="endnote reference"/>
+    <w:lsdException w:uiPriority="99" w:name="endnote text"/>
+    <w:lsdException w:uiPriority="99" w:name="table of authorities"/>
+    <w:lsdException w:uiPriority="99" w:name="macro"/>
+    <w:lsdException w:uiPriority="99" w:name="toa heading"/>
+    <w:lsdException w:uiPriority="99" w:name="List"/>
+    <w:lsdException w:uiPriority="99" w:name="List Bullet"/>
+    <w:lsdException w:uiPriority="99" w:name="List Number"/>
+    <w:lsdException w:uiPriority="99" w:name="List 2"/>
+    <w:lsdException w:uiPriority="99" w:name="List 3"/>
+    <w:lsdException w:uiPriority="99" w:name="List 4"/>
+    <w:lsdException w:uiPriority="99" w:name="List 5"/>
+    <w:lsdException w:uiPriority="99" w:name="List Bullet 2"/>
+    <w:lsdException w:uiPriority="99" w:name="List Bullet 3"/>
+    <w:lsdException w:uiPriority="99" w:name="List Bullet 4"/>
+    <w:lsdException w:uiPriority="99" w:name="List Bullet 5"/>
+    <w:lsdException w:uiPriority="99" w:name="List Number 2"/>
+    <w:lsdException w:uiPriority="99" w:name="List Number 3"/>
+    <w:lsdException w:uiPriority="99" w:name="List Number 4"/>
+    <w:lsdException w:uiPriority="99" w:name="List Number 5"/>
+    <w:lsdException w:qFormat="1" w:unhideWhenUsed="0" w:uiPriority="10" w:semiHidden="0" w:name="Title"/>
+    <w:lsdException w:uiPriority="99" w:name="Closing"/>
+    <w:lsdException w:uiPriority="99" w:name="Signature"/>
+    <w:lsdException w:uiPriority="1" w:name="Default Paragraph Font"/>
+    <w:lsdException w:uiPriority="99" w:name="Body Text"/>
+    <w:lsdException w:uiPriority="99" w:name="Body Text Indent"/>
+    <w:lsdException w:uiPriority="99" w:name="List Continue"/>
+    <w:lsdException w:uiPriority="99" w:name="List Continue 2"/>
+    <w:lsdException w:uiPriority="99" w:name="List Continue 3"/>
+    <w:lsdException w:uiPriority="99" w:name="List Continue 4"/>
+    <w:lsdException w:uiPriority="99" w:name="List Continue 5"/>
+    <w:lsdException w:uiPriority="99" w:name="Message Header"/>
+    <w:lsdException w:qFormat="1" w:unhideWhenUsed="0" w:uiPriority="11" w:semiHidden="0" w:name="Subtitle"/>
+    <w:lsdException w:uiPriority="99" w:name="Salutation"/>
+    <w:lsdException w:uiPriority="99" w:name="Date"/>
+    <w:lsdException w:uiPriority="99" w:name="Body Text First Indent"/>
+    <w:lsdException w:uiPriority="99" w:name="Body Text First Indent 2"/>
+    <w:lsdException w:uiPriority="99" w:name="Note Heading"/>
+    <w:lsdException w:uiPriority="99" w:name="Body Text 2"/>
+    <w:lsdException w:uiPriority="99" w:name="Body Text 3"/>
+    <w:lsdException w:uiPriority="99" w:name="Body Text Indent 2"/>
+    <w:lsdException w:uiPriority="99" w:name="Body Text Indent 3"/>
+    <w:lsdException w:uiPriority="99" w:name="Block Text"/>
+    <w:lsdException w:uiPriority="99" w:semiHidden="0" w:name="Hyperlink"/>
+    <w:lsdException w:uiPriority="99" w:name="FollowedHyperlink"/>
+    <w:lsdException w:qFormat="1" w:unhideWhenUsed="0" w:uiPriority="22" w:semiHidden="0" w:name="Strong"/>
+    <w:lsdException w:qFormat="1" w:unhideWhenUsed="0" w:uiPriority="20" w:semiHidden="0" w:name="Emphasis"/>
+    <w:lsdException w:uiPriority="99" w:name="Document Map"/>
+    <w:lsdException w:uiPriority="99" w:name="Plain Text"/>
+    <w:lsdException w:uiPriority="99" w:name="E-mail Signature"/>
+    <w:lsdException w:uiPriority="99" w:name="Normal (Web)"/>
+    <w:lsdException w:uiPriority="99" w:name="HTML Acronym"/>
+    <w:lsdException w:uiPriority="99" w:name="HTML Address"/>
+    <w:lsdException w:uiPriority="99" w:name="HTML Cite"/>
+    <w:lsdException w:uiPriority="99" w:name="HTML Code"/>
+    <w:lsdException w:uiPriority="99" w:name="HTML Definition"/>
+    <w:lsdException w:uiPriority="99" w:name="HTML Keyboard"/>
+    <w:lsdException w:uiPriority="99" w:name="HTML Preformatted"/>
+    <w:lsdException w:uiPriority="99" w:name="HTML Sample"/>
+    <w:lsdException w:uiPriority="99" w:name="HTML Typewriter"/>
+    <w:lsdException w:uiPriority="99" w:name="HTML Variable"/>
+    <w:lsdException w:qFormat="1" w:uiPriority="99" w:name="Normal Table"/>
+    <w:lsdException w:uiPriority="99" w:name="annotation subject"/>
+    <w:lsdException w:uiPriority="99" w:name="Table Simple 1"/>
+    <w:lsdException w:uiPriority="99" w:name="Table Simple 2"/>
+    <w:lsdException w:uiPriority="99" w:name="Table Simple 3"/>
+    <w:lsdException w:uiPriority="99" w:name="Table Classic 1"/>
+    <w:lsdException w:uiPriority="99" w:name="Table Classic 2"/>
+    <w:lsdException w:uiPriority="99" w:name="Table Classic 3"/>
+    <w:lsdException w:uiPriority="99" w:name="Table Classic 4"/>
+    <w:lsdException w:uiPriority="99" w:name="Table Colorful 1"/>
+    <w:lsdException w:uiPriority="99" w:name="Table Colorful 2"/>
+    <w:lsdException w:uiPriority="99" w:name="Table Colorful 3"/>
+    <w:lsdException w:uiPriority="99" w:name="Table Columns 1"/>
+    <w:lsdException w:uiPriority="99" w:name="Table Columns 2"/>
+    <w:lsdException w:uiPriority="99" w:name="Table Columns 3"/>
+    <w:lsdException w:uiPriority="99" w:name="Table Columns 4"/>
+    <w:lsdException w:uiPriority="99" w:name="Table Columns 5"/>
+    <w:lsdException w:uiPriority="99" w:name="Table Grid 1"/>
+    <w:lsdException w:uiPriority="99" w:name="Table Grid 2"/>
+    <w:lsdException w:uiPriority="99" w:name="Table Grid 3"/>
+    <w:lsdException w:uiPriority="99" w:name="Table Grid 4"/>
+    <w:lsdException w:uiPriority="99" w:name="Table Grid 5"/>
+    <w:lsdException w:uiPriority="99" w:name="Table Grid 6"/>
+    <w:lsdException w:uiPriority="99" w:name="Table Grid 7"/>
+    <w:lsdException w:uiPriority="99" w:name="Table Grid 8"/>
+    <w:lsdException w:uiPriority="99" w:name="Table List 1"/>
+    <w:lsdException w:uiPriority="99" w:name="Table List 2"/>
+    <w:lsdException w:uiPriority="99" w:name="Table List 3"/>
+    <w:lsdException w:uiPriority="99" w:name="Table List 4"/>
+    <w:lsdException w:uiPriority="99" w:name="Table List 5"/>
+    <w:lsdException w:uiPriority="99" w:name="Table List 6"/>
+    <w:lsdException w:uiPriority="99" w:name="Table List 7"/>
+    <w:lsdException w:uiPriority="99" w:name="Table List 8"/>
+    <w:lsdException w:uiPriority="99" w:name="Table 3D effects 1"/>
+    <w:lsdException w:uiPriority="99" w:name="Table 3D effects 2"/>
+    <w:lsdException w:uiPriority="99" w:name="Table 3D effects 3"/>
+    <w:lsdException w:uiPriority="99" w:name="Table Contemporary"/>
+    <w:lsdException w:uiPriority="99" w:name="Table Elegant"/>
+    <w:lsdException w:uiPriority="99" w:name="Table Professional"/>
+    <w:lsdException w:uiPriority="99" w:name="Table Subtle 1"/>
+    <w:lsdException w:uiPriority="99" w:name="Table Subtle 2"/>
+    <w:lsdException w:uiPriority="99" w:name="Table Web 1"/>
+    <w:lsdException w:uiPriority="99" w:name="Table Web 2"/>
+    <w:lsdException w:uiPriority="99" w:name="Table Web 3"/>
+    <w:lsdException w:uiPriority="99" w:name="Balloon Text"/>
+    <w:lsdException w:unhideWhenUsed="0" w:uiPriority="39" w:semiHidden="0" w:name="Table Grid"/>
+    <w:lsdException w:uiPriority="99" w:name="Table Theme"/>
+    <w:lsdException w:unhideWhenUsed="0" w:uiPriority="60" w:semiHidden="0" w:name="Light Shading"/>
+    <w:lsdException w:unhideWhenUsed="0" w:uiPriority="61" w:semiHidden="0" w:name="Light List"/>
+    <w:lsdException w:unhideWhenUsed="0" w:uiPriority="62" w:semiHidden="0" w:name="Light Grid"/>
+    <w:lsdException w:unhideWhenUsed="0" w:uiPriority="63" w:semiHidden="0" w:name="Medium Shading 1"/>
+    <w:lsdException w:unhideWhenUsed="0" w:uiPriority="64" w:semiHidden="0" w:name="Medium Shading 2"/>
+    <w:lsdException w:unhideWhenUsed="0" w:uiPriority="65" w:semiHidden="0" w:name="Medium List 1"/>
+    <w:lsdException w:unhideWhenUsed="0" w:uiPriority="66" w:semiHidden="0" w:name="Medium List 2"/>
+    <w:lsdException w:unhideWhenUsed="0" w:uiPriority="67" w:semiHidden="0" w:name="Medium Grid 1"/>
+    <w:lsdException w:unhideWhenUsed="0" w:uiPriority="68" w:semiHidden="0" w:name="Medium Grid 2"/>
+    <w:lsdException w:unhideWhenUsed="0" w:uiPriority="69" w:semiHidden="0" w:name="Medium Grid 3"/>
+    <w:lsdException w:unhideWhenUsed="0" w:uiPriority="70" w:semiHidden="0" w:name="Dark List"/>
+    <w:lsdException w:unhideWhenUsed="0" w:uiPriority="71" w:semiHidden="0" w:name="Colorful Shading"/>
+    <w:lsdException w:unhideWhenUsed="0" w:uiPriority="72" w:semiHidden="0" w:name="Colorful List"/>
+    <w:lsdException w:unhideWhenUsed="0" w:uiPriority="73" w:semiHidden="0" w:name="Colorful Grid"/>
+    <w:lsdException w:unhideWhenUsed="0" w:uiPriority="60" w:semiHidden="0" w:name="Light Shading Accent 1"/>
+    <w:lsdException w:unhideWhenUsed="0" w:uiPriority="61" w:semiHidden="0" w:name="Light List Accent 1"/>
+    <w:lsdException w:unhideWhenUsed="0" w:uiPriority="62" w:semiHidden="0" w:name="Light Grid Accent 1"/>
+    <w:lsdException w:unhideWhenUsed="0" w:uiPriority="63" w:semiHidden="0" w:name="Medium Shading 1 Accent 1"/>
+    <w:lsdException w:unhideWhenUsed="0" w:uiPriority="64" w:semiHidden="0" w:name="Medium Shading 2 Accent 1"/>
+    <w:lsdException w:unhideWhenUsed="0" w:uiPriority="65" w:semiHidden="0" w:name="Medium List 1 Accent 1"/>
+    <w:lsdException w:qFormat="1" w:unhideWhenUsed="0" w:uiPriority="34" w:semiHidden="0" w:name="List Paragraph"/>
+    <w:lsdException w:qFormat="1" w:unhideWhenUsed="0" w:uiPriority="29" w:semiHidden="0" w:name="Quote"/>
+    <w:lsdException w:qFormat="1" w:unhideWhenUsed="0" w:uiPriority="30" w:semiHidden="0" w:name="Intense Quote"/>
+    <w:lsdException w:unhideWhenUsed="0" w:uiPriority="66" w:semiHidden="0" w:name="Medium List 2 Accent 1"/>
+    <w:lsdException w:unhideWhenUsed="0" w:uiPriority="67" w:semiHidden="0" w:name="Medium Grid 1 Accent 1"/>
+    <w:lsdException w:unhideWhenUsed="0" w:uiPriority="68" w:semiHidden="0" w:name="Medium Grid 2 Accent 1"/>
+    <w:lsdException w:unhideWhenUsed="0" w:uiPriority="69" w:semiHidden="0" w:name="Medium Grid 3 Accent 1"/>
+    <w:lsdException w:unhideWhenUsed="0" w:uiPriority="70" w:semiHidden="0" w:name="Dark List Accent 1"/>
+    <w:lsdException w:unhideWhenUsed="0" w:uiPriority="71" w:semiHidden="0" w:name="Colorful Shading Accent 1"/>
+    <w:lsdException w:unhideWhenUsed="0" w:uiPriority="72" w:semiHidden="0" w:name="Colorful List Accent 1"/>
+    <w:lsdException w:unhideWhenUsed="0" w:uiPriority="73" w:semiHidden="0" w:name="Colorful Grid Accent 1"/>
+    <w:lsdException w:unhideWhenUsed="0" w:uiPriority="60" w:semiHidden="0" w:name="Light Shading Accent 2"/>
+    <w:lsdException w:unhideWhenUsed="0" w:uiPriority="61" w:semiHidden="0" w:name="Light List Accent 2"/>
+    <w:lsdException w:unhideWhenUsed="0" w:uiPriority="62" w:semiHidden="0" w:name="Light Grid Accent 2"/>
+    <w:lsdException w:unhideWhenUsed="0" w:uiPriority="63" w:semiHidden="0" w:name="Medium Shading 1 Accent 2"/>
+    <w:lsdException w:unhideWhenUsed="0" w:uiPriority="64" w:semiHidden="0" w:name="Medium Shading 2 Accent 2"/>
+    <w:lsdException w:unhideWhenUsed="0" w:uiPriority="65" w:semiHidden="0" w:name="Medium List 1 Accent 2"/>
+    <w:lsdException w:unhideWhenUsed="0" w:uiPriority="66" w:semiHidden="0" w:name="Medium List 2 Accent 2"/>
+    <w:lsdException w:unhideWhenUsed="0" w:uiPriority="67" w:semiHidden="0" w:name="Medium Grid 1 Accent 2"/>
+    <w:lsdException w:unhideWhenUsed="0" w:uiPriority="68" w:semiHidden="0" w:name="Medium Grid 2 Accent 2"/>
+    <w:lsdException w:unhideWhenUsed="0" w:uiPriority="69" w:semiHidden="0" w:name="Medium Grid 3 Accent 2"/>
+    <w:lsdException w:unhideWhenUsed="0" w:uiPriority="70" w:semiHidden="0" w:name="Dark List Accent 2"/>
+    <w:lsdException w:unhideWhenUsed="0" w:uiPriority="71" w:semiHidden="0" w:name="Colorful Shading Accent 2"/>
+    <w:lsdException w:unhideWhenUsed="0" w:uiPriority="72" w:semiHidden="0" w:name="Colorful List Accent 2"/>
+    <w:lsdException w:unhideWhenUsed="0" w:uiPriority="73" w:semiHidden="0" w:name="Colorful Grid Accent 2"/>
+    <w:lsdException w:unhideWhenUsed="0" w:uiPriority="60" w:semiHidden="0" w:name="Light Shading Accent 3"/>
+    <w:lsdException w:unhideWhenUsed="0" w:uiPriority="61" w:semiHidden="0" w:name="Light List Accent 3"/>
+    <w:lsdException w:unhideWhenUsed="0" w:uiPriority="62" w:semiHidden="0" w:name="Light Grid Accent 3"/>
+    <w:lsdException w:unhideWhenUsed="0" w:uiPriority="63" w:semiHidden="0" w:name="Medium Shading 1 Accent 3"/>
+    <w:lsdException w:unhideWhenUsed="0" w:uiPriority="64" w:semiHidden="0" w:name="Medium Shading 2 Accent 3"/>
+    <w:lsdException w:unhideWhenUsed="0" w:uiPriority="65" w:semiHidden="0" w:name="Medium List 1 Accent 3"/>
+    <w:lsdException w:unhideWhenUsed="0" w:uiPriority="66" w:semiHidden="0" w:name="Medium List 2 Accent 3"/>
+    <w:lsdException w:unhideWhenUsed="0" w:uiPriority="67" w:semiHidden="0" w:name="Medium Grid 1 Accent 3"/>
+    <w:lsdException w:unhideWhenUsed="0" w:uiPriority="68" w:semiHidden="0" w:name="Medium Grid 2 Accent 3"/>
+    <w:lsdException w:unhideWhenUsed="0" w:uiPriority="69" w:semiHidden="0" w:name="Medium Grid 3 Accent 3"/>
+    <w:lsdException w:unhideWhenUsed="0" w:uiPriority="70" w:semiHidden="0" w:name="Dark List Accent 3"/>
+    <w:lsdException w:unhideWhenUsed="0" w:uiPriority="71" w:semiHidden="0" w:name="Colorful Shading Accent 3"/>
+    <w:lsdException w:unhideWhenUsed="0" w:uiPriority="72" w:semiHidden="0" w:name="Colorful List Accent 3"/>
+    <w:lsdException w:unhideWhenUsed="0" w:uiPriority="73" w:semiHidden="0" w:name="Colorful Grid Accent 3"/>
+    <w:lsdException w:unhideWhenUsed="0" w:uiPriority="60" w:semiHidden="0" w:name="Light Shading Accent 4"/>
+    <w:lsdException w:unhideWhenUsed="0" w:uiPriority="61" w:semiHidden="0" w:name="Light List Accent 4"/>
+    <w:lsdException w:unhideWhenUsed="0" w:uiPriority="62" w:semiHidden="0" w:name="Light Grid Accent 4"/>
+    <w:lsdException w:unhideWhenUsed="0" w:uiPriority="63" w:semiHidden="0" w:name="Medium Shading 1 Accent 4"/>
+    <w:lsdException w:unhideWhenUsed="0" w:uiPriority="64" w:semiHidden="0" w:name="Medium Shading 2 Accent 4"/>
+    <w:lsdException w:unhideWhenUsed="0" w:uiPriority="65" w:semiHidden="0" w:name="Medium List 1 Accent 4"/>
+    <w:lsdException w:unhideWhenUsed="0" w:uiPriority="66" w:semiHidden="0" w:name="Medium List 2 Accent 4"/>
+    <w:lsdException w:unhideWhenUsed="0" w:uiPriority="67" w:semiHidden="0" w:name="Medium Grid 1 Accent 4"/>
+    <w:lsdException w:unhideWhenUsed="0" w:uiPriority="68" w:semiHidden="0" w:name="Medium Grid 2 Accent 4"/>
+    <w:lsdException w:unhideWhenUsed="0" w:uiPriority="69" w:semiHidden="0" w:name="Medium Grid 3 Accent 4"/>
+    <w:lsdException w:unhideWhenUsed="0" w:uiPriority="70" w:semiHidden="0" w:name="Dark List Accent 4"/>
+    <w:lsdException w:unhideWhenUsed="0" w:uiPriority="71" w:semiHidden="0" w:name="Colorful Shading Accent 4"/>
+    <w:lsdException w:unhideWhenUsed="0" w:uiPriority="72" w:semiHidden="0" w:name="Colorful List Accent 4"/>
+    <w:lsdException w:unhideWhenUsed="0" w:uiPriority="73" w:semiHidden="0" w:name="Colorful Grid Accent 4"/>
+    <w:lsdException w:unhideWhenUsed="0" w:uiPriority="60" w:semiHidden="0" w:name="Light Shading Accent 5"/>
+    <w:lsdException w:unhideWhenUsed="0" w:uiPriority="61" w:semiHidden="0" w:name="Light List Accent 5"/>
+    <w:lsdException w:unhideWhenUsed="0" w:uiPriority="62" w:semiHidden="0" w:name="Light Grid Accent 5"/>
+    <w:lsdException w:unhideWhenUsed="0" w:uiPriority="63" w:semiHidden="0" w:name="Medium Shading 1 Accent 5"/>
+    <w:lsdException w:unhideWhenUsed="0" w:uiPriority="64" w:semiHidden="0" w:name="Medium Shading 2 Accent 5"/>
+    <w:lsdException w:unhideWhenUsed="0" w:uiPriority="65" w:semiHidden="0" w:name="Medium List 1 Accent 5"/>
+    <w:lsdException w:unhideWhenUsed="0" w:uiPriority="66" w:semiHidden="0" w:name="Medium List 2 Accent 5"/>
+    <w:lsdException w:unhideWhenUsed="0" w:uiPriority="67" w:semiHidden="0" w:name="Medium Grid 1 Accent 5"/>
+    <w:lsdException w:unhideWhenUsed="0" w:uiPriority="68" w:semiHidden="0" w:name="Medium Grid 2 Accent 5"/>
+    <w:lsdException w:unhideWhenUsed="0" w:uiPriority="69" w:semiHidden="0" w:name="Medium Grid 3 Accent 5"/>
+    <w:lsdException w:unhideWhenUsed="0" w:uiPriority="70" w:semiHidden="0" w:name="Dark List Accent 5"/>
+    <w:lsdException w:unhideWhenUsed="0" w:uiPriority="71" w:semiHidden="0" w:name="Colorful Shading Accent 5"/>
+    <w:lsdException w:unhideWhenUsed="0" w:uiPriority="72" w:semiHidden="0" w:name="Colorful List Accent 5"/>
+    <w:lsdException w:unhideWhenUsed="0" w:uiPriority="73" w:semiHidden="0" w:name="Colorful Grid Accent 5"/>
+    <w:lsdException w:unhideWhenUsed="0" w:uiPriority="60" w:semiHidden="0" w:name="Light Shading Accent 6"/>
+    <w:lsdException w:unhideWhenUsed="0" w:uiPriority="61" w:semiHidden="0" w:name="Light List Accent 6"/>
+    <w:lsdException w:unhideWhenUsed="0" w:uiPriority="62" w:semiHidden="0" w:name="Light Grid Accent 6"/>
+    <w:lsdException w:unhideWhenUsed="0" w:uiPriority="63" w:semiHidden="0" w:name="Medium Shading 1 Accent 6"/>
+    <w:lsdException w:unhideWhenUsed="0" w:uiPriority="64" w:semiHidden="0" w:name="Medium Shading 2 Accent 6"/>
+    <w:lsdException w:unhideWhenUsed="0" w:uiPriority="65" w:semiHidden="0" w:name="Medium List 1 Accent 6"/>
+    <w:lsdException w:unhideWhenUsed="0" w:uiPriority="66" w:semiHidden="0" w:name="Medium List 2 Accent 6"/>
+    <w:lsdException w:unhideWhenUsed="0" w:uiPriority="67" w:semiHidden="0" w:name="Medium Grid 1 Accent 6"/>
+    <w:lsdException w:unhideWhenUsed="0" w:uiPriority="68" w:semiHidden="0" w:name="Medium Grid 2 Accent 6"/>
+    <w:lsdException w:unhideWhenUsed="0" w:uiPriority="69" w:semiHidden="0" w:name="Medium Grid 3 Accent 6"/>
+    <w:lsdException w:unhideWhenUsed="0" w:uiPriority="70" w:semiHidden="0" w:name="Dark List Accent 6"/>
+    <w:lsdException w:unhideWhenUsed="0" w:uiPriority="71" w:semiHidden="0" w:name="Colorful Shading Accent 6"/>
+    <w:lsdException w:unhideWhenUsed="0" w:uiPriority="72" w:semiHidden="0" w:name="Colorful List Accent 6"/>
+    <w:lsdException w:unhideWhenUsed="0" w:uiPriority="73" w:semiHidden="0" w:name="Colorful Grid Accent 6"/>
   </w:latentStyles>
-  <w:style w:type="paragraph" w:default="1" w:styleId="Normal">
+  <w:style w:type="paragraph" w:default="1" w:styleId="1">
     <w:name w:val="Normal"/>
     <w:qFormat/>
-    <w:rsid w:val="0002196E"/>
+    <w:uiPriority w:val="0"/>
     <w:pPr>
-      <w:spacing w:line="259" w:lineRule="auto"/>
+      <w:spacing w:after="160" w:line="259" w:lineRule="auto"/>
     </w:pPr>
     <w:rPr>
+      <w:rFonts w:asciiTheme="minorHAnsi" w:hAnsiTheme="minorHAnsi" w:eastAsiaTheme="minorHAnsi" w:cstheme="minorBidi"/>
       <w:kern w:val="0"/>
       <w:sz w:val="22"/>
       <w:szCs w:val="22"/>
+      <w:lang w:val="en-US" w:eastAsia="en-US" w:bidi="ar-SA"/>
       <w14:ligatures w14:val="none"/>
     </w:rPr>
   </w:style>
-  <w:style w:type="paragraph" w:styleId="Heading1">
+  <w:style w:type="paragraph" w:styleId="2">
     <w:name w:val="heading 1"/>
-    <w:basedOn w:val="Normal"/>
-    <w:next w:val="Normal"/>
-    <w:link w:val="Heading1Char"/>
+    <w:basedOn w:val="1"/>
+    <w:next w:val="1"/>
+    <w:link w:val="18"/>
+    <w:qFormat/>
     <w:uiPriority w:val="9"/>
-    <w:qFormat/>
-    <w:rsid w:val="0002196E"/>
     <w:pPr>
       <w:keepNext/>
       <w:keepLines/>
@@ -3279,22 +2600,21 @@
       <w:outlineLvl w:val="0"/>
     </w:pPr>
     <w:rPr>
-      <w:rFonts w:asciiTheme="majorHAnsi" w:eastAsiaTheme="majorEastAsia" w:hAnsiTheme="majorHAnsi" w:cstheme="majorBidi"/>
-      <w:color w:val="0F4761" w:themeColor="accent1" w:themeShade="BF"/>
+      <w:rFonts w:asciiTheme="majorHAnsi" w:hAnsiTheme="majorHAnsi" w:eastAsiaTheme="majorEastAsia" w:cstheme="majorBidi"/>
+      <w:color w:val="104862" w:themeColor="accent1" w:themeShade="BF"/>
       <w:sz w:val="40"/>
       <w:szCs w:val="40"/>
     </w:rPr>
   </w:style>
-  <w:style w:type="paragraph" w:styleId="Heading2">
+  <w:style w:type="paragraph" w:styleId="3">
     <w:name w:val="heading 2"/>
-    <w:basedOn w:val="Normal"/>
-    <w:next w:val="Normal"/>
-    <w:link w:val="Heading2Char"/>
-    <w:uiPriority w:val="9"/>
+    <w:basedOn w:val="1"/>
+    <w:next w:val="1"/>
+    <w:link w:val="19"/>
     <w:semiHidden/>
     <w:unhideWhenUsed/>
     <w:qFormat/>
-    <w:rsid w:val="0002196E"/>
+    <w:uiPriority w:val="9"/>
     <w:pPr>
       <w:keepNext/>
       <w:keepLines/>
@@ -3302,22 +2622,21 @@
       <w:outlineLvl w:val="1"/>
     </w:pPr>
     <w:rPr>
-      <w:rFonts w:asciiTheme="majorHAnsi" w:eastAsiaTheme="majorEastAsia" w:hAnsiTheme="majorHAnsi" w:cstheme="majorBidi"/>
-      <w:color w:val="0F4761" w:themeColor="accent1" w:themeShade="BF"/>
+      <w:rFonts w:asciiTheme="majorHAnsi" w:hAnsiTheme="majorHAnsi" w:eastAsiaTheme="majorEastAsia" w:cstheme="majorBidi"/>
+      <w:color w:val="104862" w:themeColor="accent1" w:themeShade="BF"/>
       <w:sz w:val="32"/>
       <w:szCs w:val="32"/>
     </w:rPr>
   </w:style>
-  <w:style w:type="paragraph" w:styleId="Heading3">
+  <w:style w:type="paragraph" w:styleId="4">
     <w:name w:val="heading 3"/>
-    <w:basedOn w:val="Normal"/>
-    <w:next w:val="Normal"/>
-    <w:link w:val="Heading3Char"/>
-    <w:uiPriority w:val="9"/>
+    <w:basedOn w:val="1"/>
+    <w:next w:val="1"/>
+    <w:link w:val="20"/>
     <w:semiHidden/>
     <w:unhideWhenUsed/>
     <w:qFormat/>
-    <w:rsid w:val="0002196E"/>
+    <w:uiPriority w:val="9"/>
     <w:pPr>
       <w:keepNext/>
       <w:keepLines/>
@@ -3326,21 +2645,20 @@
     </w:pPr>
     <w:rPr>
       <w:rFonts w:eastAsiaTheme="majorEastAsia" w:cstheme="majorBidi"/>
-      <w:color w:val="0F4761" w:themeColor="accent1" w:themeShade="BF"/>
+      <w:color w:val="104862" w:themeColor="accent1" w:themeShade="BF"/>
       <w:sz w:val="28"/>
       <w:szCs w:val="28"/>
     </w:rPr>
   </w:style>
-  <w:style w:type="paragraph" w:styleId="Heading4">
+  <w:style w:type="paragraph" w:styleId="5">
     <w:name w:val="heading 4"/>
-    <w:basedOn w:val="Normal"/>
-    <w:next w:val="Normal"/>
-    <w:link w:val="Heading4Char"/>
-    <w:uiPriority w:val="9"/>
+    <w:basedOn w:val="1"/>
+    <w:next w:val="1"/>
+    <w:link w:val="21"/>
     <w:semiHidden/>
     <w:unhideWhenUsed/>
     <w:qFormat/>
-    <w:rsid w:val="0002196E"/>
+    <w:uiPriority w:val="9"/>
     <w:pPr>
       <w:keepNext/>
       <w:keepLines/>
@@ -3351,19 +2669,18 @@
       <w:rFonts w:eastAsiaTheme="majorEastAsia" w:cstheme="majorBidi"/>
       <w:i/>
       <w:iCs/>
-      <w:color w:val="0F4761" w:themeColor="accent1" w:themeShade="BF"/>
+      <w:color w:val="104862" w:themeColor="accent1" w:themeShade="BF"/>
     </w:rPr>
   </w:style>
-  <w:style w:type="paragraph" w:styleId="Heading5">
+  <w:style w:type="paragraph" w:styleId="6">
     <w:name w:val="heading 5"/>
-    <w:basedOn w:val="Normal"/>
-    <w:next w:val="Normal"/>
-    <w:link w:val="Heading5Char"/>
-    <w:uiPriority w:val="9"/>
+    <w:basedOn w:val="1"/>
+    <w:next w:val="1"/>
+    <w:link w:val="22"/>
     <w:semiHidden/>
     <w:unhideWhenUsed/>
     <w:qFormat/>
-    <w:rsid w:val="0002196E"/>
+    <w:uiPriority w:val="9"/>
     <w:pPr>
       <w:keepNext/>
       <w:keepLines/>
@@ -3372,19 +2689,18 @@
     </w:pPr>
     <w:rPr>
       <w:rFonts w:eastAsiaTheme="majorEastAsia" w:cstheme="majorBidi"/>
-      <w:color w:val="0F4761" w:themeColor="accent1" w:themeShade="BF"/>
+      <w:color w:val="104862" w:themeColor="accent1" w:themeShade="BF"/>
     </w:rPr>
   </w:style>
-  <w:style w:type="paragraph" w:styleId="Heading6">
+  <w:style w:type="paragraph" w:styleId="7">
     <w:name w:val="heading 6"/>
-    <w:basedOn w:val="Normal"/>
-    <w:next w:val="Normal"/>
-    <w:link w:val="Heading6Char"/>
-    <w:uiPriority w:val="9"/>
+    <w:basedOn w:val="1"/>
+    <w:next w:val="1"/>
+    <w:link w:val="23"/>
     <w:semiHidden/>
     <w:unhideWhenUsed/>
     <w:qFormat/>
-    <w:rsid w:val="0002196E"/>
+    <w:uiPriority w:val="9"/>
     <w:pPr>
       <w:keepNext/>
       <w:keepLines/>
@@ -3396,18 +2712,25 @@
       <w:i/>
       <w:iCs/>
       <w:color w:val="595959" w:themeColor="text1" w:themeTint="A6"/>
+      <w14:textFill>
+        <w14:solidFill>
+          <w14:schemeClr w14:val="tx1">
+            <w14:lumMod w14:val="65000"/>
+            <w14:lumOff w14:val="35000"/>
+          </w14:schemeClr>
+        </w14:solidFill>
+      </w14:textFill>
     </w:rPr>
   </w:style>
-  <w:style w:type="paragraph" w:styleId="Heading7">
+  <w:style w:type="paragraph" w:styleId="8">
     <w:name w:val="heading 7"/>
-    <w:basedOn w:val="Normal"/>
-    <w:next w:val="Normal"/>
-    <w:link w:val="Heading7Char"/>
-    <w:uiPriority w:val="9"/>
+    <w:basedOn w:val="1"/>
+    <w:next w:val="1"/>
+    <w:link w:val="24"/>
     <w:semiHidden/>
     <w:unhideWhenUsed/>
     <w:qFormat/>
-    <w:rsid w:val="0002196E"/>
+    <w:uiPriority w:val="9"/>
     <w:pPr>
       <w:keepNext/>
       <w:keepLines/>
@@ -3417,18 +2740,25 @@
     <w:rPr>
       <w:rFonts w:eastAsiaTheme="majorEastAsia" w:cstheme="majorBidi"/>
       <w:color w:val="595959" w:themeColor="text1" w:themeTint="A6"/>
+      <w14:textFill>
+        <w14:solidFill>
+          <w14:schemeClr w14:val="tx1">
+            <w14:lumMod w14:val="65000"/>
+            <w14:lumOff w14:val="35000"/>
+          </w14:schemeClr>
+        </w14:solidFill>
+      </w14:textFill>
     </w:rPr>
   </w:style>
-  <w:style w:type="paragraph" w:styleId="Heading8">
+  <w:style w:type="paragraph" w:styleId="9">
     <w:name w:val="heading 8"/>
-    <w:basedOn w:val="Normal"/>
-    <w:next w:val="Normal"/>
-    <w:link w:val="Heading8Char"/>
-    <w:uiPriority w:val="9"/>
+    <w:basedOn w:val="1"/>
+    <w:next w:val="1"/>
+    <w:link w:val="25"/>
     <w:semiHidden/>
     <w:unhideWhenUsed/>
     <w:qFormat/>
-    <w:rsid w:val="0002196E"/>
+    <w:uiPriority w:val="9"/>
     <w:pPr>
       <w:keepNext/>
       <w:keepLines/>
@@ -3439,19 +2769,26 @@
       <w:rFonts w:eastAsiaTheme="majorEastAsia" w:cstheme="majorBidi"/>
       <w:i/>
       <w:iCs/>
-      <w:color w:val="272727" w:themeColor="text1" w:themeTint="D8"/>
+      <w:color w:val="262626" w:themeColor="text1" w:themeTint="D9"/>
+      <w14:textFill>
+        <w14:solidFill>
+          <w14:schemeClr w14:val="tx1">
+            <w14:lumMod w14:val="85000"/>
+            <w14:lumOff w14:val="15000"/>
+          </w14:schemeClr>
+        </w14:solidFill>
+      </w14:textFill>
     </w:rPr>
   </w:style>
-  <w:style w:type="paragraph" w:styleId="Heading9">
+  <w:style w:type="paragraph" w:styleId="10">
     <w:name w:val="heading 9"/>
-    <w:basedOn w:val="Normal"/>
-    <w:next w:val="Normal"/>
-    <w:link w:val="Heading9Char"/>
-    <w:uiPriority w:val="9"/>
+    <w:basedOn w:val="1"/>
+    <w:next w:val="1"/>
+    <w:link w:val="26"/>
     <w:semiHidden/>
     <w:unhideWhenUsed/>
     <w:qFormat/>
-    <w:rsid w:val="0002196E"/>
+    <w:uiPriority w:val="9"/>
     <w:pPr>
       <w:keepNext/>
       <w:keepLines/>
@@ -3460,22 +2797,30 @@
     </w:pPr>
     <w:rPr>
       <w:rFonts w:eastAsiaTheme="majorEastAsia" w:cstheme="majorBidi"/>
-      <w:color w:val="272727" w:themeColor="text1" w:themeTint="D8"/>
+      <w:color w:val="262626" w:themeColor="text1" w:themeTint="D9"/>
+      <w14:textFill>
+        <w14:solidFill>
+          <w14:schemeClr w14:val="tx1">
+            <w14:lumMod w14:val="85000"/>
+            <w14:lumOff w14:val="15000"/>
+          </w14:schemeClr>
+        </w14:solidFill>
+      </w14:textFill>
     </w:rPr>
   </w:style>
-  <w:style w:type="character" w:default="1" w:styleId="DefaultParagraphFont">
+  <w:style w:type="character" w:default="1" w:styleId="11">
     <w:name w:val="Default Paragraph Font"/>
-    <w:uiPriority w:val="1"/>
     <w:semiHidden/>
     <w:unhideWhenUsed/>
-  </w:style>
-  <w:style w:type="table" w:default="1" w:styleId="TableNormal">
+    <w:uiPriority w:val="1"/>
+  </w:style>
+  <w:style w:type="table" w:default="1" w:styleId="12">
     <w:name w:val="Normal Table"/>
-    <w:uiPriority w:val="99"/>
     <w:semiHidden/>
     <w:unhideWhenUsed/>
+    <w:qFormat/>
+    <w:uiPriority w:val="99"/>
     <w:tblPr>
-      <w:tblInd w:w="0" w:type="dxa"/>
       <w:tblCellMar>
         <w:top w:w="0" w:type="dxa"/>
         <w:left w:w="108" w:type="dxa"/>
@@ -3484,208 +2829,278 @@
       </w:tblCellMar>
     </w:tblPr>
   </w:style>
-  <w:style w:type="numbering" w:default="1" w:styleId="NoList">
-    <w:name w:val="No List"/>
+  <w:style w:type="paragraph" w:styleId="13">
+    <w:name w:val="footer"/>
+    <w:basedOn w:val="1"/>
+    <w:link w:val="37"/>
+    <w:unhideWhenUsed/>
     <w:uiPriority w:val="99"/>
-    <w:semiHidden/>
+    <w:pPr>
+      <w:tabs>
+        <w:tab w:val="center" w:pos="4680"/>
+        <w:tab w:val="right" w:pos="9360"/>
+      </w:tabs>
+      <w:spacing w:after="0" w:line="240" w:lineRule="auto"/>
+    </w:pPr>
+  </w:style>
+  <w:style w:type="paragraph" w:styleId="14">
+    <w:name w:val="header"/>
+    <w:basedOn w:val="1"/>
+    <w:link w:val="36"/>
     <w:unhideWhenUsed/>
-  </w:style>
-  <w:style w:type="character" w:customStyle="1" w:styleId="Heading1Char">
-    <w:name w:val="Heading 1 Char"/>
-    <w:basedOn w:val="DefaultParagraphFont"/>
-    <w:link w:val="Heading1"/>
-    <w:uiPriority w:val="9"/>
-    <w:rsid w:val="0002196E"/>
+    <w:qFormat/>
+    <w:uiPriority w:val="99"/>
+    <w:pPr>
+      <w:tabs>
+        <w:tab w:val="center" w:pos="4680"/>
+        <w:tab w:val="right" w:pos="9360"/>
+      </w:tabs>
+      <w:spacing w:after="0" w:line="240" w:lineRule="auto"/>
+    </w:pPr>
+  </w:style>
+  <w:style w:type="character" w:styleId="15">
+    <w:name w:val="Hyperlink"/>
+    <w:basedOn w:val="11"/>
+    <w:unhideWhenUsed/>
+    <w:uiPriority w:val="99"/>
     <w:rPr>
-      <w:rFonts w:asciiTheme="majorHAnsi" w:eastAsiaTheme="majorEastAsia" w:hAnsiTheme="majorHAnsi" w:cstheme="majorBidi"/>
-      <w:color w:val="0F4761" w:themeColor="accent1" w:themeShade="BF"/>
-      <w:sz w:val="40"/>
-      <w:szCs w:val="40"/>
+      <w:color w:val="0000FF"/>
+      <w:u w:val="single"/>
     </w:rPr>
   </w:style>
-  <w:style w:type="character" w:customStyle="1" w:styleId="Heading2Char">
-    <w:name w:val="Heading 2 Char"/>
-    <w:basedOn w:val="DefaultParagraphFont"/>
-    <w:link w:val="Heading2"/>
-    <w:uiPriority w:val="9"/>
-    <w:semiHidden/>
-    <w:rsid w:val="0002196E"/>
-    <w:rPr>
-      <w:rFonts w:asciiTheme="majorHAnsi" w:eastAsiaTheme="majorEastAsia" w:hAnsiTheme="majorHAnsi" w:cstheme="majorBidi"/>
-      <w:color w:val="0F4761" w:themeColor="accent1" w:themeShade="BF"/>
-      <w:sz w:val="32"/>
-      <w:szCs w:val="32"/>
-    </w:rPr>
-  </w:style>
-  <w:style w:type="character" w:customStyle="1" w:styleId="Heading3Char">
-    <w:name w:val="Heading 3 Char"/>
-    <w:basedOn w:val="DefaultParagraphFont"/>
-    <w:link w:val="Heading3"/>
-    <w:uiPriority w:val="9"/>
-    <w:semiHidden/>
-    <w:rsid w:val="0002196E"/>
-    <w:rPr>
-      <w:rFonts w:eastAsiaTheme="majorEastAsia" w:cstheme="majorBidi"/>
-      <w:color w:val="0F4761" w:themeColor="accent1" w:themeShade="BF"/>
-      <w:sz w:val="28"/>
-      <w:szCs w:val="28"/>
-    </w:rPr>
-  </w:style>
-  <w:style w:type="character" w:customStyle="1" w:styleId="Heading4Char">
-    <w:name w:val="Heading 4 Char"/>
-    <w:basedOn w:val="DefaultParagraphFont"/>
-    <w:link w:val="Heading4"/>
-    <w:uiPriority w:val="9"/>
-    <w:semiHidden/>
-    <w:rsid w:val="0002196E"/>
-    <w:rPr>
-      <w:rFonts w:eastAsiaTheme="majorEastAsia" w:cstheme="majorBidi"/>
-      <w:i/>
-      <w:iCs/>
-      <w:color w:val="0F4761" w:themeColor="accent1" w:themeShade="BF"/>
-    </w:rPr>
-  </w:style>
-  <w:style w:type="character" w:customStyle="1" w:styleId="Heading5Char">
-    <w:name w:val="Heading 5 Char"/>
-    <w:basedOn w:val="DefaultParagraphFont"/>
-    <w:link w:val="Heading5"/>
-    <w:uiPriority w:val="9"/>
-    <w:semiHidden/>
-    <w:rsid w:val="0002196E"/>
-    <w:rPr>
-      <w:rFonts w:eastAsiaTheme="majorEastAsia" w:cstheme="majorBidi"/>
-      <w:color w:val="0F4761" w:themeColor="accent1" w:themeShade="BF"/>
-    </w:rPr>
-  </w:style>
-  <w:style w:type="character" w:customStyle="1" w:styleId="Heading6Char">
-    <w:name w:val="Heading 6 Char"/>
-    <w:basedOn w:val="DefaultParagraphFont"/>
-    <w:link w:val="Heading6"/>
-    <w:uiPriority w:val="9"/>
-    <w:semiHidden/>
-    <w:rsid w:val="0002196E"/>
-    <w:rPr>
-      <w:rFonts w:eastAsiaTheme="majorEastAsia" w:cstheme="majorBidi"/>
-      <w:i/>
-      <w:iCs/>
-      <w:color w:val="595959" w:themeColor="text1" w:themeTint="A6"/>
-    </w:rPr>
-  </w:style>
-  <w:style w:type="character" w:customStyle="1" w:styleId="Heading7Char">
-    <w:name w:val="Heading 7 Char"/>
-    <w:basedOn w:val="DefaultParagraphFont"/>
-    <w:link w:val="Heading7"/>
-    <w:uiPriority w:val="9"/>
-    <w:semiHidden/>
-    <w:rsid w:val="0002196E"/>
-    <w:rPr>
-      <w:rFonts w:eastAsiaTheme="majorEastAsia" w:cstheme="majorBidi"/>
-      <w:color w:val="595959" w:themeColor="text1" w:themeTint="A6"/>
-    </w:rPr>
-  </w:style>
-  <w:style w:type="character" w:customStyle="1" w:styleId="Heading8Char">
-    <w:name w:val="Heading 8 Char"/>
-    <w:basedOn w:val="DefaultParagraphFont"/>
-    <w:link w:val="Heading8"/>
-    <w:uiPriority w:val="9"/>
-    <w:semiHidden/>
-    <w:rsid w:val="0002196E"/>
-    <w:rPr>
-      <w:rFonts w:eastAsiaTheme="majorEastAsia" w:cstheme="majorBidi"/>
-      <w:i/>
-      <w:iCs/>
-      <w:color w:val="272727" w:themeColor="text1" w:themeTint="D8"/>
-    </w:rPr>
-  </w:style>
-  <w:style w:type="character" w:customStyle="1" w:styleId="Heading9Char">
-    <w:name w:val="Heading 9 Char"/>
-    <w:basedOn w:val="DefaultParagraphFont"/>
-    <w:link w:val="Heading9"/>
-    <w:uiPriority w:val="9"/>
-    <w:semiHidden/>
-    <w:rsid w:val="0002196E"/>
-    <w:rPr>
-      <w:rFonts w:eastAsiaTheme="majorEastAsia" w:cstheme="majorBidi"/>
-      <w:color w:val="272727" w:themeColor="text1" w:themeTint="D8"/>
-    </w:rPr>
-  </w:style>
-  <w:style w:type="paragraph" w:styleId="Title">
-    <w:name w:val="Title"/>
-    <w:basedOn w:val="Normal"/>
-    <w:next w:val="Normal"/>
-    <w:link w:val="TitleChar"/>
-    <w:uiPriority w:val="10"/>
+  <w:style w:type="paragraph" w:styleId="16">
+    <w:name w:val="Subtitle"/>
+    <w:basedOn w:val="1"/>
+    <w:next w:val="1"/>
+    <w:link w:val="28"/>
     <w:qFormat/>
-    <w:rsid w:val="0002196E"/>
-    <w:pPr>
-      <w:spacing w:after="80" w:line="240" w:lineRule="auto"/>
-      <w:contextualSpacing/>
-    </w:pPr>
-    <w:rPr>
-      <w:rFonts w:asciiTheme="majorHAnsi" w:eastAsiaTheme="majorEastAsia" w:hAnsiTheme="majorHAnsi" w:cstheme="majorBidi"/>
-      <w:spacing w:val="-10"/>
-      <w:kern w:val="28"/>
-      <w:sz w:val="56"/>
-      <w:szCs w:val="56"/>
-    </w:rPr>
-  </w:style>
-  <w:style w:type="character" w:customStyle="1" w:styleId="TitleChar">
-    <w:name w:val="Title Char"/>
-    <w:basedOn w:val="DefaultParagraphFont"/>
-    <w:link w:val="Title"/>
-    <w:uiPriority w:val="10"/>
-    <w:rsid w:val="0002196E"/>
-    <w:rPr>
-      <w:rFonts w:asciiTheme="majorHAnsi" w:eastAsiaTheme="majorEastAsia" w:hAnsiTheme="majorHAnsi" w:cstheme="majorBidi"/>
-      <w:spacing w:val="-10"/>
-      <w:kern w:val="28"/>
-      <w:sz w:val="56"/>
-      <w:szCs w:val="56"/>
-    </w:rPr>
-  </w:style>
-  <w:style w:type="paragraph" w:styleId="Subtitle">
-    <w:name w:val="Subtitle"/>
-    <w:basedOn w:val="Normal"/>
-    <w:next w:val="Normal"/>
-    <w:link w:val="SubtitleChar"/>
     <w:uiPriority w:val="11"/>
-    <w:qFormat/>
-    <w:rsid w:val="0002196E"/>
-    <w:pPr>
-      <w:numPr>
-        <w:ilvl w:val="1"/>
-      </w:numPr>
-    </w:pPr>
     <w:rPr>
       <w:rFonts w:eastAsiaTheme="majorEastAsia" w:cstheme="majorBidi"/>
       <w:color w:val="595959" w:themeColor="text1" w:themeTint="A6"/>
       <w:spacing w:val="15"/>
       <w:sz w:val="28"/>
       <w:szCs w:val="28"/>
+      <w14:textFill>
+        <w14:solidFill>
+          <w14:schemeClr w14:val="tx1">
+            <w14:lumMod w14:val="65000"/>
+            <w14:lumOff w14:val="35000"/>
+          </w14:schemeClr>
+        </w14:solidFill>
+      </w14:textFill>
     </w:rPr>
   </w:style>
-  <w:style w:type="character" w:customStyle="1" w:styleId="SubtitleChar">
+  <w:style w:type="paragraph" w:styleId="17">
+    <w:name w:val="Title"/>
+    <w:basedOn w:val="1"/>
+    <w:next w:val="1"/>
+    <w:link w:val="27"/>
+    <w:qFormat/>
+    <w:uiPriority w:val="10"/>
+    <w:pPr>
+      <w:spacing w:after="80" w:line="240" w:lineRule="auto"/>
+      <w:contextualSpacing/>
+    </w:pPr>
+    <w:rPr>
+      <w:rFonts w:asciiTheme="majorHAnsi" w:hAnsiTheme="majorHAnsi" w:eastAsiaTheme="majorEastAsia" w:cstheme="majorBidi"/>
+      <w:spacing w:val="-10"/>
+      <w:kern w:val="28"/>
+      <w:sz w:val="56"/>
+      <w:szCs w:val="56"/>
+    </w:rPr>
+  </w:style>
+  <w:style w:type="character" w:customStyle="1" w:styleId="18">
+    <w:name w:val="Heading 1 Char"/>
+    <w:basedOn w:val="11"/>
+    <w:link w:val="2"/>
+    <w:qFormat/>
+    <w:uiPriority w:val="9"/>
+    <w:rPr>
+      <w:rFonts w:asciiTheme="majorHAnsi" w:hAnsiTheme="majorHAnsi" w:eastAsiaTheme="majorEastAsia" w:cstheme="majorBidi"/>
+      <w:color w:val="104862" w:themeColor="accent1" w:themeShade="BF"/>
+      <w:sz w:val="40"/>
+      <w:szCs w:val="40"/>
+    </w:rPr>
+  </w:style>
+  <w:style w:type="character" w:customStyle="1" w:styleId="19">
+    <w:name w:val="Heading 2 Char"/>
+    <w:basedOn w:val="11"/>
+    <w:link w:val="3"/>
+    <w:semiHidden/>
+    <w:uiPriority w:val="9"/>
+    <w:rPr>
+      <w:rFonts w:asciiTheme="majorHAnsi" w:hAnsiTheme="majorHAnsi" w:eastAsiaTheme="majorEastAsia" w:cstheme="majorBidi"/>
+      <w:color w:val="104862" w:themeColor="accent1" w:themeShade="BF"/>
+      <w:sz w:val="32"/>
+      <w:szCs w:val="32"/>
+    </w:rPr>
+  </w:style>
+  <w:style w:type="character" w:customStyle="1" w:styleId="20">
+    <w:name w:val="Heading 3 Char"/>
+    <w:basedOn w:val="11"/>
+    <w:link w:val="4"/>
+    <w:semiHidden/>
+    <w:qFormat/>
+    <w:uiPriority w:val="9"/>
+    <w:rPr>
+      <w:rFonts w:eastAsiaTheme="majorEastAsia" w:cstheme="majorBidi"/>
+      <w:color w:val="104862" w:themeColor="accent1" w:themeShade="BF"/>
+      <w:sz w:val="28"/>
+      <w:szCs w:val="28"/>
+    </w:rPr>
+  </w:style>
+  <w:style w:type="character" w:customStyle="1" w:styleId="21">
+    <w:name w:val="Heading 4 Char"/>
+    <w:basedOn w:val="11"/>
+    <w:link w:val="5"/>
+    <w:semiHidden/>
+    <w:qFormat/>
+    <w:uiPriority w:val="9"/>
+    <w:rPr>
+      <w:rFonts w:eastAsiaTheme="majorEastAsia" w:cstheme="majorBidi"/>
+      <w:i/>
+      <w:iCs/>
+      <w:color w:val="104862" w:themeColor="accent1" w:themeShade="BF"/>
+    </w:rPr>
+  </w:style>
+  <w:style w:type="character" w:customStyle="1" w:styleId="22">
+    <w:name w:val="Heading 5 Char"/>
+    <w:basedOn w:val="11"/>
+    <w:link w:val="6"/>
+    <w:semiHidden/>
+    <w:uiPriority w:val="9"/>
+    <w:rPr>
+      <w:rFonts w:eastAsiaTheme="majorEastAsia" w:cstheme="majorBidi"/>
+      <w:color w:val="104862" w:themeColor="accent1" w:themeShade="BF"/>
+    </w:rPr>
+  </w:style>
+  <w:style w:type="character" w:customStyle="1" w:styleId="23">
+    <w:name w:val="Heading 6 Char"/>
+    <w:basedOn w:val="11"/>
+    <w:link w:val="7"/>
+    <w:semiHidden/>
+    <w:uiPriority w:val="9"/>
+    <w:rPr>
+      <w:rFonts w:eastAsiaTheme="majorEastAsia" w:cstheme="majorBidi"/>
+      <w:i/>
+      <w:iCs/>
+      <w:color w:val="595959" w:themeColor="text1" w:themeTint="A6"/>
+      <w14:textFill>
+        <w14:solidFill>
+          <w14:schemeClr w14:val="tx1">
+            <w14:lumMod w14:val="65000"/>
+            <w14:lumOff w14:val="35000"/>
+          </w14:schemeClr>
+        </w14:solidFill>
+      </w14:textFill>
+    </w:rPr>
+  </w:style>
+  <w:style w:type="character" w:customStyle="1" w:styleId="24">
+    <w:name w:val="Heading 7 Char"/>
+    <w:basedOn w:val="11"/>
+    <w:link w:val="8"/>
+    <w:semiHidden/>
+    <w:qFormat/>
+    <w:uiPriority w:val="9"/>
+    <w:rPr>
+      <w:rFonts w:eastAsiaTheme="majorEastAsia" w:cstheme="majorBidi"/>
+      <w:color w:val="595959" w:themeColor="text1" w:themeTint="A6"/>
+      <w14:textFill>
+        <w14:solidFill>
+          <w14:schemeClr w14:val="tx1">
+            <w14:lumMod w14:val="65000"/>
+            <w14:lumOff w14:val="35000"/>
+          </w14:schemeClr>
+        </w14:solidFill>
+      </w14:textFill>
+    </w:rPr>
+  </w:style>
+  <w:style w:type="character" w:customStyle="1" w:styleId="25">
+    <w:name w:val="Heading 8 Char"/>
+    <w:basedOn w:val="11"/>
+    <w:link w:val="9"/>
+    <w:semiHidden/>
+    <w:qFormat/>
+    <w:uiPriority w:val="9"/>
+    <w:rPr>
+      <w:rFonts w:eastAsiaTheme="majorEastAsia" w:cstheme="majorBidi"/>
+      <w:i/>
+      <w:iCs/>
+      <w:color w:val="262626" w:themeColor="text1" w:themeTint="D9"/>
+      <w14:textFill>
+        <w14:solidFill>
+          <w14:schemeClr w14:val="tx1">
+            <w14:lumMod w14:val="85000"/>
+            <w14:lumOff w14:val="15000"/>
+          </w14:schemeClr>
+        </w14:solidFill>
+      </w14:textFill>
+    </w:rPr>
+  </w:style>
+  <w:style w:type="character" w:customStyle="1" w:styleId="26">
+    <w:name w:val="Heading 9 Char"/>
+    <w:basedOn w:val="11"/>
+    <w:link w:val="10"/>
+    <w:semiHidden/>
+    <w:qFormat/>
+    <w:uiPriority w:val="9"/>
+    <w:rPr>
+      <w:rFonts w:eastAsiaTheme="majorEastAsia" w:cstheme="majorBidi"/>
+      <w:color w:val="262626" w:themeColor="text1" w:themeTint="D9"/>
+      <w14:textFill>
+        <w14:solidFill>
+          <w14:schemeClr w14:val="tx1">
+            <w14:lumMod w14:val="85000"/>
+            <w14:lumOff w14:val="15000"/>
+          </w14:schemeClr>
+        </w14:solidFill>
+      </w14:textFill>
+    </w:rPr>
+  </w:style>
+  <w:style w:type="character" w:customStyle="1" w:styleId="27">
+    <w:name w:val="Title Char"/>
+    <w:basedOn w:val="11"/>
+    <w:link w:val="17"/>
+    <w:qFormat/>
+    <w:uiPriority w:val="10"/>
+    <w:rPr>
+      <w:rFonts w:asciiTheme="majorHAnsi" w:hAnsiTheme="majorHAnsi" w:eastAsiaTheme="majorEastAsia" w:cstheme="majorBidi"/>
+      <w:spacing w:val="-10"/>
+      <w:kern w:val="28"/>
+      <w:sz w:val="56"/>
+      <w:szCs w:val="56"/>
+    </w:rPr>
+  </w:style>
+  <w:style w:type="character" w:customStyle="1" w:styleId="28">
     <w:name w:val="Subtitle Char"/>
-    <w:basedOn w:val="DefaultParagraphFont"/>
-    <w:link w:val="Subtitle"/>
+    <w:basedOn w:val="11"/>
+    <w:link w:val="16"/>
+    <w:qFormat/>
     <w:uiPriority w:val="11"/>
-    <w:rsid w:val="0002196E"/>
     <w:rPr>
       <w:rFonts w:eastAsiaTheme="majorEastAsia" w:cstheme="majorBidi"/>
       <w:color w:val="595959" w:themeColor="text1" w:themeTint="A6"/>
       <w:spacing w:val="15"/>
       <w:sz w:val="28"/>
       <w:szCs w:val="28"/>
+      <w14:textFill>
+        <w14:solidFill>
+          <w14:schemeClr w14:val="tx1">
+            <w14:lumMod w14:val="65000"/>
+            <w14:lumOff w14:val="35000"/>
+          </w14:schemeClr>
+        </w14:solidFill>
+      </w14:textFill>
     </w:rPr>
   </w:style>
-  <w:style w:type="paragraph" w:styleId="Quote">
+  <w:style w:type="paragraph" w:styleId="29">
     <w:name w:val="Quote"/>
-    <w:basedOn w:val="Normal"/>
-    <w:next w:val="Normal"/>
-    <w:link w:val="QuoteChar"/>
+    <w:basedOn w:val="1"/>
+    <w:next w:val="1"/>
+    <w:link w:val="30"/>
+    <w:qFormat/>
     <w:uiPriority w:val="29"/>
-    <w:qFormat/>
-    <w:rsid w:val="0002196E"/>
     <w:pPr>
       <w:spacing w:before="160"/>
       <w:jc w:val="center"/>
@@ -3694,55 +3109,67 @@
       <w:i/>
       <w:iCs/>
       <w:color w:val="404040" w:themeColor="text1" w:themeTint="BF"/>
+      <w14:textFill>
+        <w14:solidFill>
+          <w14:schemeClr w14:val="tx1">
+            <w14:lumMod w14:val="75000"/>
+            <w14:lumOff w14:val="25000"/>
+          </w14:schemeClr>
+        </w14:solidFill>
+      </w14:textFill>
     </w:rPr>
   </w:style>
-  <w:style w:type="character" w:customStyle="1" w:styleId="QuoteChar">
+  <w:style w:type="character" w:customStyle="1" w:styleId="30">
     <w:name w:val="Quote Char"/>
-    <w:basedOn w:val="DefaultParagraphFont"/>
-    <w:link w:val="Quote"/>
+    <w:basedOn w:val="11"/>
+    <w:link w:val="29"/>
     <w:uiPriority w:val="29"/>
-    <w:rsid w:val="0002196E"/>
     <w:rPr>
       <w:i/>
       <w:iCs/>
       <w:color w:val="404040" w:themeColor="text1" w:themeTint="BF"/>
+      <w14:textFill>
+        <w14:solidFill>
+          <w14:schemeClr w14:val="tx1">
+            <w14:lumMod w14:val="75000"/>
+            <w14:lumOff w14:val="25000"/>
+          </w14:schemeClr>
+        </w14:solidFill>
+      </w14:textFill>
     </w:rPr>
   </w:style>
-  <w:style w:type="paragraph" w:styleId="ListParagraph">
+  <w:style w:type="paragraph" w:styleId="31">
     <w:name w:val="List Paragraph"/>
-    <w:basedOn w:val="Normal"/>
+    <w:basedOn w:val="1"/>
+    <w:qFormat/>
     <w:uiPriority w:val="34"/>
-    <w:qFormat/>
-    <w:rsid w:val="0002196E"/>
     <w:pPr>
       <w:ind w:left="720"/>
       <w:contextualSpacing/>
     </w:pPr>
   </w:style>
-  <w:style w:type="character" w:styleId="IntenseEmphasis">
+  <w:style w:type="character" w:customStyle="1" w:styleId="32">
     <w:name w:val="Intense Emphasis"/>
-    <w:basedOn w:val="DefaultParagraphFont"/>
+    <w:basedOn w:val="11"/>
+    <w:qFormat/>
     <w:uiPriority w:val="21"/>
-    <w:qFormat/>
-    <w:rsid w:val="0002196E"/>
     <w:rPr>
       <w:i/>
       <w:iCs/>
-      <w:color w:val="0F4761" w:themeColor="accent1" w:themeShade="BF"/>
+      <w:color w:val="104862" w:themeColor="accent1" w:themeShade="BF"/>
     </w:rPr>
   </w:style>
-  <w:style w:type="paragraph" w:styleId="IntenseQuote">
+  <w:style w:type="paragraph" w:styleId="33">
     <w:name w:val="Intense Quote"/>
-    <w:basedOn w:val="Normal"/>
-    <w:next w:val="Normal"/>
-    <w:link w:val="IntenseQuoteChar"/>
+    <w:basedOn w:val="1"/>
+    <w:next w:val="1"/>
+    <w:link w:val="34"/>
+    <w:qFormat/>
     <w:uiPriority w:val="30"/>
-    <w:qFormat/>
-    <w:rsid w:val="0002196E"/>
     <w:pPr>
       <w:pBdr>
-        <w:top w:val="single" w:sz="4" w:space="10" w:color="0F4761" w:themeColor="accent1" w:themeShade="BF"/>
-        <w:bottom w:val="single" w:sz="4" w:space="10" w:color="0F4761" w:themeColor="accent1" w:themeShade="BF"/>
+        <w:top w:val="single" w:color="0F4761" w:themeColor="accent1" w:themeShade="BF" w:sz="4" w:space="10"/>
+        <w:bottom w:val="single" w:color="0F4761" w:themeColor="accent1" w:themeShade="BF" w:sz="4" w:space="10"/>
       </w:pBdr>
       <w:spacing w:before="360" w:after="360"/>
       <w:ind w:left="864" w:right="864"/>
@@ -3751,56 +3178,39 @@
     <w:rPr>
       <w:i/>
       <w:iCs/>
-      <w:color w:val="0F4761" w:themeColor="accent1" w:themeShade="BF"/>
+      <w:color w:val="104862" w:themeColor="accent1" w:themeShade="BF"/>
     </w:rPr>
   </w:style>
-  <w:style w:type="character" w:customStyle="1" w:styleId="IntenseQuoteChar">
+  <w:style w:type="character" w:customStyle="1" w:styleId="34">
     <w:name w:val="Intense Quote Char"/>
-    <w:basedOn w:val="DefaultParagraphFont"/>
-    <w:link w:val="IntenseQuote"/>
+    <w:basedOn w:val="11"/>
+    <w:link w:val="33"/>
     <w:uiPriority w:val="30"/>
-    <w:rsid w:val="0002196E"/>
     <w:rPr>
       <w:i/>
       <w:iCs/>
-      <w:color w:val="0F4761" w:themeColor="accent1" w:themeShade="BF"/>
+      <w:color w:val="104862" w:themeColor="accent1" w:themeShade="BF"/>
     </w:rPr>
   </w:style>
-  <w:style w:type="character" w:styleId="IntenseReference">
+  <w:style w:type="character" w:customStyle="1" w:styleId="35">
     <w:name w:val="Intense Reference"/>
-    <w:basedOn w:val="DefaultParagraphFont"/>
+    <w:basedOn w:val="11"/>
+    <w:qFormat/>
     <w:uiPriority w:val="32"/>
-    <w:qFormat/>
-    <w:rsid w:val="0002196E"/>
     <w:rPr>
       <w:b/>
       <w:bCs/>
       <w:smallCaps/>
-      <w:color w:val="0F4761" w:themeColor="accent1" w:themeShade="BF"/>
+      <w:color w:val="104862" w:themeColor="accent1" w:themeShade="BF"/>
       <w:spacing w:val="5"/>
     </w:rPr>
   </w:style>
-  <w:style w:type="paragraph" w:styleId="Header">
-    <w:name w:val="header"/>
-    <w:basedOn w:val="Normal"/>
-    <w:link w:val="HeaderChar"/>
+  <w:style w:type="character" w:customStyle="1" w:styleId="36">
+    <w:name w:val="Header Char"/>
+    <w:basedOn w:val="11"/>
+    <w:link w:val="14"/>
+    <w:qFormat/>
     <w:uiPriority w:val="99"/>
-    <w:unhideWhenUsed/>
-    <w:rsid w:val="0002196E"/>
-    <w:pPr>
-      <w:tabs>
-        <w:tab w:val="center" w:pos="4680"/>
-        <w:tab w:val="right" w:pos="9360"/>
-      </w:tabs>
-      <w:spacing w:after="0" w:line="240" w:lineRule="auto"/>
-    </w:pPr>
-  </w:style>
-  <w:style w:type="character" w:customStyle="1" w:styleId="HeaderChar">
-    <w:name w:val="Header Char"/>
-    <w:basedOn w:val="DefaultParagraphFont"/>
-    <w:link w:val="Header"/>
-    <w:uiPriority w:val="99"/>
-    <w:rsid w:val="0002196E"/>
     <w:rPr>
       <w:kern w:val="0"/>
       <w:sz w:val="22"/>
@@ -3808,27 +3218,11 @@
       <w14:ligatures w14:val="none"/>
     </w:rPr>
   </w:style>
-  <w:style w:type="paragraph" w:styleId="Footer">
-    <w:name w:val="footer"/>
-    <w:basedOn w:val="Normal"/>
-    <w:link w:val="FooterChar"/>
+  <w:style w:type="character" w:customStyle="1" w:styleId="37">
+    <w:name w:val="Footer Char"/>
+    <w:basedOn w:val="11"/>
+    <w:link w:val="13"/>
     <w:uiPriority w:val="99"/>
-    <w:unhideWhenUsed/>
-    <w:rsid w:val="0002196E"/>
-    <w:pPr>
-      <w:tabs>
-        <w:tab w:val="center" w:pos="4680"/>
-        <w:tab w:val="right" w:pos="9360"/>
-      </w:tabs>
-      <w:spacing w:after="0" w:line="240" w:lineRule="auto"/>
-    </w:pPr>
-  </w:style>
-  <w:style w:type="character" w:customStyle="1" w:styleId="FooterChar">
-    <w:name w:val="Footer Char"/>
-    <w:basedOn w:val="DefaultParagraphFont"/>
-    <w:link w:val="Footer"/>
-    <w:uiPriority w:val="99"/>
-    <w:rsid w:val="0002196E"/>
     <w:rPr>
       <w:kern w:val="0"/>
       <w:sz w:val="22"/>
@@ -3836,24 +3230,12 @@
       <w14:ligatures w14:val="none"/>
     </w:rPr>
   </w:style>
-  <w:style w:type="character" w:styleId="Hyperlink">
-    <w:name w:val="Hyperlink"/>
-    <w:basedOn w:val="DefaultParagraphFont"/>
-    <w:uiPriority w:val="99"/>
-    <w:unhideWhenUsed/>
-    <w:rsid w:val="00622D05"/>
-    <w:rPr>
-      <w:color w:val="0000FF"/>
-      <w:u w:val="single"/>
-    </w:rPr>
-  </w:style>
-  <w:style w:type="character" w:styleId="UnresolvedMention">
+  <w:style w:type="character" w:customStyle="1" w:styleId="38">
     <w:name w:val="Unresolved Mention"/>
-    <w:basedOn w:val="DefaultParagraphFont"/>
-    <w:uiPriority w:val="99"/>
+    <w:basedOn w:val="11"/>
     <w:semiHidden/>
     <w:unhideWhenUsed/>
-    <w:rsid w:val="00915896"/>
+    <w:uiPriority w:val="99"/>
     <w:rPr>
       <w:color w:val="605E5C"/>
       <w:shd w:val="clear" w:color="auto" w:fill="E1DFDD"/>
@@ -3905,7 +3287,7 @@
     </a:clrScheme>
     <a:fontScheme name="Office">
       <a:majorFont>
-        <a:latin typeface="Aptos Display" panose="02110004020202020204"/>
+        <a:latin typeface="Aptos Display"/>
         <a:ea typeface=""/>
         <a:cs typeface=""/>
         <a:font script="Jpan" typeface="游ゴシック Light"/>
@@ -3938,26 +3320,9 @@
         <a:font script="Viet" typeface="Times New Roman"/>
         <a:font script="Uigh" typeface="Microsoft Uighur"/>
         <a:font script="Geor" typeface="Sylfaen"/>
-        <a:font script="Armn" typeface="Arial"/>
-        <a:font script="Bugi" typeface="Leelawadee UI"/>
-        <a:font script="Bopo" typeface="Microsoft JhengHei"/>
-        <a:font script="Java" typeface="Javanese Text"/>
-        <a:font script="Lisu" typeface="Segoe UI"/>
-        <a:font script="Mymr" typeface="Myanmar Text"/>
-        <a:font script="Nkoo" typeface="Ebrima"/>
-        <a:font script="Olck" typeface="Nirmala UI"/>
-        <a:font script="Osma" typeface="Ebrima"/>
-        <a:font script="Phag" typeface="Phagspa"/>
-        <a:font script="Syrn" typeface="Estrangelo Edessa"/>
-        <a:font script="Syrj" typeface="Estrangelo Edessa"/>
-        <a:font script="Syre" typeface="Estrangelo Edessa"/>
-        <a:font script="Sora" typeface="Nirmala UI"/>
-        <a:font script="Tale" typeface="Microsoft Tai Le"/>
-        <a:font script="Talu" typeface="Microsoft New Tai Lue"/>
-        <a:font script="Tfng" typeface="Ebrima"/>
       </a:majorFont>
       <a:minorFont>
-        <a:latin typeface="Aptos" panose="02110004020202020204"/>
+        <a:latin typeface="Aptos"/>
         <a:ea typeface=""/>
         <a:cs typeface=""/>
         <a:font script="Jpan" typeface="游明朝"/>
@@ -3990,23 +3355,6 @@
         <a:font script="Viet" typeface="Arial"/>
         <a:font script="Uigh" typeface="Microsoft Uighur"/>
         <a:font script="Geor" typeface="Sylfaen"/>
-        <a:font script="Armn" typeface="Arial"/>
-        <a:font script="Bugi" typeface="Leelawadee UI"/>
-        <a:font script="Bopo" typeface="Microsoft JhengHei"/>
-        <a:font script="Java" typeface="Javanese Text"/>
-        <a:font script="Lisu" typeface="Segoe UI"/>
-        <a:font script="Mymr" typeface="Myanmar Text"/>
-        <a:font script="Nkoo" typeface="Ebrima"/>
-        <a:font script="Olck" typeface="Nirmala UI"/>
-        <a:font script="Osma" typeface="Ebrima"/>
-        <a:font script="Phag" typeface="Phagspa"/>
-        <a:font script="Syrn" typeface="Estrangelo Edessa"/>
-        <a:font script="Syrj" typeface="Estrangelo Edessa"/>
-        <a:font script="Syre" typeface="Estrangelo Edessa"/>
-        <a:font script="Sora" typeface="Nirmala UI"/>
-        <a:font script="Tale" typeface="Microsoft Tai Le"/>
-        <a:font script="Talu" typeface="Microsoft New Tai Lue"/>
-        <a:font script="Tfng" typeface="Ebrima"/>
       </a:minorFont>
     </a:fontScheme>
     <a:fmtScheme name="Office">
@@ -4148,11 +3496,22 @@
     </a:fmtScheme>
   </a:themeElements>
   <a:objectDefaults/>
-  <a:extraClrSchemeLst/>
-  <a:extLst>
-    <a:ext uri="{05A4C25C-085E-4340-85A3-A5531E510DB2}">
-      <thm15:themeFamily xmlns:thm15="http://schemas.microsoft.com/office/thememl/2012/main" name="Office Theme" id="{2E142A2C-CD16-42D6-873A-C26D2A0506FA}" vid="{1BDDFF52-6CD6-40A5-AB3C-68EB2F1E4D0A}"/>
-    </a:ext>
-  </a:extLst>
 </a:theme>
+</file>
+
+<file path=customXml/item1.xml><?xml version="1.0" encoding="utf-8"?>
+<s:customData xmlns="http://www.wps.cn/officeDocument/2013/wpsCustomData" xmlns:s="http://www.wps.cn/officeDocument/2013/wpsCustomData">
+  <customSectProps/>
+  <customShpExts>
+    <customShpInfo spid="_x0000_s1026" textRotate="1"/>
+  </customShpExts>
+</s:customData>
+</file>
+
+<file path=customXml/itemProps1.xml><?xml version="1.0" encoding="utf-8"?>
+<ds:datastoreItem xmlns:ds="http://schemas.openxmlformats.org/officeDocument/2006/customXml" ds:itemID="{B1977F7D-205B-4081-913C-38D41E755F92}">
+  <ds:schemaRefs>
+    <ds:schemaRef ds:uri="http://www.wps.cn/officeDocument/2013/wpsCustomData"/>
+  </ds:schemaRefs>
+</ds:datastoreItem>
 </file>
</xml_diff>